<commit_message>
Add section on Branches and Releases
</commit_message>
<xml_diff>
--- a/docs/DevGuide.docx
+++ b/docs/DevGuide.docx
@@ -12,11 +12,7 @@
       </w:pPr>
       <w:r>
         <w:rPr/>
-        <w:t>XTrkCad D</w:t>
-      </w:r>
-      <w:r>
-        <w:rPr/>
-        <w:t>eveloper’s  Guide</w:t>
+        <w:t>XTrkCad Developer’s  Guide</w:t>
       </w:r>
     </w:p>
     <w:p>
@@ -81,7 +77,7 @@
         </w:rPr>
         <w:fldChar w:fldCharType="separate"/>
       </w:r>
-      <w:hyperlink w:anchor="__RefHeading___Toc412_4191666527">
+      <w:hyperlink w:anchor="__RefHeading___Toc777_2817623836">
         <w:r>
           <w:rPr>
             <w:rStyle w:val="IndexLink"/>
@@ -100,6 +96,63 @@
         </w:tabs>
         <w:rPr/>
       </w:pPr>
+      <w:hyperlink w:anchor="__RefHeading___Toc779_2817623836">
+        <w:r>
+          <w:rPr>
+            <w:rStyle w:val="IndexLink"/>
+          </w:rPr>
+          <w:t>Source Control</w:t>
+          <w:tab/>
+          <w:t>4</w:t>
+        </w:r>
+      </w:hyperlink>
+    </w:p>
+    <w:p>
+      <w:pPr>
+        <w:pStyle w:val="Contents2"/>
+        <w:tabs>
+          <w:tab w:val="right" w:pos="9972" w:leader="dot"/>
+        </w:tabs>
+        <w:rPr/>
+      </w:pPr>
+      <w:hyperlink w:anchor="__RefHeading___Toc781_2817623836">
+        <w:r>
+          <w:rPr>
+            <w:rStyle w:val="IndexLink"/>
+          </w:rPr>
+          <w:t>Branches</w:t>
+          <w:tab/>
+          <w:t>4</w:t>
+        </w:r>
+      </w:hyperlink>
+    </w:p>
+    <w:p>
+      <w:pPr>
+        <w:pStyle w:val="Contents2"/>
+        <w:tabs>
+          <w:tab w:val="right" w:pos="9972" w:leader="dot"/>
+        </w:tabs>
+        <w:rPr/>
+      </w:pPr>
+      <w:hyperlink w:anchor="__RefHeading___Toc783_2817623836">
+        <w:r>
+          <w:rPr>
+            <w:rStyle w:val="IndexLink"/>
+          </w:rPr>
+          <w:t>Releases</w:t>
+          <w:tab/>
+          <w:t>4</w:t>
+        </w:r>
+      </w:hyperlink>
+    </w:p>
+    <w:p>
+      <w:pPr>
+        <w:pStyle w:val="Contents1"/>
+        <w:tabs>
+          <w:tab w:val="right" w:pos="9972" w:leader="dot"/>
+        </w:tabs>
+        <w:rPr/>
+      </w:pPr>
       <w:hyperlink w:anchor="__RefHeading___Toc350_3696126145">
         <w:r>
           <w:rPr>
@@ -107,7 +160,7 @@
           </w:rPr>
           <w:t>Text Files</w:t>
           <w:tab/>
-          <w:t>4</w:t>
+          <w:t>5</w:t>
         </w:r>
       </w:hyperlink>
     </w:p>
@@ -126,7 +179,7 @@
           </w:rPr>
           <w:t>Parameter File Maintenance</w:t>
           <w:tab/>
-          <w:t>5</w:t>
+          <w:t>6</w:t>
         </w:r>
       </w:hyperlink>
     </w:p>
@@ -145,7 +198,7 @@
           </w:rPr>
           <w:t>Independence of Parameters in Layout files</w:t>
           <w:tab/>
-          <w:t>5</w:t>
+          <w:t>6</w:t>
         </w:r>
       </w:hyperlink>
     </w:p>
@@ -164,7 +217,7 @@
           </w:rPr>
           <w:t>CONTENTS Label</w:t>
           <w:tab/>
-          <w:t>5</w:t>
+          <w:t>6</w:t>
         </w:r>
       </w:hyperlink>
     </w:p>
@@ -183,7 +236,7 @@
           </w:rPr>
           <w:t>Adding / Deleting Parameter files</w:t>
           <w:tab/>
-          <w:t>5</w:t>
+          <w:t>6</w:t>
         </w:r>
       </w:hyperlink>
     </w:p>
@@ -202,7 +255,7 @@
           </w:rPr>
           <w:t>Changing CONTENTS Label and/or FileName</w:t>
           <w:tab/>
-          <w:t>5</w:t>
+          <w:t>6</w:t>
         </w:r>
       </w:hyperlink>
     </w:p>
@@ -221,7 +274,7 @@
           </w:rPr>
           <w:t>Source Layout</w:t>
           <w:tab/>
-          <w:t>7</w:t>
+          <w:t>8</w:t>
         </w:r>
       </w:hyperlink>
     </w:p>
@@ -240,7 +293,7 @@
           </w:rPr>
           <w:t>WLib Interaction</w:t>
           <w:tab/>
-          <w:t>8</w:t>
+          <w:t>9</w:t>
         </w:r>
       </w:hyperlink>
     </w:p>
@@ -259,7 +312,7 @@
           </w:rPr>
           <w:t>Pretty Printing</w:t>
           <w:tab/>
-          <w:t>9</w:t>
+          <w:t>10</w:t>
         </w:r>
       </w:hyperlink>
     </w:p>
@@ -278,7 +331,7 @@
           </w:rPr>
           <w:t>Casts</w:t>
           <w:tab/>
-          <w:t>10</w:t>
+          <w:t>11</w:t>
         </w:r>
       </w:hyperlink>
     </w:p>
@@ -297,7 +350,7 @@
           </w:rPr>
           <w:t>Downcast Numeric values</w:t>
           <w:tab/>
-          <w:t>10</w:t>
+          <w:t>11</w:t>
         </w:r>
       </w:hyperlink>
     </w:p>
@@ -316,7 +369,7 @@
           </w:rPr>
           <w:t>Generic Values</w:t>
           <w:tab/>
-          <w:t>10</w:t>
+          <w:t>11</w:t>
         </w:r>
       </w:hyperlink>
     </w:p>
@@ -335,7 +388,7 @@
           </w:rPr>
           <w:t>Wlib wControl_t conversion</w:t>
           <w:tab/>
-          <w:t>10</w:t>
+          <w:t>11</w:t>
         </w:r>
       </w:hyperlink>
     </w:p>
@@ -354,7 +407,7 @@
           </w:rPr>
           <w:t>GetTrkExtraData</w:t>
           <w:tab/>
-          <w:t>10</w:t>
+          <w:t>11</w:t>
         </w:r>
       </w:hyperlink>
     </w:p>
@@ -373,7 +426,7 @@
           </w:rPr>
           <w:t>Error Handling</w:t>
           <w:tab/>
-          <w:t>11</w:t>
+          <w:t>12</w:t>
         </w:r>
       </w:hyperlink>
     </w:p>
@@ -392,7 +445,7 @@
           </w:rPr>
           <w:t>User Input Errors</w:t>
           <w:tab/>
-          <w:t>11</w:t>
+          <w:t>12</w:t>
         </w:r>
       </w:hyperlink>
     </w:p>
@@ -411,7 +464,7 @@
           </w:rPr>
           <w:t>File Input Errors</w:t>
           <w:tab/>
-          <w:t>11</w:t>
+          <w:t>12</w:t>
         </w:r>
       </w:hyperlink>
     </w:p>
@@ -430,7 +483,7 @@
           </w:rPr>
           <w:t>Logic errors</w:t>
           <w:tab/>
-          <w:t>11</w:t>
+          <w:t>12</w:t>
         </w:r>
       </w:hyperlink>
     </w:p>
@@ -449,7 +502,7 @@
           </w:rPr>
           <w:t>System/Evironmental errors</w:t>
           <w:tab/>
-          <w:t>12</w:t>
+          <w:t>13</w:t>
         </w:r>
       </w:hyperlink>
     </w:p>
@@ -468,7 +521,7 @@
           </w:rPr>
           <w:t>Undo Processing</w:t>
           <w:tab/>
-          <w:t>13</w:t>
+          <w:t>14</w:t>
         </w:r>
       </w:hyperlink>
     </w:p>
@@ -487,7 +540,7 @@
           </w:rPr>
           <w:t>Draw Model</w:t>
           <w:tab/>
-          <w:t>14</w:t>
+          <w:t>15</w:t>
         </w:r>
       </w:hyperlink>
     </w:p>
@@ -506,7 +559,7 @@
           </w:rPr>
           <w:t>Headers</w:t>
           <w:tab/>
-          <w:t>15</w:t>
+          <w:t>16</w:t>
         </w:r>
       </w:hyperlink>
     </w:p>
@@ -525,7 +578,7 @@
           </w:rPr>
           <w:t>#ifdef WINDOWS</w:t>
           <w:tab/>
-          <w:t>16</w:t>
+          <w:t>17</w:t>
         </w:r>
       </w:hyperlink>
     </w:p>
@@ -544,12 +597,102 @@
           </w:rPr>
           <w:t>VERSION handling</w:t>
           <w:tab/>
-          <w:t>17</w:t>
+          <w:t>18</w:t>
         </w:r>
       </w:hyperlink>
     </w:p>
     <w:p>
       <w:pPr>
+        <w:pStyle w:val="TextBody"/>
+        <w:rPr>
+          <w:rFonts w:ascii="Liberation Sans" w:hAnsi="Liberation Sans"/>
+        </w:rPr>
+      </w:pPr>
+      <w:r>
+        <w:rPr/>
+      </w:r>
+      <w:r>
+        <w:rPr/>
+        <w:fldChar w:fldCharType="end"/>
+      </w:r>
+      <w:r>
+        <w:br w:type="page"/>
+      </w:r>
+    </w:p>
+    <w:p>
+      <w:pPr>
+        <w:pStyle w:val="Heading1"/>
+        <w:numPr>
+          <w:ilvl w:val="0"/>
+          <w:numId w:val="1"/>
+        </w:numPr>
+        <w:rPr/>
+      </w:pPr>
+      <w:bookmarkStart w:id="0" w:name="__RefHeading___Toc777_2817623836"/>
+      <w:bookmarkEnd w:id="0"/>
+      <w:r>
+        <w:rPr/>
+        <w:t>Introduction</w:t>
+      </w:r>
+    </w:p>
+    <w:p>
+      <w:pPr>
+        <w:pStyle w:val="TextBody"/>
+        <w:rPr>
+          <w:rFonts w:ascii="Liberation Sans" w:hAnsi="Liberation Sans"/>
+        </w:rPr>
+      </w:pPr>
+      <w:r>
+        <w:rPr>
+          <w:rFonts w:ascii="Liberation Sans" w:hAnsi="Liberation Sans"/>
+        </w:rPr>
+        <w:t>XTrkCad is a large program and like most large program, it has developed an infrastructure of how things are done and a base level of functionality.  Some are general to any program (Error Handling, Source Formatting) and some particular to XtrkCad (Undo Processing, Parameter Files).</w:t>
+      </w:r>
+    </w:p>
+    <w:p>
+      <w:pPr>
+        <w:pStyle w:val="TextBody"/>
+        <w:rPr>
+          <w:rFonts w:ascii="Liberation Sans" w:hAnsi="Liberation Sans"/>
+        </w:rPr>
+      </w:pPr>
+      <w:r>
+        <w:rPr>
+          <w:rFonts w:ascii="Liberation Sans" w:hAnsi="Liberation Sans"/>
+        </w:rPr>
+        <w:t>This document describes a fairly random set of features.  It is expected to evolve as needs be.</w:t>
+      </w:r>
+    </w:p>
+    <w:p>
+      <w:pPr>
+        <w:pStyle w:val="TextBody"/>
+        <w:rPr>
+          <w:rFonts w:ascii="Liberation Sans" w:hAnsi="Liberation Sans"/>
+        </w:rPr>
+      </w:pPr>
+      <w:r>
+        <w:rPr>
+          <w:rFonts w:ascii="Liberation Sans" w:hAnsi="Liberation Sans"/>
+        </w:rPr>
+        <w:t>If you figure out some interesting, tricky or obscure things, please add them to this document.</w:t>
+      </w:r>
+    </w:p>
+    <w:p>
+      <w:pPr>
+        <w:pStyle w:val="TextBody"/>
+        <w:rPr>
+          <w:rFonts w:ascii="Liberation Sans" w:hAnsi="Liberation Sans"/>
+        </w:rPr>
+      </w:pPr>
+      <w:r>
+        <w:rPr>
+          <w:rFonts w:ascii="Liberation Sans" w:hAnsi="Liberation Sans"/>
+        </w:rPr>
+        <w:t>You’ll see a number of place holders (pages with just a header).  These will be addressed n future.</w:t>
+      </w:r>
+    </w:p>
+    <w:p>
+      <w:pPr>
         <w:pStyle w:val="Heading1"/>
         <w:numPr>
           <w:ilvl w:val="0"/>
@@ -560,71 +703,11 @@
         <w:jc w:val="left"/>
         <w:rPr/>
       </w:pPr>
-      <w:bookmarkStart w:id="0" w:name="__RefHeading___Toc412_4191666527"/>
-      <w:bookmarkEnd w:id="0"/>
-      <w:r>
-        <w:rPr/>
-        <w:t>Introduction</w:t>
-      </w:r>
-      <w:r>
-        <w:rPr/>
-        <w:fldChar w:fldCharType="end"/>
-      </w:r>
-    </w:p>
-    <w:p>
-      <w:pPr>
-        <w:pStyle w:val="TextBody"/>
-        <w:rPr>
-          <w:rFonts w:ascii="Liberation Sans" w:hAnsi="Liberation Sans"/>
-        </w:rPr>
-      </w:pPr>
-      <w:r>
-        <w:rPr>
-          <w:rFonts w:ascii="Liberation Sans" w:hAnsi="Liberation Sans"/>
-        </w:rPr>
-        <w:t>XTrkCad is a large program and like most large program, it has developed an infrastructure of how things are done and a base level of functionality.  Some are general to any program (Error Handling, Source Formatting) and some particular to XtrkCad (Undo Processing, Parameter Files).</w:t>
-      </w:r>
-    </w:p>
-    <w:p>
-      <w:pPr>
-        <w:pStyle w:val="TextBody"/>
-        <w:rPr>
-          <w:rFonts w:ascii="Liberation Sans" w:hAnsi="Liberation Sans"/>
-        </w:rPr>
-      </w:pPr>
-      <w:r>
-        <w:rPr>
-          <w:rFonts w:ascii="Liberation Sans" w:hAnsi="Liberation Sans"/>
-        </w:rPr>
-        <w:t>This document describes a fairly random set of features.  It is expected to evolve as needs be.</w:t>
-      </w:r>
-    </w:p>
-    <w:p>
-      <w:pPr>
-        <w:pStyle w:val="TextBody"/>
-        <w:rPr>
-          <w:rFonts w:ascii="Liberation Sans" w:hAnsi="Liberation Sans"/>
-        </w:rPr>
-      </w:pPr>
-      <w:r>
-        <w:rPr>
-          <w:rFonts w:ascii="Liberation Sans" w:hAnsi="Liberation Sans"/>
-        </w:rPr>
-        <w:t>If you figure out some interesting, tricky or obscure things, please add them to this document.</w:t>
-      </w:r>
-    </w:p>
-    <w:p>
-      <w:pPr>
-        <w:pStyle w:val="TextBody"/>
-        <w:rPr>
-          <w:rFonts w:ascii="Liberation Sans" w:hAnsi="Liberation Sans"/>
-        </w:rPr>
-      </w:pPr>
-      <w:r>
-        <w:rPr>
-          <w:rFonts w:ascii="Liberation Sans" w:hAnsi="Liberation Sans"/>
-        </w:rPr>
-        <w:t>You’ll see a number of place holders (pages with just a header).  These will be addressed n future.</w:t>
+      <w:r>
+        <w:rPr/>
+      </w:r>
+      <w:r>
+        <w:br w:type="page"/>
       </w:r>
     </w:p>
     <w:p>
@@ -639,8 +722,531 @@
         <w:jc w:val="left"/>
         <w:rPr/>
       </w:pPr>
-      <w:r>
-        <w:rPr/>
+      <w:bookmarkStart w:id="1" w:name="__RefHeading___Toc779_2817623836"/>
+      <w:bookmarkEnd w:id="1"/>
+      <w:r>
+        <w:rPr/>
+        <w:t>Source Control</w:t>
+      </w:r>
+    </w:p>
+    <w:p>
+      <w:pPr>
+        <w:pStyle w:val="Normal"/>
+        <w:rPr>
+          <w:rFonts w:ascii="Liberation Sans" w:hAnsi="Liberation Sans"/>
+        </w:rPr>
+      </w:pPr>
+      <w:r>
+        <w:rPr>
+          <w:rFonts w:ascii="Liberation Sans" w:hAnsi="Liberation Sans"/>
+        </w:rPr>
+        <w:t>X</w:t>
+      </w:r>
+      <w:r>
+        <w:rPr>
+          <w:rFonts w:ascii="Liberation Sans" w:hAnsi="Liberation Sans"/>
+        </w:rPr>
+        <w:t>T</w:t>
+      </w:r>
+      <w:r>
+        <w:rPr>
+          <w:rFonts w:ascii="Liberation Sans" w:hAnsi="Liberation Sans"/>
+        </w:rPr>
+        <w:t>rkCad source code is managed using Mercurial on SourceForge.  See the Fetch/Build wikka page (</w:t>
+      </w:r>
+      <w:hyperlink r:id="rId2">
+        <w:r>
+          <w:rPr>
+            <w:rStyle w:val="InternetLink"/>
+            <w:rFonts w:ascii="Liberation Sans" w:hAnsi="Liberation Sans"/>
+          </w:rPr>
+          <w:t>https://xtrkcad-fork.sourceforge.net/Wikka/BuildNotes</w:t>
+        </w:r>
+      </w:hyperlink>
+      <w:r>
+        <w:rPr>
+          <w:rFonts w:ascii="Liberation Sans" w:hAnsi="Liberation Sans"/>
+        </w:rPr>
+        <w:t>).</w:t>
+      </w:r>
+    </w:p>
+    <w:p>
+      <w:pPr>
+        <w:pStyle w:val="Heading2"/>
+        <w:numPr>
+          <w:ilvl w:val="1"/>
+          <w:numId w:val="1"/>
+        </w:numPr>
+        <w:rPr/>
+      </w:pPr>
+      <w:bookmarkStart w:id="2" w:name="__RefHeading___Toc781_2817623836"/>
+      <w:bookmarkEnd w:id="2"/>
+      <w:r>
+        <w:rPr/>
+        <w:t>Branches</w:t>
+      </w:r>
+    </w:p>
+    <w:p>
+      <w:pPr>
+        <w:pStyle w:val="Normal"/>
+        <w:rPr>
+          <w:rFonts w:ascii="Liberation Sans" w:hAnsi="Liberation Sans"/>
+        </w:rPr>
+      </w:pPr>
+      <w:r>
+        <w:rPr>
+          <w:rFonts w:ascii="Liberation Sans" w:hAnsi="Liberation Sans"/>
+        </w:rPr>
+        <w:t>Normal development is handled in the ‘default’ branch.</w:t>
+      </w:r>
+    </w:p>
+    <w:p>
+      <w:pPr>
+        <w:pStyle w:val="Normal"/>
+        <w:rPr>
+          <w:rFonts w:ascii="Liberation Sans" w:hAnsi="Liberation Sans"/>
+        </w:rPr>
+      </w:pPr>
+      <w:r>
+        <w:rPr>
+          <w:rFonts w:ascii="Liberation Sans" w:hAnsi="Liberation Sans"/>
+        </w:rPr>
+      </w:r>
+    </w:p>
+    <w:p>
+      <w:pPr>
+        <w:pStyle w:val="Normal"/>
+        <w:rPr>
+          <w:rFonts w:ascii="Liberation Sans" w:hAnsi="Liberation Sans"/>
+        </w:rPr>
+      </w:pPr>
+      <w:r>
+        <w:rPr>
+          <w:rFonts w:ascii="Liberation Sans" w:hAnsi="Liberation Sans"/>
+        </w:rPr>
+        <w:t xml:space="preserve">It is recommended that any non-trivial work occur in a sub-branch from ‘default’.   Once the new work is complete and stable, the sub-branch is merged back into ‘default’.  </w:t>
+      </w:r>
+      <w:r>
+        <w:rPr>
+          <w:rFonts w:ascii="Liberation Sans" w:hAnsi="Liberation Sans"/>
+        </w:rPr>
+        <w:t>Merging from the ‘default’ branch should be done frequencely to keep the new code in sync, especially just before merging back to ‘default’</w:t>
+      </w:r>
+    </w:p>
+    <w:p>
+      <w:pPr>
+        <w:pStyle w:val="Normal"/>
+        <w:rPr>
+          <w:rFonts w:ascii="Liberation Sans" w:hAnsi="Liberation Sans"/>
+        </w:rPr>
+      </w:pPr>
+      <w:r>
+        <w:rPr>
+          <w:rFonts w:ascii="Liberation Sans" w:hAnsi="Liberation Sans"/>
+        </w:rPr>
+      </w:r>
+    </w:p>
+    <w:p>
+      <w:pPr>
+        <w:pStyle w:val="Heading2"/>
+        <w:numPr>
+          <w:ilvl w:val="1"/>
+          <w:numId w:val="1"/>
+        </w:numPr>
+        <w:rPr/>
+      </w:pPr>
+      <w:bookmarkStart w:id="3" w:name="__RefHeading___Toc783_2817623836"/>
+      <w:bookmarkEnd w:id="3"/>
+      <w:r>
+        <w:rPr/>
+        <w:t>Releases</w:t>
+      </w:r>
+    </w:p>
+    <w:p>
+      <w:pPr>
+        <w:pStyle w:val="Normal"/>
+        <w:rPr>
+          <w:rFonts w:ascii="Liberation Sans" w:hAnsi="Liberation Sans"/>
+        </w:rPr>
+      </w:pPr>
+      <w:r>
+        <w:rPr>
+          <w:rFonts w:ascii="Liberation Sans" w:hAnsi="Liberation Sans"/>
+        </w:rPr>
+        <w:t>Releasing a new version of XtrkCad, once the code is stable, feature complete and free of serious bugs:</w:t>
+      </w:r>
+    </w:p>
+    <w:p>
+      <w:pPr>
+        <w:pStyle w:val="Normal"/>
+        <w:numPr>
+          <w:ilvl w:val="0"/>
+          <w:numId w:val="4"/>
+        </w:numPr>
+        <w:rPr>
+          <w:rFonts w:ascii="Liberation Sans" w:hAnsi="Liberation Sans"/>
+        </w:rPr>
+      </w:pPr>
+      <w:r>
+        <w:rPr>
+          <w:rFonts w:ascii="Liberation Sans" w:hAnsi="Liberation Sans"/>
+        </w:rPr>
+        <w:t>Update ProgramVersion.cmake with the new version number. XTRKCAD_VERSION_MODIFIER will be “Beta1”</w:t>
+      </w:r>
+    </w:p>
+    <w:p>
+      <w:pPr>
+        <w:pStyle w:val="Normal"/>
+        <w:numPr>
+          <w:ilvl w:val="0"/>
+          <w:numId w:val="4"/>
+        </w:numPr>
+        <w:rPr>
+          <w:rFonts w:ascii="Liberation Sans" w:hAnsi="Liberation Sans"/>
+        </w:rPr>
+      </w:pPr>
+      <w:r>
+        <w:rPr>
+          <w:rFonts w:ascii="Liberation Sans" w:hAnsi="Liberation Sans"/>
+        </w:rPr>
+        <w:t xml:space="preserve">Other stuff - </w:t>
+      </w:r>
+      <w:r>
+        <w:rPr>
+          <w:rFonts w:ascii="Liberation Sans" w:hAnsi="Liberation Sans"/>
+        </w:rPr>
+        <w:t>TBD</w:t>
+      </w:r>
+    </w:p>
+    <w:p>
+      <w:pPr>
+        <w:pStyle w:val="Normal"/>
+        <w:numPr>
+          <w:ilvl w:val="0"/>
+          <w:numId w:val="4"/>
+        </w:numPr>
+        <w:rPr>
+          <w:rFonts w:ascii="Liberation Sans" w:hAnsi="Liberation Sans"/>
+        </w:rPr>
+      </w:pPr>
+      <w:r>
+        <w:rPr>
+          <w:rFonts w:ascii="Liberation Sans" w:hAnsi="Liberation Sans"/>
+        </w:rPr>
+        <w:t>All release changes are made in a new branch (vX.Y.Z) which is branched from ‘default’</w:t>
+      </w:r>
+    </w:p>
+    <w:p>
+      <w:pPr>
+        <w:pStyle w:val="Normal"/>
+        <w:numPr>
+          <w:ilvl w:val="0"/>
+          <w:numId w:val="4"/>
+        </w:numPr>
+        <w:rPr/>
+      </w:pPr>
+      <w:r>
+        <w:rPr>
+          <w:rFonts w:ascii="Liberation Sans" w:hAnsi="Liberation Sans"/>
+        </w:rPr>
+        <w:t xml:space="preserve">All platforms build and upload their </w:t>
+      </w:r>
+      <w:r>
+        <w:rPr>
+          <w:rFonts w:ascii="Liberation Sans" w:hAnsi="Liberation Sans"/>
+        </w:rPr>
+        <w:t xml:space="preserve">beta </w:t>
+      </w:r>
+      <w:r>
+        <w:rPr>
+          <w:rFonts w:ascii="Liberation Sans" w:hAnsi="Liberation Sans"/>
+        </w:rPr>
+        <w:t xml:space="preserve">install packages as described in </w:t>
+      </w:r>
+      <w:hyperlink r:id="rId3">
+        <w:r>
+          <w:rPr>
+            <w:rStyle w:val="InternetLink"/>
+            <w:rFonts w:ascii="Liberation Sans" w:hAnsi="Liberation Sans"/>
+          </w:rPr>
+          <w:t>https://xtrkcad-fork.sourceforge.net/Wikka/BuildNotes</w:t>
+        </w:r>
+      </w:hyperlink>
+    </w:p>
+    <w:p>
+      <w:pPr>
+        <w:pStyle w:val="Normal"/>
+        <w:rPr>
+          <w:rFonts w:ascii="Liberation Sans" w:hAnsi="Liberation Sans"/>
+        </w:rPr>
+      </w:pPr>
+      <w:r>
+        <w:rPr>
+          <w:rFonts w:ascii="Liberation Sans" w:hAnsi="Liberation Sans"/>
+        </w:rPr>
+      </w:r>
+    </w:p>
+    <w:p>
+      <w:pPr>
+        <w:pStyle w:val="Normal"/>
+        <w:rPr>
+          <w:rFonts w:ascii="Liberation Sans" w:hAnsi="Liberation Sans"/>
+        </w:rPr>
+      </w:pPr>
+      <w:r>
+        <w:rPr>
+          <w:rFonts w:ascii="Liberation Sans" w:hAnsi="Liberation Sans"/>
+        </w:rPr>
+        <w:t xml:space="preserve">This process is repeated for subsequent Betas, until </w:t>
+      </w:r>
+      <w:r>
+        <w:rPr>
+          <w:rFonts w:ascii="Liberation Sans" w:hAnsi="Liberation Sans"/>
+        </w:rPr>
+        <w:t xml:space="preserve">all issues are resolved or defered.  XTRKCAD_VERSION_MODIFIER is incremented: Beta2, Beta3, ... </w:t>
+      </w:r>
+    </w:p>
+    <w:p>
+      <w:pPr>
+        <w:pStyle w:val="Normal"/>
+        <w:rPr>
+          <w:rFonts w:ascii="Liberation Sans" w:hAnsi="Liberation Sans"/>
+        </w:rPr>
+      </w:pPr>
+      <w:r>
+        <w:rPr>
+          <w:rFonts w:ascii="Liberation Sans" w:hAnsi="Liberation Sans"/>
+        </w:rPr>
+      </w:r>
+    </w:p>
+    <w:p>
+      <w:pPr>
+        <w:pStyle w:val="Normal"/>
+        <w:rPr>
+          <w:rFonts w:ascii="Liberation Sans" w:hAnsi="Liberation Sans"/>
+        </w:rPr>
+      </w:pPr>
+      <w:r>
+        <w:rPr>
+          <w:rFonts w:ascii="Liberation Sans" w:hAnsi="Liberation Sans"/>
+        </w:rPr>
+        <w:t xml:space="preserve">For General Availability, </w:t>
+      </w:r>
+      <w:r>
+        <w:rPr>
+          <w:rFonts w:ascii="Liberation Sans" w:hAnsi="Liberation Sans"/>
+        </w:rPr>
+        <w:t>XTRKCAD_VERSION_MODIFIER will be “</w:t>
+      </w:r>
+      <w:r>
+        <w:rPr>
+          <w:rFonts w:ascii="Liberation Sans" w:hAnsi="Liberation Sans"/>
+        </w:rPr>
+        <w:t>GA” and GA install packages are built and uploaded.</w:t>
+      </w:r>
+    </w:p>
+    <w:p>
+      <w:pPr>
+        <w:pStyle w:val="Normal"/>
+        <w:rPr>
+          <w:rFonts w:ascii="Liberation Sans" w:hAnsi="Liberation Sans"/>
+        </w:rPr>
+      </w:pPr>
+      <w:r>
+        <w:rPr>
+          <w:rFonts w:ascii="Liberation Sans" w:hAnsi="Liberation Sans"/>
+        </w:rPr>
+      </w:r>
+    </w:p>
+    <w:p>
+      <w:pPr>
+        <w:pStyle w:val="Normal"/>
+        <w:rPr>
+          <w:rFonts w:ascii="Liberation Sans" w:hAnsi="Liberation Sans"/>
+        </w:rPr>
+      </w:pPr>
+      <w:r>
+        <w:rPr>
+          <w:rFonts w:ascii="Liberation Sans" w:hAnsi="Liberation Sans"/>
+        </w:rPr>
+        <w:t xml:space="preserve">Critical bugs discovered after GA are fixed in Hot Site releases with </w:t>
+      </w:r>
+      <w:r>
+        <w:rPr>
+          <w:rFonts w:ascii="Liberation Sans" w:hAnsi="Liberation Sans"/>
+        </w:rPr>
+        <w:t xml:space="preserve">XTRKCAD_VERSION_MODIFIER </w:t>
+      </w:r>
+      <w:r>
+        <w:rPr>
+          <w:rFonts w:ascii="Liberation Sans" w:hAnsi="Liberation Sans"/>
+        </w:rPr>
+        <w:t>set to “HS1”, “HS2”,...</w:t>
+      </w:r>
+    </w:p>
+    <w:p>
+      <w:pPr>
+        <w:pStyle w:val="Normal"/>
+        <w:rPr>
+          <w:rFonts w:ascii="Liberation Sans" w:hAnsi="Liberation Sans"/>
+        </w:rPr>
+      </w:pPr>
+      <w:r>
+        <w:rPr>
+          <w:rFonts w:ascii="Liberation Sans" w:hAnsi="Liberation Sans"/>
+        </w:rPr>
+      </w:r>
+    </w:p>
+    <w:p>
+      <w:pPr>
+        <w:pStyle w:val="Normal"/>
+        <w:rPr>
+          <w:rFonts w:ascii="Liberation Sans" w:hAnsi="Liberation Sans"/>
+        </w:rPr>
+      </w:pPr>
+      <w:r>
+        <w:rPr>
+          <w:rFonts w:ascii="Liberation Sans" w:hAnsi="Liberation Sans"/>
+        </w:rPr>
+        <w:t>The same branch is used fo all builds.  A tag is created for each build: vX.Y.Z-B1..., vX.Y.Z-GA, vX.Y.Z-HS1...</w:t>
+      </w:r>
+    </w:p>
+    <w:p>
+      <w:pPr>
+        <w:pStyle w:val="Normal"/>
+        <w:rPr>
+          <w:rFonts w:ascii="Liberation Sans" w:hAnsi="Liberation Sans"/>
+        </w:rPr>
+      </w:pPr>
+      <w:r>
+        <w:rPr>
+          <w:rFonts w:ascii="Liberation Sans" w:hAnsi="Liberation Sans"/>
+        </w:rPr>
+      </w:r>
+    </w:p>
+    <w:p>
+      <w:pPr>
+        <w:pStyle w:val="Normal"/>
+        <w:rPr>
+          <w:rFonts w:ascii="Liberation Sans" w:hAnsi="Liberation Sans"/>
+        </w:rPr>
+      </w:pPr>
+      <w:r>
+        <w:rPr>
+          <w:rFonts w:ascii="Liberation Sans" w:hAnsi="Liberation Sans"/>
+        </w:rPr>
+        <w:t xml:space="preserve">There should be minimal changes in the Beta </w:t>
+      </w:r>
+      <w:r>
+        <w:rPr>
+          <w:rFonts w:ascii="Liberation Sans" w:hAnsi="Liberation Sans"/>
+        </w:rPr>
+        <w:t>or Hot Site releases.</w:t>
+      </w:r>
+    </w:p>
+    <w:p>
+      <w:pPr>
+        <w:pStyle w:val="Normal"/>
+        <w:rPr>
+          <w:rFonts w:ascii="Liberation Sans" w:hAnsi="Liberation Sans"/>
+        </w:rPr>
+      </w:pPr>
+      <w:r>
+        <w:rPr>
+          <w:rFonts w:ascii="Liberation Sans" w:hAnsi="Liberation Sans"/>
+        </w:rPr>
+        <w:t>There should be no changes between the last Beta and the GA release.</w:t>
+      </w:r>
+    </w:p>
+    <w:p>
+      <w:pPr>
+        <w:pStyle w:val="Normal"/>
+        <w:rPr>
+          <w:rFonts w:ascii="Liberation Sans" w:hAnsi="Liberation Sans"/>
+        </w:rPr>
+      </w:pPr>
+      <w:r>
+        <w:rPr>
+          <w:rFonts w:ascii="Liberation Sans" w:hAnsi="Liberation Sans"/>
+        </w:rPr>
+        <w:t>These releases are for bug fixes, not new features.</w:t>
+      </w:r>
+    </w:p>
+    <w:p>
+      <w:pPr>
+        <w:pStyle w:val="Normal"/>
+        <w:rPr>
+          <w:rFonts w:ascii="Liberation Sans" w:hAnsi="Liberation Sans"/>
+        </w:rPr>
+      </w:pPr>
+      <w:r>
+        <w:rPr>
+          <w:rFonts w:ascii="Liberation Sans" w:hAnsi="Liberation Sans"/>
+        </w:rPr>
+        <w:t xml:space="preserve"> </w:t>
+      </w:r>
+    </w:p>
+    <w:p>
+      <w:pPr>
+        <w:pStyle w:val="Normal"/>
+        <w:rPr>
+          <w:rFonts w:ascii="Liberation Sans" w:hAnsi="Liberation Sans"/>
+        </w:rPr>
+      </w:pPr>
+      <w:r>
+        <w:rPr>
+          <w:rFonts w:ascii="Liberation Sans" w:hAnsi="Liberation Sans"/>
+        </w:rPr>
+        <w:t>Fixes in Beta and Hot Site releases are duplicated in t</w:t>
+      </w:r>
+      <w:r>
+        <w:rPr>
+          <w:rFonts w:ascii="Liberation Sans" w:hAnsi="Liberation Sans"/>
+        </w:rPr>
+        <w:t>h</w:t>
+      </w:r>
+      <w:r>
+        <w:rPr>
+          <w:rFonts w:ascii="Liberation Sans" w:hAnsi="Liberation Sans"/>
+        </w:rPr>
+        <w:t>e ‘default’ branch.  Which branch is fixed first is left to the developer.</w:t>
+      </w:r>
+    </w:p>
+    <w:p>
+      <w:pPr>
+        <w:pStyle w:val="Normal"/>
+        <w:rPr>
+          <w:rFonts w:ascii="Liberation Sans" w:hAnsi="Liberation Sans"/>
+        </w:rPr>
+      </w:pPr>
+      <w:r>
+        <w:rPr>
+          <w:rFonts w:ascii="Liberation Sans" w:hAnsi="Liberation Sans"/>
+        </w:rPr>
+      </w:r>
+    </w:p>
+    <w:p>
+      <w:pPr>
+        <w:pStyle w:val="Normal"/>
+        <w:rPr/>
+      </w:pPr>
+      <w:r>
+        <w:rPr>
+          <w:rFonts w:ascii="Liberation Sans" w:hAnsi="Liberation Sans"/>
+        </w:rPr>
+        <w:t xml:space="preserve">We only support </w:t>
+      </w:r>
+      <w:r>
+        <w:rPr>
+          <w:rFonts w:ascii="Liberation Sans" w:hAnsi="Liberation Sans"/>
+        </w:rPr>
+        <w:t>the last</w:t>
+      </w:r>
+      <w:r>
+        <w:rPr>
+          <w:rFonts w:ascii="Liberation Sans" w:hAnsi="Liberation Sans"/>
+        </w:rPr>
+        <w:t xml:space="preserve"> released version.</w:t>
       </w:r>
       <w:r>
         <w:br w:type="page"/>
@@ -658,8 +1264,8 @@
         <w:jc w:val="left"/>
         <w:rPr/>
       </w:pPr>
-      <w:bookmarkStart w:id="1" w:name="__RefHeading___Toc350_3696126145"/>
-      <w:bookmarkEnd w:id="1"/>
+      <w:bookmarkStart w:id="4" w:name="__RefHeading___Toc350_3696126145"/>
+      <w:bookmarkEnd w:id="4"/>
       <w:r>
         <w:rPr/>
         <w:t>Text Files</w:t>
@@ -708,8 +1314,8 @@
         <w:jc w:val="left"/>
         <w:rPr/>
       </w:pPr>
-      <w:bookmarkStart w:id="2" w:name="__RefHeading___Toc171_3696126145"/>
-      <w:bookmarkEnd w:id="2"/>
+      <w:bookmarkStart w:id="5" w:name="__RefHeading___Toc171_3696126145"/>
+      <w:bookmarkEnd w:id="5"/>
       <w:r>
         <w:rPr/>
         <w:t>Parameter File Maintenance</w:t>
@@ -724,8 +1330,8 @@
         </w:numPr>
         <w:rPr/>
       </w:pPr>
-      <w:bookmarkStart w:id="3" w:name="__RefHeading___Toc342_3696126145"/>
-      <w:bookmarkEnd w:id="3"/>
+      <w:bookmarkStart w:id="6" w:name="__RefHeading___Toc342_3696126145"/>
+      <w:bookmarkEnd w:id="6"/>
       <w:r>
         <w:rPr/>
         <w:t>Independence of Parameters in Layout files</w:t>
@@ -813,8 +1419,8 @@
         </w:numPr>
         <w:rPr/>
       </w:pPr>
-      <w:bookmarkStart w:id="4" w:name="__RefHeading___Toc173_3696126145"/>
-      <w:bookmarkEnd w:id="4"/>
+      <w:bookmarkStart w:id="7" w:name="__RefHeading___Toc173_3696126145"/>
+      <w:bookmarkEnd w:id="7"/>
       <w:r>
         <w:rPr/>
         <w:t>CONTENTS Label</w:t>
@@ -984,8 +1590,8 @@
         </w:numPr>
         <w:rPr/>
       </w:pPr>
-      <w:bookmarkStart w:id="5" w:name="__RefHeading___Toc344_3696126145"/>
-      <w:bookmarkEnd w:id="5"/>
+      <w:bookmarkStart w:id="8" w:name="__RefHeading___Toc344_3696126145"/>
+      <w:bookmarkEnd w:id="8"/>
       <w:r>
         <w:rPr/>
         <w:t>Adding / Deleting Parameter files</w:t>
@@ -1043,8 +1649,8 @@
         </w:numPr>
         <w:rPr/>
       </w:pPr>
-      <w:bookmarkStart w:id="6" w:name="__RefHeading___Toc346_3696126145"/>
-      <w:bookmarkEnd w:id="6"/>
+      <w:bookmarkStart w:id="9" w:name="__RefHeading___Toc346_3696126145"/>
+      <w:bookmarkEnd w:id="9"/>
       <w:r>
         <w:rPr/>
         <w:t>Changing CONTENTS Label and/or FileName</w:t>
@@ -1670,11 +2276,144 @@
         <w:jc w:val="left"/>
         <w:rPr/>
       </w:pPr>
-      <w:bookmarkStart w:id="7" w:name="__RefHeading___Toc175_3696126145"/>
-      <w:bookmarkEnd w:id="7"/>
+      <w:bookmarkStart w:id="10" w:name="__RefHeading___Toc175_3696126145"/>
+      <w:bookmarkEnd w:id="10"/>
       <w:r>
         <w:rPr/>
         <w:t>Source Layout</w:t>
+      </w:r>
+    </w:p>
+    <w:p>
+      <w:pPr>
+        <w:pStyle w:val="Heading2"/>
+        <w:numPr>
+          <w:ilvl w:val="1"/>
+          <w:numId w:val="1"/>
+        </w:numPr>
+        <w:rPr/>
+      </w:pPr>
+      <w:r>
+        <w:rPr/>
+        <w:t>Naming Convention</w:t>
+      </w:r>
+    </w:p>
+    <w:p>
+      <w:pPr>
+        <w:pStyle w:val="Normal"/>
+        <w:rPr/>
+      </w:pPr>
+      <w:r>
+        <w:rPr/>
+      </w:r>
+    </w:p>
+    <w:p>
+      <w:pPr>
+        <w:pStyle w:val="TextBody"/>
+        <w:rPr>
+          <w:rFonts w:ascii="Liberation Sans" w:hAnsi="Liberation Sans"/>
+        </w:rPr>
+      </w:pPr>
+      <w:r>
+        <w:rPr>
+          <w:rFonts w:ascii="Liberation Sans" w:hAnsi="Liberation Sans"/>
+        </w:rPr>
+        <w:t>Source files use the following naming convention, somewhat loosely followed as not all of these are appropriate for all objects:</w:t>
+      </w:r>
+    </w:p>
+    <w:p>
+      <w:pPr>
+        <w:pStyle w:val="TextBody"/>
+        <w:rPr>
+          <w:rFonts w:ascii="Liberation Sans" w:hAnsi="Liberation Sans"/>
+        </w:rPr>
+      </w:pPr>
+      <w:r>
+        <w:rPr>
+          <w:rFonts w:ascii="Liberation Sans" w:hAnsi="Liberation Sans"/>
+        </w:rPr>
+        <w:t>- c\&lt;object\&gt;.c: This is similar to a class file. It contains the code and data structures for creating, manipulating and deleting the object.</w:t>
+      </w:r>
+    </w:p>
+    <w:p>
+      <w:pPr>
+        <w:pStyle w:val="TextBody"/>
+        <w:rPr>
+          <w:rFonts w:ascii="Liberation Sans" w:hAnsi="Liberation Sans"/>
+        </w:rPr>
+      </w:pPr>
+      <w:r>
+        <w:rPr>
+          <w:rFonts w:ascii="Liberation Sans" w:hAnsi="Liberation Sans"/>
+        </w:rPr>
+        <w:t xml:space="preserve">- d\&lt;object\&gt;.c: This code handles the dialog(s) for creating, changing and deleting the object. </w:t>
+      </w:r>
+    </w:p>
+    <w:p>
+      <w:pPr>
+        <w:pStyle w:val="TextBody"/>
+        <w:rPr>
+          <w:rFonts w:ascii="Liberation Sans" w:hAnsi="Liberation Sans"/>
+        </w:rPr>
+      </w:pPr>
+      <w:r>
+        <w:rPr>
+          <w:rFonts w:ascii="Liberation Sans" w:hAnsi="Liberation Sans"/>
+        </w:rPr>
+        <w:t xml:space="preserve">- t\&lt;object\h.c: This code handle the drawing of the object. </w:t>
+      </w:r>
+    </w:p>
+    <w:p>
+      <w:pPr>
+        <w:pStyle w:val="TextBody"/>
+        <w:rPr>
+          <w:rFonts w:ascii="Liberation Sans" w:hAnsi="Liberation Sans"/>
+        </w:rPr>
+      </w:pPr>
+      <w:r>
+        <w:rPr>
+          <w:rFonts w:ascii="Liberation Sans" w:hAnsi="Liberation Sans"/>
+        </w:rPr>
+        <w:t>- c\&lt;object\&gt;.h: Definitions for the methods of the object that need to be visible outside the object class.</w:t>
+      </w:r>
+    </w:p>
+    <w:p>
+      <w:pPr>
+        <w:pStyle w:val="TextBody"/>
+        <w:rPr>
+          <w:rFonts w:ascii="Liberation Sans" w:hAnsi="Liberation Sans"/>
+        </w:rPr>
+      </w:pPr>
+      <w:r>
+        <w:rPr>
+          <w:rFonts w:ascii="Liberation Sans" w:hAnsi="Liberation Sans"/>
+        </w:rPr>
+      </w:r>
+    </w:p>
+    <w:p>
+      <w:pPr>
+        <w:pStyle w:val="TextBody"/>
+        <w:rPr>
+          <w:rFonts w:ascii="Liberation Sans" w:hAnsi="Liberation Sans"/>
+        </w:rPr>
+      </w:pPr>
+      <w:r>
+        <w:rPr>
+          <w:rFonts w:ascii="Liberation Sans" w:hAnsi="Liberation Sans"/>
+        </w:rPr>
+        <w:t xml:space="preserve">For example, there are files ccurve.c, ccurve.h and tcurve.c. There is no dialog for curved track. </w:t>
+      </w:r>
+    </w:p>
+    <w:p>
+      <w:pPr>
+        <w:pStyle w:val="TextBody"/>
+        <w:rPr>
+          <w:rFonts w:ascii="Liberation Sans" w:hAnsi="Liberation Sans"/>
+        </w:rPr>
+      </w:pPr>
+      <w:r>
+        <w:rPr>
+          <w:rFonts w:ascii="Liberation Sans" w:hAnsi="Liberation Sans"/>
+        </w:rPr>
       </w:r>
       <w:r>
         <w:br w:type="page"/>
@@ -1692,8 +2431,8 @@
         <w:jc w:val="left"/>
         <w:rPr/>
       </w:pPr>
-      <w:bookmarkStart w:id="8" w:name="__RefHeading___Toc109_2394484777"/>
-      <w:bookmarkEnd w:id="8"/>
+      <w:bookmarkStart w:id="11" w:name="__RefHeading___Toc109_2394484777"/>
+      <w:bookmarkEnd w:id="11"/>
       <w:r>
         <w:rPr/>
         <w:t>WLib Interaction</w:t>
@@ -2002,8 +2741,8 @@
         <w:ind w:left="0" w:hanging="0"/>
         <w:rPr/>
       </w:pPr>
-      <w:bookmarkStart w:id="9" w:name="__RefHeading___Toc113_2394484777"/>
-      <w:bookmarkEnd w:id="9"/>
+      <w:bookmarkStart w:id="12" w:name="__RefHeading___Toc113_2394484777"/>
+      <w:bookmarkEnd w:id="12"/>
       <w:r>
         <w:rPr/>
         <w:t>Pretty Printing</w:t>
@@ -2022,7 +2761,7 @@
         </w:rPr>
         <w:t xml:space="preserve">Code may be formatted (pretty-printed) using the </w:t>
       </w:r>
-      <w:hyperlink r:id="rId2">
+      <w:hyperlink r:id="rId4">
         <w:r>
           <w:rPr>
             <w:rStyle w:val="InternetLink"/>
@@ -2126,8 +2865,8 @@
         <w:ind w:left="0" w:hanging="0"/>
         <w:rPr/>
       </w:pPr>
-      <w:bookmarkStart w:id="10" w:name="__RefHeading___Toc115_2394484777"/>
-      <w:bookmarkEnd w:id="10"/>
+      <w:bookmarkStart w:id="13" w:name="__RefHeading___Toc115_2394484777"/>
+      <w:bookmarkEnd w:id="13"/>
       <w:r>
         <w:rPr/>
         <w:t>Casts</w:t>
@@ -2181,8 +2920,8 @@
         </w:numPr>
         <w:rPr/>
       </w:pPr>
-      <w:bookmarkStart w:id="11" w:name="__RefHeading___Toc414_4191666527"/>
-      <w:bookmarkEnd w:id="11"/>
+      <w:bookmarkStart w:id="14" w:name="__RefHeading___Toc414_4191666527"/>
+      <w:bookmarkEnd w:id="14"/>
       <w:r>
         <w:rPr/>
         <w:t>Downcast Numeric values</w:t>
@@ -2218,8 +2957,8 @@
         </w:numPr>
         <w:rPr/>
       </w:pPr>
-      <w:bookmarkStart w:id="12" w:name="__RefHeading___Toc416_4191666527"/>
-      <w:bookmarkEnd w:id="12"/>
+      <w:bookmarkStart w:id="15" w:name="__RefHeading___Toc416_4191666527"/>
+      <w:bookmarkEnd w:id="15"/>
       <w:r>
         <w:rPr/>
         <w:t>Generic Values</w:t>
@@ -2285,8 +3024,8 @@
         </w:numPr>
         <w:rPr/>
       </w:pPr>
-      <w:bookmarkStart w:id="13" w:name="__RefHeading___Toc418_4191666527"/>
-      <w:bookmarkEnd w:id="13"/>
+      <w:bookmarkStart w:id="16" w:name="__RefHeading___Toc418_4191666527"/>
+      <w:bookmarkEnd w:id="16"/>
       <w:r>
         <w:rPr/>
         <w:t>Wlib wControl_t conversion</w:t>
@@ -2322,8 +3061,8 @@
         </w:numPr>
         <w:rPr/>
       </w:pPr>
-      <w:bookmarkStart w:id="14" w:name="__RefHeading___Toc420_4191666527"/>
-      <w:bookmarkEnd w:id="14"/>
+      <w:bookmarkStart w:id="17" w:name="__RefHeading___Toc420_4191666527"/>
+      <w:bookmarkEnd w:id="17"/>
       <w:r>
         <w:rPr/>
         <w:t>GetTrkExtraData</w:t>
@@ -2355,8 +3094,8 @@
         <w:ind w:left="0" w:hanging="0"/>
         <w:rPr/>
       </w:pPr>
-      <w:bookmarkStart w:id="15" w:name="__RefHeading___Toc87_1320853591"/>
-      <w:bookmarkEnd w:id="15"/>
+      <w:bookmarkStart w:id="18" w:name="__RefHeading___Toc87_1320853591"/>
+      <w:bookmarkEnd w:id="18"/>
       <w:r>
         <w:rPr/>
         <w:t>Error Handling</w:t>
@@ -2402,8 +3141,8 @@
         </w:numPr>
         <w:rPr/>
       </w:pPr>
-      <w:bookmarkStart w:id="16" w:name="__RefHeading___Toc372_3696126145"/>
-      <w:bookmarkEnd w:id="16"/>
+      <w:bookmarkStart w:id="19" w:name="__RefHeading___Toc372_3696126145"/>
+      <w:bookmarkEnd w:id="19"/>
       <w:r>
         <w:rPr/>
         <w:t>User Input Errors</w:t>
@@ -2516,8 +3255,8 @@
         </w:numPr>
         <w:rPr/>
       </w:pPr>
-      <w:bookmarkStart w:id="17" w:name="__RefHeading___Toc374_3696126145"/>
-      <w:bookmarkEnd w:id="17"/>
+      <w:bookmarkStart w:id="20" w:name="__RefHeading___Toc374_3696126145"/>
+      <w:bookmarkEnd w:id="20"/>
       <w:r>
         <w:rPr/>
         <w:t>File Input Errors</w:t>
@@ -2630,8 +3369,8 @@
         </w:numPr>
         <w:rPr/>
       </w:pPr>
-      <w:bookmarkStart w:id="18" w:name="__RefHeading___Toc376_3696126145"/>
-      <w:bookmarkEnd w:id="18"/>
+      <w:bookmarkStart w:id="21" w:name="__RefHeading___Toc376_3696126145"/>
+      <w:bookmarkEnd w:id="21"/>
       <w:r>
         <w:rPr/>
         <w:t>Logic errors</w:t>
@@ -2752,8 +3491,8 @@
         </w:numPr>
         <w:rPr/>
       </w:pPr>
-      <w:bookmarkStart w:id="19" w:name="__RefHeading___Toc378_3696126145"/>
-      <w:bookmarkEnd w:id="19"/>
+      <w:bookmarkStart w:id="22" w:name="__RefHeading___Toc378_3696126145"/>
+      <w:bookmarkEnd w:id="22"/>
       <w:r>
         <w:rPr/>
         <w:t>System/Evironmental errors</w:t>
@@ -2807,8 +3546,8 @@
         <w:ind w:left="0" w:hanging="0"/>
         <w:rPr/>
       </w:pPr>
-      <w:bookmarkStart w:id="20" w:name="__RefHeading___Toc366_3696126145"/>
-      <w:bookmarkEnd w:id="20"/>
+      <w:bookmarkStart w:id="23" w:name="__RefHeading___Toc366_3696126145"/>
+      <w:bookmarkEnd w:id="23"/>
       <w:r>
         <w:rPr/>
         <w:t xml:space="preserve">Undo Processing </w:t>
@@ -2827,8 +3566,8 @@
         <w:ind w:left="0" w:hanging="0"/>
         <w:rPr/>
       </w:pPr>
-      <w:bookmarkStart w:id="21" w:name="__RefHeading___Toc368_3696126145"/>
-      <w:bookmarkEnd w:id="21"/>
+      <w:bookmarkStart w:id="24" w:name="__RefHeading___Toc368_3696126145"/>
+      <w:bookmarkEnd w:id="24"/>
       <w:r>
         <w:rPr/>
         <w:t>Draw Model</w:t>
@@ -2847,8 +3586,8 @@
         <w:ind w:left="0" w:hanging="0"/>
         <w:rPr/>
       </w:pPr>
-      <w:bookmarkStart w:id="22" w:name="__RefHeading___Toc358_3696126145"/>
-      <w:bookmarkEnd w:id="22"/>
+      <w:bookmarkStart w:id="25" w:name="__RefHeading___Toc358_3696126145"/>
+      <w:bookmarkEnd w:id="25"/>
       <w:r>
         <w:rPr/>
         <w:t>Headers</w:t>
@@ -2884,8 +3623,8 @@
         <w:ind w:left="0" w:hanging="0"/>
         <w:rPr/>
       </w:pPr>
-      <w:bookmarkStart w:id="23" w:name="__RefHeading___Toc360_3696126145"/>
-      <w:bookmarkEnd w:id="23"/>
+      <w:bookmarkStart w:id="26" w:name="__RefHeading___Toc360_3696126145"/>
+      <w:bookmarkEnd w:id="26"/>
       <w:r>
         <w:rPr/>
         <w:t>#ifdef WINDOWS</w:t>
@@ -2922,8 +3661,8 @@
         <w:ind w:left="0" w:hanging="0"/>
         <w:rPr/>
       </w:pPr>
-      <w:bookmarkStart w:id="24" w:name="__RefHeading___Toc362_3696126145"/>
-      <w:bookmarkEnd w:id="24"/>
+      <w:bookmarkStart w:id="27" w:name="__RefHeading___Toc362_3696126145"/>
+      <w:bookmarkEnd w:id="27"/>
       <w:r>
         <w:rPr/>
         <w:t>VERSION handling</w:t>
@@ -2948,8 +3687,9 @@
     <w:lvl w:ilvl="0">
       <w:start w:val="1"/>
       <w:pStyle w:val="Heading1"/>
-      <w:numFmt w:val="decimal"/>
-      <w:lvlText w:val="%1"/>
+      <w:numFmt w:val="none"/>
+      <w:suff w:val="nothing"/>
+      <w:lvlText w:val=""/>
       <w:lvlJc w:val="left"/>
       <w:pPr>
         <w:ind w:left="0" w:hanging="0"/>
@@ -3217,6 +3957,152 @@
       <w:pPr>
         <w:ind w:left="0" w:hanging="0"/>
       </w:pPr>
+    </w:lvl>
+  </w:abstractNum>
+  <w:abstractNum w:abstractNumId="4">
+    <w:lvl w:ilvl="0">
+      <w:start w:val="1"/>
+      <w:numFmt w:val="bullet"/>
+      <w:lvlText w:val=""/>
+      <w:lvlJc w:val="left"/>
+      <w:pPr>
+        <w:tabs>
+          <w:tab w:val="num" w:pos="720"/>
+        </w:tabs>
+        <w:ind w:left="720" w:hanging="360"/>
+      </w:pPr>
+      <w:rPr>
+        <w:rFonts w:ascii="Symbol" w:hAnsi="Symbol" w:cs="Symbol" w:hint="default"/>
+        <w:rFonts w:cs="OpenSymbol"/>
+      </w:rPr>
+    </w:lvl>
+    <w:lvl w:ilvl="1">
+      <w:start w:val="1"/>
+      <w:numFmt w:val="bullet"/>
+      <w:lvlText w:val="◦"/>
+      <w:lvlJc w:val="left"/>
+      <w:pPr>
+        <w:tabs>
+          <w:tab w:val="num" w:pos="1080"/>
+        </w:tabs>
+        <w:ind w:left="1080" w:hanging="360"/>
+      </w:pPr>
+      <w:rPr>
+        <w:rFonts w:ascii="OpenSymbol" w:hAnsi="OpenSymbol" w:cs="OpenSymbol" w:hint="default"/>
+        <w:rFonts w:cs="OpenSymbol"/>
+      </w:rPr>
+    </w:lvl>
+    <w:lvl w:ilvl="2">
+      <w:start w:val="1"/>
+      <w:numFmt w:val="bullet"/>
+      <w:lvlText w:val="▪"/>
+      <w:lvlJc w:val="left"/>
+      <w:pPr>
+        <w:tabs>
+          <w:tab w:val="num" w:pos="1440"/>
+        </w:tabs>
+        <w:ind w:left="1440" w:hanging="360"/>
+      </w:pPr>
+      <w:rPr>
+        <w:rFonts w:ascii="OpenSymbol" w:hAnsi="OpenSymbol" w:cs="OpenSymbol" w:hint="default"/>
+        <w:rFonts w:cs="OpenSymbol"/>
+      </w:rPr>
+    </w:lvl>
+    <w:lvl w:ilvl="3">
+      <w:start w:val="1"/>
+      <w:numFmt w:val="bullet"/>
+      <w:lvlText w:val=""/>
+      <w:lvlJc w:val="left"/>
+      <w:pPr>
+        <w:tabs>
+          <w:tab w:val="num" w:pos="1800"/>
+        </w:tabs>
+        <w:ind w:left="1800" w:hanging="360"/>
+      </w:pPr>
+      <w:rPr>
+        <w:rFonts w:ascii="Symbol" w:hAnsi="Symbol" w:cs="Symbol" w:hint="default"/>
+        <w:rFonts w:cs="OpenSymbol"/>
+      </w:rPr>
+    </w:lvl>
+    <w:lvl w:ilvl="4">
+      <w:start w:val="1"/>
+      <w:numFmt w:val="bullet"/>
+      <w:lvlText w:val="◦"/>
+      <w:lvlJc w:val="left"/>
+      <w:pPr>
+        <w:tabs>
+          <w:tab w:val="num" w:pos="2160"/>
+        </w:tabs>
+        <w:ind w:left="2160" w:hanging="360"/>
+      </w:pPr>
+      <w:rPr>
+        <w:rFonts w:ascii="OpenSymbol" w:hAnsi="OpenSymbol" w:cs="OpenSymbol" w:hint="default"/>
+        <w:rFonts w:cs="OpenSymbol"/>
+      </w:rPr>
+    </w:lvl>
+    <w:lvl w:ilvl="5">
+      <w:start w:val="1"/>
+      <w:numFmt w:val="bullet"/>
+      <w:lvlText w:val="▪"/>
+      <w:lvlJc w:val="left"/>
+      <w:pPr>
+        <w:tabs>
+          <w:tab w:val="num" w:pos="2520"/>
+        </w:tabs>
+        <w:ind w:left="2520" w:hanging="360"/>
+      </w:pPr>
+      <w:rPr>
+        <w:rFonts w:ascii="OpenSymbol" w:hAnsi="OpenSymbol" w:cs="OpenSymbol" w:hint="default"/>
+        <w:rFonts w:cs="OpenSymbol"/>
+      </w:rPr>
+    </w:lvl>
+    <w:lvl w:ilvl="6">
+      <w:start w:val="1"/>
+      <w:numFmt w:val="bullet"/>
+      <w:lvlText w:val=""/>
+      <w:lvlJc w:val="left"/>
+      <w:pPr>
+        <w:tabs>
+          <w:tab w:val="num" w:pos="2880"/>
+        </w:tabs>
+        <w:ind w:left="2880" w:hanging="360"/>
+      </w:pPr>
+      <w:rPr>
+        <w:rFonts w:ascii="Symbol" w:hAnsi="Symbol" w:cs="Symbol" w:hint="default"/>
+        <w:rFonts w:cs="OpenSymbol"/>
+      </w:rPr>
+    </w:lvl>
+    <w:lvl w:ilvl="7">
+      <w:start w:val="1"/>
+      <w:numFmt w:val="bullet"/>
+      <w:lvlText w:val="◦"/>
+      <w:lvlJc w:val="left"/>
+      <w:pPr>
+        <w:tabs>
+          <w:tab w:val="num" w:pos="3240"/>
+        </w:tabs>
+        <w:ind w:left="3240" w:hanging="360"/>
+      </w:pPr>
+      <w:rPr>
+        <w:rFonts w:ascii="OpenSymbol" w:hAnsi="OpenSymbol" w:cs="OpenSymbol" w:hint="default"/>
+        <w:rFonts w:cs="OpenSymbol"/>
+      </w:rPr>
+    </w:lvl>
+    <w:lvl w:ilvl="8">
+      <w:start w:val="1"/>
+      <w:numFmt w:val="bullet"/>
+      <w:lvlText w:val="▪"/>
+      <w:lvlJc w:val="left"/>
+      <w:pPr>
+        <w:tabs>
+          <w:tab w:val="num" w:pos="3600"/>
+        </w:tabs>
+        <w:ind w:left="3600" w:hanging="360"/>
+      </w:pPr>
+      <w:rPr>
+        <w:rFonts w:ascii="OpenSymbol" w:hAnsi="OpenSymbol" w:cs="OpenSymbol" w:hint="default"/>
+        <w:rFonts w:cs="OpenSymbol"/>
+      </w:rPr>
     </w:lvl>
   </w:abstractNum>
   <w:num w:numId="1">
@@ -3227,6 +4113,9 @@
   </w:num>
   <w:num w:numId="3">
     <w:abstractNumId w:val="3"/>
+  </w:num>
+  <w:num w:numId="4">
+    <w:abstractNumId w:val="4"/>
   </w:num>
 </w:numbering>
 </file>
@@ -3253,7 +4142,7 @@
     <w:pPr>
       <w:widowControl/>
       <w:suppressAutoHyphens w:val="true"/>
-      <w:overflowPunct w:val="false"/>
+      <w:overflowPunct w:val="true"/>
       <w:bidi w:val="0"/>
       <w:jc w:val="left"/>
     </w:pPr>
@@ -3348,6 +4237,20 @@
     <w:qFormat/>
     <w:rPr>
       <w:rFonts w:ascii="Liberation Sans" w:hAnsi="Liberation Sans"/>
+    </w:rPr>
+  </w:style>
+  <w:style w:type="character" w:styleId="ListLabel3">
+    <w:name w:val="ListLabel 3"/>
+    <w:qFormat/>
+    <w:rPr>
+      <w:rFonts w:ascii="Liberation Sans" w:hAnsi="Liberation Sans"/>
+    </w:rPr>
+  </w:style>
+  <w:style w:type="character" w:styleId="Bullets">
+    <w:name w:val="Bullets"/>
+    <w:qFormat/>
+    <w:rPr>
+      <w:rFonts w:ascii="OpenSymbol" w:hAnsi="OpenSymbol" w:eastAsia="OpenSymbol" w:cs="OpenSymbol"/>
     </w:rPr>
   </w:style>
   <w:style w:type="paragraph" w:styleId="Heading">

</xml_diff>

<commit_message>
Add instructions on branching
</commit_message>
<xml_diff>
--- a/docs/DevGuide.docx
+++ b/docs/DevGuide.docx
@@ -1,6 +1,6 @@
 
 <file path=word/document.xml><?xml version="1.0" encoding="utf-8"?>
-<w:document xmlns:o="urn:schemas-microsoft-com:office:office" xmlns:r="http://schemas.openxmlformats.org/officeDocument/2006/relationships" xmlns:v="urn:schemas-microsoft-com:vml" xmlns:w="http://schemas.openxmlformats.org/wordprocessingml/2006/main" xmlns:w10="urn:schemas-microsoft-com:office:word" xmlns:wp="http://schemas.openxmlformats.org/drawingml/2006/wordprocessingDrawing" xmlns:wps="http://schemas.microsoft.com/office/word/2010/wordprocessingShape" xmlns:wpg="http://schemas.microsoft.com/office/word/2010/wordprocessingGroup" xmlns:mc="http://schemas.openxmlformats.org/markup-compatibility/2006" xmlns:wp14="http://schemas.microsoft.com/office/word/2010/wordprocessingDrawing" xmlns:w14="http://schemas.microsoft.com/office/word/2010/wordml" mc:Ignorable="w14 wp14">
+<w:document xmlns:o="urn:schemas-microsoft-com:office:office" xmlns:r="http://schemas.openxmlformats.org/officeDocument/2006/relationships" xmlns:v="urn:schemas-microsoft-com:vml" xmlns:w="http://schemas.openxmlformats.org/wordprocessingml/2006/main" xmlns:w10="urn:schemas-microsoft-com:office:word" xmlns:wp="http://schemas.openxmlformats.org/drawingml/2006/wordprocessingDrawing" xmlns:wps="http://schemas.microsoft.com/office/word/2010/wordprocessingShape" xmlns:wpg="http://schemas.microsoft.com/office/word/2010/wordprocessingGroup" xmlns:mc="http://schemas.openxmlformats.org/markup-compatibility/2006" xmlns:wp14="http://schemas.microsoft.com/office/word/2010/wordprocessingDrawing" xmlns:w14="http://schemas.microsoft.com/office/word/2010/wordml" xmlns:w15="http://schemas.microsoft.com/office/word/2012/wordml" mc:Ignorable="w14 wp14 w15">
   <w:body>
     <w:p>
       <w:pPr>
@@ -54,668 +54,579 @@
         <w:t>Table of Contents</w:t>
       </w:r>
     </w:p>
-    <w:p>
-      <w:pPr>
-        <w:pStyle w:val="Contents1"/>
-        <w:tabs>
-          <w:tab w:val="right" w:pos="9972" w:leader="dot"/>
-        </w:tabs>
-        <w:rPr/>
-      </w:pPr>
-      <w:r>
-        <w:fldChar w:fldCharType="begin"/>
-      </w:r>
-      <w:r>
-        <w:rPr>
-          <w:rStyle w:val="IndexLink"/>
-        </w:rPr>
-        <w:instrText> TOC \f \o "1-9" \h</w:instrText>
-      </w:r>
-      <w:r>
-        <w:rPr>
-          <w:rStyle w:val="IndexLink"/>
-        </w:rPr>
-        <w:fldChar w:fldCharType="separate"/>
-      </w:r>
-      <w:hyperlink w:anchor="__RefHeading___Toc777_2817623836">
-        <w:r>
-          <w:rPr>
-            <w:rStyle w:val="IndexLink"/>
-          </w:rPr>
-          <w:t>Introduction</w:t>
-          <w:tab/>
-          <w:t>3</w:t>
-        </w:r>
-      </w:hyperlink>
-    </w:p>
-    <w:p>
-      <w:pPr>
-        <w:pStyle w:val="Contents1"/>
-        <w:tabs>
-          <w:tab w:val="right" w:pos="9972" w:leader="dot"/>
-        </w:tabs>
-        <w:rPr/>
-      </w:pPr>
-      <w:hyperlink w:anchor="__RefHeading___Toc779_2817623836">
-        <w:r>
-          <w:rPr>
-            <w:rStyle w:val="IndexLink"/>
-          </w:rPr>
-          <w:t>Source Control</w:t>
-          <w:tab/>
-          <w:t>4</w:t>
-        </w:r>
-      </w:hyperlink>
-    </w:p>
-    <w:p>
-      <w:pPr>
-        <w:pStyle w:val="Contents2"/>
-        <w:tabs>
-          <w:tab w:val="right" w:pos="9972" w:leader="dot"/>
-        </w:tabs>
-        <w:rPr/>
-      </w:pPr>
-      <w:hyperlink w:anchor="__RefHeading___Toc781_2817623836">
-        <w:r>
-          <w:rPr>
-            <w:rStyle w:val="IndexLink"/>
-          </w:rPr>
-          <w:t>Branches</w:t>
-          <w:tab/>
-          <w:t>4</w:t>
-        </w:r>
-      </w:hyperlink>
-    </w:p>
-    <w:p>
-      <w:pPr>
-        <w:pStyle w:val="Contents2"/>
-        <w:tabs>
-          <w:tab w:val="right" w:pos="9972" w:leader="dot"/>
-        </w:tabs>
-        <w:rPr/>
-      </w:pPr>
-      <w:hyperlink w:anchor="__RefHeading___Toc783_2817623836">
-        <w:r>
-          <w:rPr>
-            <w:rStyle w:val="IndexLink"/>
-          </w:rPr>
-          <w:t>Releases</w:t>
-          <w:tab/>
-          <w:t>4</w:t>
-        </w:r>
-      </w:hyperlink>
-    </w:p>
-    <w:p>
-      <w:pPr>
-        <w:pStyle w:val="Contents1"/>
-        <w:tabs>
-          <w:tab w:val="right" w:pos="9972" w:leader="dot"/>
-        </w:tabs>
-        <w:rPr/>
-      </w:pPr>
-      <w:hyperlink w:anchor="__RefHeading___Toc350_3696126145">
-        <w:r>
-          <w:rPr>
-            <w:rStyle w:val="IndexLink"/>
-          </w:rPr>
-          <w:t>Text Files</w:t>
-          <w:tab/>
-          <w:t>5</w:t>
-        </w:r>
-      </w:hyperlink>
-    </w:p>
-    <w:p>
-      <w:pPr>
-        <w:pStyle w:val="Contents1"/>
-        <w:tabs>
-          <w:tab w:val="right" w:pos="9972" w:leader="dot"/>
-        </w:tabs>
-        <w:rPr/>
-      </w:pPr>
-      <w:hyperlink w:anchor="__RefHeading___Toc171_3696126145">
-        <w:r>
-          <w:rPr>
-            <w:rStyle w:val="IndexLink"/>
-          </w:rPr>
-          <w:t>Parameter File Maintenance</w:t>
-          <w:tab/>
-          <w:t>6</w:t>
-        </w:r>
-      </w:hyperlink>
-    </w:p>
-    <w:p>
-      <w:pPr>
-        <w:pStyle w:val="Contents2"/>
-        <w:tabs>
-          <w:tab w:val="right" w:pos="9972" w:leader="dot"/>
-        </w:tabs>
-        <w:rPr/>
-      </w:pPr>
-      <w:hyperlink w:anchor="__RefHeading___Toc342_3696126145">
-        <w:r>
-          <w:rPr>
-            <w:rStyle w:val="IndexLink"/>
-          </w:rPr>
-          <w:t>Independence of Parameters in Layout files</w:t>
-          <w:tab/>
-          <w:t>6</w:t>
-        </w:r>
-      </w:hyperlink>
-    </w:p>
-    <w:p>
-      <w:pPr>
-        <w:pStyle w:val="Contents2"/>
-        <w:tabs>
-          <w:tab w:val="right" w:pos="9972" w:leader="dot"/>
-        </w:tabs>
-        <w:rPr/>
-      </w:pPr>
-      <w:hyperlink w:anchor="__RefHeading___Toc173_3696126145">
-        <w:r>
-          <w:rPr>
-            <w:rStyle w:val="IndexLink"/>
-          </w:rPr>
-          <w:t>CONTENTS Label</w:t>
-          <w:tab/>
-          <w:t>6</w:t>
-        </w:r>
-      </w:hyperlink>
-    </w:p>
-    <w:p>
-      <w:pPr>
-        <w:pStyle w:val="Contents2"/>
-        <w:tabs>
-          <w:tab w:val="right" w:pos="9972" w:leader="dot"/>
-        </w:tabs>
-        <w:rPr/>
-      </w:pPr>
-      <w:hyperlink w:anchor="__RefHeading___Toc344_3696126145">
-        <w:r>
-          <w:rPr>
-            <w:rStyle w:val="IndexLink"/>
-          </w:rPr>
-          <w:t>Adding / Deleting Parameter files</w:t>
-          <w:tab/>
-          <w:t>6</w:t>
-        </w:r>
-      </w:hyperlink>
-    </w:p>
-    <w:p>
-      <w:pPr>
-        <w:pStyle w:val="Contents2"/>
-        <w:tabs>
-          <w:tab w:val="right" w:pos="9972" w:leader="dot"/>
-        </w:tabs>
-        <w:rPr/>
-      </w:pPr>
-      <w:hyperlink w:anchor="__RefHeading___Toc346_3696126145">
-        <w:r>
-          <w:rPr>
-            <w:rStyle w:val="IndexLink"/>
-          </w:rPr>
-          <w:t>Changing CONTENTS Label and/or FileName</w:t>
-          <w:tab/>
-          <w:t>6</w:t>
-        </w:r>
-      </w:hyperlink>
-    </w:p>
-    <w:p>
-      <w:pPr>
-        <w:pStyle w:val="Contents1"/>
-        <w:tabs>
-          <w:tab w:val="right" w:pos="9972" w:leader="dot"/>
-        </w:tabs>
-        <w:rPr/>
-      </w:pPr>
-      <w:hyperlink w:anchor="__RefHeading___Toc175_3696126145">
-        <w:r>
-          <w:rPr>
-            <w:rStyle w:val="IndexLink"/>
-          </w:rPr>
-          <w:t>Source Layout</w:t>
-          <w:tab/>
-          <w:t>8</w:t>
-        </w:r>
-      </w:hyperlink>
-    </w:p>
-    <w:p>
-      <w:pPr>
-        <w:pStyle w:val="Contents2"/>
-        <w:tabs>
-          <w:tab w:val="right" w:pos="9972" w:leader="dot"/>
-        </w:tabs>
-        <w:rPr/>
-      </w:pPr>
-      <w:hyperlink w:anchor="__RefHeading___Toc473_82747535">
-        <w:r>
-          <w:rPr>
-            <w:rStyle w:val="IndexLink"/>
-          </w:rPr>
-          <w:t>Naming Convention</w:t>
-          <w:tab/>
-          <w:t>8</w:t>
-        </w:r>
-      </w:hyperlink>
-    </w:p>
-    <w:p>
-      <w:pPr>
-        <w:pStyle w:val="Contents1"/>
-        <w:tabs>
-          <w:tab w:val="right" w:pos="9972" w:leader="dot"/>
-        </w:tabs>
-        <w:rPr/>
-      </w:pPr>
-      <w:hyperlink w:anchor="__RefHeading___Toc109_2394484777">
-        <w:r>
-          <w:rPr>
-            <w:rStyle w:val="IndexLink"/>
-          </w:rPr>
-          <w:t>WLib Interaction</w:t>
-          <w:tab/>
-          <w:t>9</w:t>
-        </w:r>
-      </w:hyperlink>
-    </w:p>
-    <w:p>
-      <w:pPr>
-        <w:pStyle w:val="Contents1"/>
-        <w:tabs>
-          <w:tab w:val="right" w:pos="9972" w:leader="dot"/>
-        </w:tabs>
-        <w:rPr/>
-      </w:pPr>
-      <w:hyperlink w:anchor="__RefHeading___Toc113_2394484777">
-        <w:r>
-          <w:rPr>
-            <w:rStyle w:val="IndexLink"/>
-          </w:rPr>
-          <w:t>Pretty Printing</w:t>
-          <w:tab/>
-          <w:t>10</w:t>
-        </w:r>
-      </w:hyperlink>
-    </w:p>
-    <w:p>
-      <w:pPr>
-        <w:pStyle w:val="Contents1"/>
-        <w:tabs>
-          <w:tab w:val="right" w:pos="9972" w:leader="dot"/>
-        </w:tabs>
-        <w:rPr/>
-      </w:pPr>
-      <w:hyperlink w:anchor="__RefHeading___Toc115_2394484777">
-        <w:r>
-          <w:rPr>
-            <w:rStyle w:val="IndexLink"/>
-          </w:rPr>
-          <w:t>Casts</w:t>
-          <w:tab/>
-          <w:t>11</w:t>
-        </w:r>
-      </w:hyperlink>
-    </w:p>
-    <w:p>
-      <w:pPr>
-        <w:pStyle w:val="Contents2"/>
-        <w:tabs>
-          <w:tab w:val="right" w:pos="9972" w:leader="dot"/>
-        </w:tabs>
-        <w:rPr/>
-      </w:pPr>
-      <w:hyperlink w:anchor="__RefHeading___Toc414_4191666527">
-        <w:r>
-          <w:rPr>
-            <w:rStyle w:val="IndexLink"/>
-          </w:rPr>
-          <w:t>Downcast Numeric values</w:t>
-          <w:tab/>
-          <w:t>11</w:t>
-        </w:r>
-      </w:hyperlink>
-    </w:p>
-    <w:p>
-      <w:pPr>
-        <w:pStyle w:val="Contents2"/>
-        <w:tabs>
-          <w:tab w:val="right" w:pos="9972" w:leader="dot"/>
-        </w:tabs>
-        <w:rPr/>
-      </w:pPr>
-      <w:hyperlink w:anchor="__RefHeading___Toc416_4191666527">
-        <w:r>
-          <w:rPr>
-            <w:rStyle w:val="IndexLink"/>
-          </w:rPr>
-          <w:t>Generic Values</w:t>
-          <w:tab/>
-          <w:t>11</w:t>
-        </w:r>
-      </w:hyperlink>
-    </w:p>
-    <w:p>
-      <w:pPr>
-        <w:pStyle w:val="Contents2"/>
-        <w:tabs>
-          <w:tab w:val="right" w:pos="9972" w:leader="dot"/>
-        </w:tabs>
-        <w:rPr/>
-      </w:pPr>
-      <w:hyperlink w:anchor="__RefHeading___Toc418_4191666527">
-        <w:r>
-          <w:rPr>
-            <w:rStyle w:val="IndexLink"/>
-          </w:rPr>
-          <w:t>Wlib wControl_t conversion</w:t>
-          <w:tab/>
-          <w:t>11</w:t>
-        </w:r>
-      </w:hyperlink>
-    </w:p>
-    <w:p>
-      <w:pPr>
-        <w:pStyle w:val="Contents2"/>
-        <w:tabs>
-          <w:tab w:val="right" w:pos="9972" w:leader="dot"/>
-        </w:tabs>
-        <w:rPr/>
-      </w:pPr>
-      <w:hyperlink w:anchor="__RefHeading___Toc420_4191666527">
-        <w:r>
-          <w:rPr>
-            <w:rStyle w:val="IndexLink"/>
-          </w:rPr>
-          <w:t>GetTrkExtraData</w:t>
-          <w:tab/>
-          <w:t>11</w:t>
-        </w:r>
-      </w:hyperlink>
-    </w:p>
-    <w:p>
-      <w:pPr>
-        <w:pStyle w:val="Contents1"/>
-        <w:tabs>
-          <w:tab w:val="right" w:pos="9972" w:leader="dot"/>
-        </w:tabs>
-        <w:rPr/>
-      </w:pPr>
-      <w:hyperlink w:anchor="__RefHeading___Toc87_1320853591">
-        <w:r>
-          <w:rPr>
-            <w:rStyle w:val="IndexLink"/>
-          </w:rPr>
-          <w:t>Error Handling</w:t>
-          <w:tab/>
-          <w:t>12</w:t>
-        </w:r>
-      </w:hyperlink>
-    </w:p>
-    <w:p>
-      <w:pPr>
-        <w:pStyle w:val="Contents2"/>
-        <w:tabs>
-          <w:tab w:val="right" w:pos="9972" w:leader="dot"/>
-        </w:tabs>
-        <w:rPr/>
-      </w:pPr>
-      <w:hyperlink w:anchor="__RefHeading___Toc372_3696126145">
-        <w:r>
-          <w:rPr>
-            <w:rStyle w:val="IndexLink"/>
-          </w:rPr>
-          <w:t>User Input Errors</w:t>
-          <w:tab/>
-          <w:t>12</w:t>
-        </w:r>
-      </w:hyperlink>
-    </w:p>
-    <w:p>
-      <w:pPr>
-        <w:pStyle w:val="Contents2"/>
-        <w:tabs>
-          <w:tab w:val="right" w:pos="9972" w:leader="dot"/>
-        </w:tabs>
-        <w:rPr/>
-      </w:pPr>
-      <w:hyperlink w:anchor="__RefHeading___Toc374_3696126145">
-        <w:r>
-          <w:rPr>
-            <w:rStyle w:val="IndexLink"/>
-          </w:rPr>
-          <w:t>File Input Errors</w:t>
-          <w:tab/>
-          <w:t>12</w:t>
-        </w:r>
-      </w:hyperlink>
-    </w:p>
-    <w:p>
-      <w:pPr>
-        <w:pStyle w:val="Contents2"/>
-        <w:tabs>
-          <w:tab w:val="right" w:pos="9972" w:leader="dot"/>
-        </w:tabs>
-        <w:rPr/>
-      </w:pPr>
-      <w:hyperlink w:anchor="__RefHeading___Toc376_3696126145">
-        <w:r>
-          <w:rPr>
-            <w:rStyle w:val="IndexLink"/>
-          </w:rPr>
-          <w:t>Logic errors</w:t>
-          <w:tab/>
-          <w:t>12</w:t>
-        </w:r>
-      </w:hyperlink>
-    </w:p>
-    <w:p>
-      <w:pPr>
-        <w:pStyle w:val="Contents2"/>
-        <w:tabs>
-          <w:tab w:val="right" w:pos="9972" w:leader="dot"/>
-        </w:tabs>
-        <w:rPr/>
-      </w:pPr>
-      <w:hyperlink w:anchor="__RefHeading___Toc378_3696126145">
-        <w:r>
-          <w:rPr>
-            <w:rStyle w:val="IndexLink"/>
-          </w:rPr>
-          <w:t>System/Evironmental errors</w:t>
-          <w:tab/>
-          <w:t>13</w:t>
-        </w:r>
-      </w:hyperlink>
-    </w:p>
-    <w:p>
-      <w:pPr>
-        <w:pStyle w:val="Contents1"/>
-        <w:tabs>
-          <w:tab w:val="right" w:pos="9972" w:leader="dot"/>
-        </w:tabs>
-        <w:rPr/>
-      </w:pPr>
-      <w:hyperlink w:anchor="__RefHeading___Toc366_3696126145">
-        <w:r>
-          <w:rPr>
-            <w:rStyle w:val="IndexLink"/>
-          </w:rPr>
-          <w:t>Undo Processing</w:t>
-          <w:tab/>
-          <w:t>14</w:t>
-        </w:r>
-      </w:hyperlink>
-    </w:p>
-    <w:p>
-      <w:pPr>
-        <w:pStyle w:val="Contents1"/>
-        <w:tabs>
-          <w:tab w:val="right" w:pos="9972" w:leader="dot"/>
-        </w:tabs>
-        <w:rPr/>
-      </w:pPr>
-      <w:hyperlink w:anchor="__RefHeading___Toc368_3696126145">
-        <w:r>
-          <w:rPr>
-            <w:rStyle w:val="IndexLink"/>
-          </w:rPr>
-          <w:t>Draw Model</w:t>
-          <w:tab/>
-          <w:t>15</w:t>
-        </w:r>
-      </w:hyperlink>
-    </w:p>
-    <w:p>
-      <w:pPr>
-        <w:pStyle w:val="Contents1"/>
-        <w:tabs>
-          <w:tab w:val="right" w:pos="9972" w:leader="dot"/>
-        </w:tabs>
-        <w:rPr/>
-      </w:pPr>
-      <w:hyperlink w:anchor="__RefHeading___Toc358_3696126145">
-        <w:r>
-          <w:rPr>
-            <w:rStyle w:val="IndexLink"/>
-          </w:rPr>
-          <w:t>Headers</w:t>
-          <w:tab/>
-          <w:t>16</w:t>
-        </w:r>
-      </w:hyperlink>
-    </w:p>
-    <w:p>
-      <w:pPr>
-        <w:pStyle w:val="Contents1"/>
-        <w:tabs>
-          <w:tab w:val="right" w:pos="9972" w:leader="dot"/>
-        </w:tabs>
-        <w:rPr/>
-      </w:pPr>
-      <w:hyperlink w:anchor="__RefHeading___Toc360_3696126145">
-        <w:r>
-          <w:rPr>
-            <w:rStyle w:val="IndexLink"/>
-          </w:rPr>
-          <w:t>#ifdef WINDOWS</w:t>
-          <w:tab/>
-          <w:t>17</w:t>
-        </w:r>
-      </w:hyperlink>
-    </w:p>
-    <w:p>
-      <w:pPr>
-        <w:pStyle w:val="Contents1"/>
-        <w:tabs>
-          <w:tab w:val="right" w:pos="9972" w:leader="dot"/>
-        </w:tabs>
-        <w:rPr/>
-      </w:pPr>
-      <w:hyperlink w:anchor="__RefHeading___Toc362_3696126145">
-        <w:r>
-          <w:rPr>
-            <w:rStyle w:val="IndexLink"/>
-          </w:rPr>
-          <w:t>VERSION handling</w:t>
-          <w:tab/>
-          <w:t>18</w:t>
-        </w:r>
-      </w:hyperlink>
-    </w:p>
-    <w:p>
-      <w:pPr>
-        <w:pStyle w:val="Contents2"/>
-        <w:tabs>
-          <w:tab w:val="right" w:pos="9972" w:leader="dot"/>
-        </w:tabs>
-        <w:rPr/>
-      </w:pPr>
-      <w:hyperlink w:anchor="__RefHeading___Toc475_82747535">
-        <w:r>
-          <w:rPr>
-            <w:rStyle w:val="IndexLink"/>
-          </w:rPr>
-          <w:t>Release Version</w:t>
-          <w:tab/>
-          <w:t>18</w:t>
-        </w:r>
-      </w:hyperlink>
-    </w:p>
-    <w:p>
-      <w:pPr>
-        <w:pStyle w:val="Contents2"/>
-        <w:tabs>
-          <w:tab w:val="right" w:pos="9972" w:leader="dot"/>
-        </w:tabs>
-        <w:rPr/>
-      </w:pPr>
-      <w:hyperlink w:anchor="__RefHeading___Toc477_82747535">
-        <w:r>
-          <w:rPr>
-            <w:rStyle w:val="IndexLink"/>
-          </w:rPr>
-          <w:t>File Format Version</w:t>
-          <w:tab/>
-          <w:t>18</w:t>
-        </w:r>
-      </w:hyperlink>
-    </w:p>
-    <w:p>
-      <w:pPr>
-        <w:pStyle w:val="Contents2"/>
-        <w:tabs>
-          <w:tab w:val="right" w:pos="9972" w:leader="dot"/>
-        </w:tabs>
-        <w:rPr/>
-      </w:pPr>
-      <w:hyperlink w:anchor="__RefHeading___Toc479_82747535">
-        <w:r>
-          <w:rPr>
-            <w:rStyle w:val="IndexLink"/>
-          </w:rPr>
-          <w:t>Segment Version</w:t>
-          <w:tab/>
-          <w:t>18</w:t>
-        </w:r>
-      </w:hyperlink>
-    </w:p>
-    <w:p>
-      <w:pPr>
-        <w:pStyle w:val="Contents2"/>
-        <w:tabs>
-          <w:tab w:val="right" w:pos="9972" w:leader="dot"/>
-        </w:tabs>
-        <w:rPr/>
-      </w:pPr>
-      <w:hyperlink w:anchor="__RefHeading___Toc481_82747535">
-        <w:r>
-          <w:rPr>
-            <w:rStyle w:val="IndexLink"/>
-          </w:rPr>
-          <w:t>Extensible Segment Format</w:t>
-          <w:tab/>
-          <w:t>19</w:t>
-        </w:r>
-      </w:hyperlink>
-    </w:p>
-    <w:p>
-      <w:pPr>
-        <w:pStyle w:val="Heading1"/>
-        <w:numPr>
-          <w:ilvl w:val="0"/>
-          <w:numId w:val="2"/>
-        </w:numPr>
-        <w:rPr/>
-      </w:pPr>
-      <w:bookmarkStart w:id="0" w:name="__RefHeading___Toc777_2817623836"/>
-      <w:bookmarkEnd w:id="0"/>
-      <w:r>
-        <w:rPr/>
-        <w:t>Introduction</w:t>
-      </w:r>
-      <w:r>
-        <w:rPr/>
-        <w:fldChar w:fldCharType="end"/>
-      </w:r>
-    </w:p>
+    <w:sdt>
+      <w:sdtPr>
+        <w:docPartObj>
+          <w:docPartGallery w:val="Table of Contents"/>
+          <w:docPartUnique w:val="true"/>
+        </w:docPartObj>
+      </w:sdtPr>
+      <w:sdtContent>
+        <w:p>
+          <w:pPr>
+            <w:pStyle w:val="Contents1"/>
+            <w:rPr/>
+          </w:pPr>
+          <w:r>
+            <w:fldChar w:fldCharType="begin"/>
+          </w:r>
+          <w:r>
+            <w:rPr>
+              <w:rStyle w:val="IndexLink"/>
+            </w:rPr>
+            <w:instrText xml:space="preserve"> TOC \f \o "1-9" \h</w:instrText>
+          </w:r>
+          <w:r>
+            <w:rPr>
+              <w:rStyle w:val="IndexLink"/>
+            </w:rPr>
+            <w:fldChar w:fldCharType="separate"/>
+          </w:r>
+          <w:hyperlink w:anchor="__RefHeading___Toc777_2817623836">
+            <w:r>
+              <w:rPr>
+                <w:rStyle w:val="IndexLink"/>
+              </w:rPr>
+              <w:t>Introduction</w:t>
+              <w:tab/>
+              <w:t>3</w:t>
+            </w:r>
+          </w:hyperlink>
+        </w:p>
+        <w:p>
+          <w:pPr>
+            <w:pStyle w:val="Contents1"/>
+            <w:rPr/>
+          </w:pPr>
+          <w:hyperlink w:anchor="__RefHeading___Toc779_2817623836">
+            <w:r>
+              <w:rPr>
+                <w:rStyle w:val="IndexLink"/>
+              </w:rPr>
+              <w:t>Source Control</w:t>
+              <w:tab/>
+              <w:t>4</w:t>
+            </w:r>
+          </w:hyperlink>
+        </w:p>
+        <w:p>
+          <w:pPr>
+            <w:pStyle w:val="Contents2"/>
+            <w:rPr/>
+          </w:pPr>
+          <w:hyperlink w:anchor="__RefHeading___Toc781_2817623836">
+            <w:r>
+              <w:rPr>
+                <w:rStyle w:val="IndexLink"/>
+              </w:rPr>
+              <w:t>Branches</w:t>
+              <w:tab/>
+              <w:t>4</w:t>
+            </w:r>
+          </w:hyperlink>
+        </w:p>
+        <w:p>
+          <w:pPr>
+            <w:pStyle w:val="Contents2"/>
+            <w:rPr/>
+          </w:pPr>
+          <w:hyperlink w:anchor="__RefHeading___Toc783_2817623836">
+            <w:r>
+              <w:rPr>
+                <w:rStyle w:val="IndexLink"/>
+              </w:rPr>
+              <w:t>Releases</w:t>
+              <w:tab/>
+              <w:t>4</w:t>
+            </w:r>
+          </w:hyperlink>
+        </w:p>
+        <w:p>
+          <w:pPr>
+            <w:pStyle w:val="Contents1"/>
+            <w:rPr/>
+          </w:pPr>
+          <w:hyperlink w:anchor="__RefHeading___Toc350_3696126145">
+            <w:r>
+              <w:rPr>
+                <w:rStyle w:val="IndexLink"/>
+              </w:rPr>
+              <w:t>Text Files</w:t>
+              <w:tab/>
+              <w:t>5</w:t>
+            </w:r>
+          </w:hyperlink>
+        </w:p>
+        <w:p>
+          <w:pPr>
+            <w:pStyle w:val="Contents1"/>
+            <w:rPr/>
+          </w:pPr>
+          <w:hyperlink w:anchor="__RefHeading___Toc171_3696126145">
+            <w:r>
+              <w:rPr>
+                <w:rStyle w:val="IndexLink"/>
+              </w:rPr>
+              <w:t>Parameter File Maintenance</w:t>
+              <w:tab/>
+              <w:t>6</w:t>
+            </w:r>
+          </w:hyperlink>
+        </w:p>
+        <w:p>
+          <w:pPr>
+            <w:pStyle w:val="Contents2"/>
+            <w:rPr/>
+          </w:pPr>
+          <w:hyperlink w:anchor="__RefHeading___Toc342_3696126145">
+            <w:r>
+              <w:rPr>
+                <w:rStyle w:val="IndexLink"/>
+              </w:rPr>
+              <w:t>Independence of Parameters in Layout files</w:t>
+              <w:tab/>
+              <w:t>6</w:t>
+            </w:r>
+          </w:hyperlink>
+        </w:p>
+        <w:p>
+          <w:pPr>
+            <w:pStyle w:val="Contents2"/>
+            <w:rPr/>
+          </w:pPr>
+          <w:hyperlink w:anchor="__RefHeading___Toc173_3696126145">
+            <w:r>
+              <w:rPr>
+                <w:rStyle w:val="IndexLink"/>
+              </w:rPr>
+              <w:t>CONTENTS Label</w:t>
+              <w:tab/>
+              <w:t>6</w:t>
+            </w:r>
+          </w:hyperlink>
+        </w:p>
+        <w:p>
+          <w:pPr>
+            <w:pStyle w:val="Contents2"/>
+            <w:rPr/>
+          </w:pPr>
+          <w:hyperlink w:anchor="__RefHeading___Toc344_3696126145">
+            <w:r>
+              <w:rPr>
+                <w:rStyle w:val="IndexLink"/>
+              </w:rPr>
+              <w:t>Adding / Deleting Parameter files</w:t>
+              <w:tab/>
+              <w:t>6</w:t>
+            </w:r>
+          </w:hyperlink>
+        </w:p>
+        <w:p>
+          <w:pPr>
+            <w:pStyle w:val="Contents2"/>
+            <w:rPr/>
+          </w:pPr>
+          <w:hyperlink w:anchor="__RefHeading___Toc346_3696126145">
+            <w:r>
+              <w:rPr>
+                <w:rStyle w:val="IndexLink"/>
+              </w:rPr>
+              <w:t>Changing CONTENTS Label and/or FileName</w:t>
+              <w:tab/>
+              <w:t>6</w:t>
+            </w:r>
+          </w:hyperlink>
+        </w:p>
+        <w:p>
+          <w:pPr>
+            <w:pStyle w:val="Contents1"/>
+            <w:rPr/>
+          </w:pPr>
+          <w:hyperlink w:anchor="__RefHeading___Toc175_3696126145">
+            <w:r>
+              <w:rPr>
+                <w:rStyle w:val="IndexLink"/>
+              </w:rPr>
+              <w:t>Source Layout</w:t>
+              <w:tab/>
+              <w:t>8</w:t>
+            </w:r>
+          </w:hyperlink>
+        </w:p>
+        <w:p>
+          <w:pPr>
+            <w:pStyle w:val="Contents2"/>
+            <w:rPr/>
+          </w:pPr>
+          <w:hyperlink w:anchor="__RefHeading___Toc473_82747535">
+            <w:r>
+              <w:rPr>
+                <w:rStyle w:val="IndexLink"/>
+              </w:rPr>
+              <w:t>Naming Convention</w:t>
+              <w:tab/>
+              <w:t>8</w:t>
+            </w:r>
+          </w:hyperlink>
+        </w:p>
+        <w:p>
+          <w:pPr>
+            <w:pStyle w:val="Contents1"/>
+            <w:rPr/>
+          </w:pPr>
+          <w:hyperlink w:anchor="__RefHeading___Toc109_2394484777">
+            <w:r>
+              <w:rPr>
+                <w:rStyle w:val="IndexLink"/>
+              </w:rPr>
+              <w:t>WLib Interaction</w:t>
+              <w:tab/>
+              <w:t>9</w:t>
+            </w:r>
+          </w:hyperlink>
+        </w:p>
+        <w:p>
+          <w:pPr>
+            <w:pStyle w:val="Contents1"/>
+            <w:rPr/>
+          </w:pPr>
+          <w:hyperlink w:anchor="__RefHeading___Toc113_2394484777">
+            <w:r>
+              <w:rPr>
+                <w:rStyle w:val="IndexLink"/>
+              </w:rPr>
+              <w:t>Pretty Printing</w:t>
+              <w:tab/>
+              <w:t>10</w:t>
+            </w:r>
+          </w:hyperlink>
+        </w:p>
+        <w:p>
+          <w:pPr>
+            <w:pStyle w:val="Contents1"/>
+            <w:rPr/>
+          </w:pPr>
+          <w:hyperlink w:anchor="__RefHeading___Toc115_2394484777">
+            <w:r>
+              <w:rPr>
+                <w:rStyle w:val="IndexLink"/>
+              </w:rPr>
+              <w:t>Casts</w:t>
+              <w:tab/>
+              <w:t>11</w:t>
+            </w:r>
+          </w:hyperlink>
+        </w:p>
+        <w:p>
+          <w:pPr>
+            <w:pStyle w:val="Contents2"/>
+            <w:rPr/>
+          </w:pPr>
+          <w:hyperlink w:anchor="__RefHeading___Toc414_4191666527">
+            <w:r>
+              <w:rPr>
+                <w:rStyle w:val="IndexLink"/>
+              </w:rPr>
+              <w:t>Downcast Numeric values</w:t>
+              <w:tab/>
+              <w:t>11</w:t>
+            </w:r>
+          </w:hyperlink>
+        </w:p>
+        <w:p>
+          <w:pPr>
+            <w:pStyle w:val="Contents2"/>
+            <w:rPr/>
+          </w:pPr>
+          <w:hyperlink w:anchor="__RefHeading___Toc416_4191666527">
+            <w:r>
+              <w:rPr>
+                <w:rStyle w:val="IndexLink"/>
+              </w:rPr>
+              <w:t>Generic Values</w:t>
+              <w:tab/>
+              <w:t>11</w:t>
+            </w:r>
+          </w:hyperlink>
+        </w:p>
+        <w:p>
+          <w:pPr>
+            <w:pStyle w:val="Contents2"/>
+            <w:rPr/>
+          </w:pPr>
+          <w:hyperlink w:anchor="__RefHeading___Toc418_4191666527">
+            <w:r>
+              <w:rPr>
+                <w:rStyle w:val="IndexLink"/>
+              </w:rPr>
+              <w:t>Wlib wControl_t conversion</w:t>
+              <w:tab/>
+              <w:t>11</w:t>
+            </w:r>
+          </w:hyperlink>
+        </w:p>
+        <w:p>
+          <w:pPr>
+            <w:pStyle w:val="Contents2"/>
+            <w:rPr/>
+          </w:pPr>
+          <w:hyperlink w:anchor="__RefHeading___Toc420_4191666527">
+            <w:r>
+              <w:rPr>
+                <w:rStyle w:val="IndexLink"/>
+              </w:rPr>
+              <w:t>GetTrkExtraData</w:t>
+              <w:tab/>
+              <w:t>11</w:t>
+            </w:r>
+          </w:hyperlink>
+        </w:p>
+        <w:p>
+          <w:pPr>
+            <w:pStyle w:val="Contents1"/>
+            <w:rPr/>
+          </w:pPr>
+          <w:hyperlink w:anchor="__RefHeading___Toc87_1320853591">
+            <w:r>
+              <w:rPr>
+                <w:rStyle w:val="IndexLink"/>
+              </w:rPr>
+              <w:t>Error Handling</w:t>
+              <w:tab/>
+              <w:t>12</w:t>
+            </w:r>
+          </w:hyperlink>
+        </w:p>
+        <w:p>
+          <w:pPr>
+            <w:pStyle w:val="Contents2"/>
+            <w:rPr/>
+          </w:pPr>
+          <w:hyperlink w:anchor="__RefHeading___Toc372_3696126145">
+            <w:r>
+              <w:rPr>
+                <w:rStyle w:val="IndexLink"/>
+              </w:rPr>
+              <w:t>User Input Errors</w:t>
+              <w:tab/>
+              <w:t>12</w:t>
+            </w:r>
+          </w:hyperlink>
+        </w:p>
+        <w:p>
+          <w:pPr>
+            <w:pStyle w:val="Contents2"/>
+            <w:rPr/>
+          </w:pPr>
+          <w:hyperlink w:anchor="__RefHeading___Toc374_3696126145">
+            <w:r>
+              <w:rPr>
+                <w:rStyle w:val="IndexLink"/>
+              </w:rPr>
+              <w:t>File Input Errors</w:t>
+              <w:tab/>
+              <w:t>12</w:t>
+            </w:r>
+          </w:hyperlink>
+        </w:p>
+        <w:p>
+          <w:pPr>
+            <w:pStyle w:val="Contents2"/>
+            <w:rPr/>
+          </w:pPr>
+          <w:hyperlink w:anchor="__RefHeading___Toc376_3696126145">
+            <w:r>
+              <w:rPr>
+                <w:rStyle w:val="IndexLink"/>
+              </w:rPr>
+              <w:t>Logic errors</w:t>
+              <w:tab/>
+              <w:t>12</w:t>
+            </w:r>
+          </w:hyperlink>
+        </w:p>
+        <w:p>
+          <w:pPr>
+            <w:pStyle w:val="Contents2"/>
+            <w:rPr/>
+          </w:pPr>
+          <w:hyperlink w:anchor="__RefHeading___Toc378_3696126145">
+            <w:r>
+              <w:rPr>
+                <w:rStyle w:val="IndexLink"/>
+              </w:rPr>
+              <w:t>System/Evironmental errors</w:t>
+              <w:tab/>
+              <w:t>13</w:t>
+            </w:r>
+          </w:hyperlink>
+        </w:p>
+        <w:p>
+          <w:pPr>
+            <w:pStyle w:val="Contents1"/>
+            <w:rPr/>
+          </w:pPr>
+          <w:hyperlink w:anchor="__RefHeading___Toc366_3696126145">
+            <w:r>
+              <w:rPr>
+                <w:rStyle w:val="IndexLink"/>
+              </w:rPr>
+              <w:t>Undo Processing</w:t>
+              <w:tab/>
+              <w:t>14</w:t>
+            </w:r>
+          </w:hyperlink>
+        </w:p>
+        <w:p>
+          <w:pPr>
+            <w:pStyle w:val="Contents1"/>
+            <w:rPr/>
+          </w:pPr>
+          <w:hyperlink w:anchor="__RefHeading___Toc368_3696126145">
+            <w:r>
+              <w:rPr>
+                <w:rStyle w:val="IndexLink"/>
+              </w:rPr>
+              <w:t>Draw Model</w:t>
+              <w:tab/>
+              <w:t>15</w:t>
+            </w:r>
+          </w:hyperlink>
+        </w:p>
+        <w:p>
+          <w:pPr>
+            <w:pStyle w:val="Contents1"/>
+            <w:rPr/>
+          </w:pPr>
+          <w:hyperlink w:anchor="__RefHeading___Toc358_3696126145">
+            <w:r>
+              <w:rPr>
+                <w:rStyle w:val="IndexLink"/>
+              </w:rPr>
+              <w:t>Headers</w:t>
+              <w:tab/>
+              <w:t>16</w:t>
+            </w:r>
+          </w:hyperlink>
+        </w:p>
+        <w:p>
+          <w:pPr>
+            <w:pStyle w:val="Contents1"/>
+            <w:rPr/>
+          </w:pPr>
+          <w:hyperlink w:anchor="__RefHeading___Toc360_3696126145">
+            <w:r>
+              <w:rPr>
+                <w:rStyle w:val="IndexLink"/>
+              </w:rPr>
+              <w:t>#ifdef WINDOWS</w:t>
+              <w:tab/>
+              <w:t>17</w:t>
+            </w:r>
+          </w:hyperlink>
+        </w:p>
+        <w:p>
+          <w:pPr>
+            <w:pStyle w:val="Contents1"/>
+            <w:rPr/>
+          </w:pPr>
+          <w:hyperlink w:anchor="__RefHeading___Toc362_3696126145">
+            <w:r>
+              <w:rPr>
+                <w:rStyle w:val="IndexLink"/>
+              </w:rPr>
+              <w:t>VERSION handling</w:t>
+              <w:tab/>
+              <w:t>18</w:t>
+            </w:r>
+          </w:hyperlink>
+        </w:p>
+        <w:p>
+          <w:pPr>
+            <w:pStyle w:val="Contents2"/>
+            <w:rPr/>
+          </w:pPr>
+          <w:hyperlink w:anchor="__RefHeading___Toc475_82747535">
+            <w:r>
+              <w:rPr>
+                <w:rStyle w:val="IndexLink"/>
+              </w:rPr>
+              <w:t>Release Version</w:t>
+              <w:tab/>
+              <w:t>18</w:t>
+            </w:r>
+          </w:hyperlink>
+        </w:p>
+        <w:p>
+          <w:pPr>
+            <w:pStyle w:val="Contents2"/>
+            <w:rPr/>
+          </w:pPr>
+          <w:hyperlink w:anchor="__RefHeading___Toc477_82747535">
+            <w:r>
+              <w:rPr>
+                <w:rStyle w:val="IndexLink"/>
+              </w:rPr>
+              <w:t>File Format Version</w:t>
+              <w:tab/>
+              <w:t>18</w:t>
+            </w:r>
+          </w:hyperlink>
+        </w:p>
+        <w:p>
+          <w:pPr>
+            <w:pStyle w:val="Contents2"/>
+            <w:rPr/>
+          </w:pPr>
+          <w:hyperlink w:anchor="__RefHeading___Toc479_82747535">
+            <w:r>
+              <w:rPr>
+                <w:rStyle w:val="IndexLink"/>
+              </w:rPr>
+              <w:t>Segment Version</w:t>
+              <w:tab/>
+              <w:t>18</w:t>
+            </w:r>
+          </w:hyperlink>
+        </w:p>
+        <w:p>
+          <w:pPr>
+            <w:pStyle w:val="Contents2"/>
+            <w:rPr/>
+          </w:pPr>
+          <w:hyperlink w:anchor="__RefHeading___Toc481_82747535">
+            <w:r>
+              <w:rPr>
+                <w:rStyle w:val="IndexLink"/>
+              </w:rPr>
+              <w:t>Extensible Segment Format</w:t>
+              <w:tab/>
+              <w:t>19</w:t>
+            </w:r>
+          </w:hyperlink>
+        </w:p>
+        <w:p>
+          <w:pPr>
+            <w:pStyle w:val="Heading1"/>
+            <w:numPr>
+              <w:ilvl w:val="0"/>
+              <w:numId w:val="2"/>
+            </w:numPr>
+            <w:rPr/>
+          </w:pPr>
+          <w:bookmarkStart w:id="0" w:name="__RefHeading___Toc777_2817623836"/>
+          <w:bookmarkEnd w:id="0"/>
+          <w:r>
+            <w:rPr/>
+            <w:t>Introduction</w:t>
+          </w:r>
+          <w:r>
+            <w:rPr/>
+            <w:fldChar w:fldCharType="end"/>
+          </w:r>
+        </w:p>
+      </w:sdtContent>
+    </w:sdt>
     <w:p>
       <w:pPr>
         <w:pStyle w:val="TextBody"/>
@@ -919,18 +830,188 @@
         </w:rPr>
         <w:t>It is recommended that any non-trivial work occur in a sub-branch from ‘default’.   Once the new work is complete and stable, the sub-branch is merged back into ‘default’.  Merging from the ‘default’ branch should be done frequencely to keep the new code in sync, especially just before merging back to ‘default’</w:t>
       </w:r>
-    </w:p>
-    <w:p>
-      <w:pPr>
-        <w:pStyle w:val="Normal"/>
-        <w:rPr>
-          <w:rFonts w:ascii="Liberation Sans" w:hAnsi="Liberation Sans"/>
-        </w:rPr>
-      </w:pPr>
-      <w:r>
-        <w:rPr>
-          <w:rFonts w:ascii="Liberation Sans" w:hAnsi="Liberation Sans"/>
-        </w:rPr>
+      <w:r>
+        <w:rPr>
+          <w:rFonts w:ascii="Liberation Sans" w:hAnsi="Liberation Sans"/>
+        </w:rPr>
+        <w:t>r</w:t>
+      </w:r>
+    </w:p>
+    <w:p>
+      <w:pPr>
+        <w:pStyle w:val="Normal"/>
+        <w:rPr>
+          <w:rFonts w:ascii="Liberation Sans" w:hAnsi="Liberation Sans"/>
+        </w:rPr>
+      </w:pPr>
+      <w:r>
+        <w:rPr/>
+      </w:r>
+    </w:p>
+    <w:p>
+      <w:pPr>
+        <w:pStyle w:val="Normal"/>
+        <w:rPr>
+          <w:rFonts w:ascii="Liberation Sans" w:hAnsi="Liberation Sans"/>
+        </w:rPr>
+      </w:pPr>
+      <w:r>
+        <w:rPr>
+          <w:rFonts w:ascii="Liberation Sans" w:hAnsi="Liberation Sans"/>
+        </w:rPr>
+        <w:t xml:space="preserve">If you are using </w:t>
+      </w:r>
+      <w:r>
+        <w:rPr>
+          <w:rFonts w:ascii="Liberation Sans" w:hAnsi="Liberation Sans"/>
+          <w:b/>
+          <w:bCs/>
+        </w:rPr>
+        <w:t>thg</w:t>
+      </w:r>
+      <w:r>
+        <w:rPr>
+          <w:rFonts w:ascii="Liberation Sans" w:hAnsi="Liberation Sans"/>
+          <w:b w:val="false"/>
+          <w:bCs w:val="false"/>
+        </w:rPr>
+        <w:t xml:space="preserve"> (a graphical interface to hg) you can use the following to make a new branch.</w:t>
+      </w:r>
+    </w:p>
+    <w:p>
+      <w:pPr>
+        <w:pStyle w:val="Normal"/>
+        <w:rPr>
+          <w:rFonts w:ascii="Liberation Sans" w:hAnsi="Liberation Sans"/>
+        </w:rPr>
+      </w:pPr>
+      <w:r>
+        <w:rPr/>
+      </w:r>
+    </w:p>
+    <w:p>
+      <w:pPr>
+        <w:pStyle w:val="Normal"/>
+        <w:rPr>
+          <w:rFonts w:ascii="Liberation Sans" w:hAnsi="Liberation Sans"/>
+        </w:rPr>
+      </w:pPr>
+      <w:r>
+        <w:rPr>
+          <w:rFonts w:ascii="Liberation Sans" w:hAnsi="Liberation Sans"/>
+          <w:b w:val="false"/>
+          <w:bCs w:val="false"/>
+        </w:rPr>
+        <w:t xml:space="preserve">At the </w:t>
+      </w:r>
+      <w:r>
+        <w:rPr>
+          <w:rFonts w:ascii="Liberation Sans" w:hAnsi="Liberation Sans"/>
+          <w:b/>
+          <w:bCs/>
+        </w:rPr>
+        <w:t xml:space="preserve">tip </w:t>
+      </w:r>
+      <w:r>
+        <w:rPr>
+          <w:rFonts w:ascii="Liberation Sans" w:hAnsi="Liberation Sans"/>
+          <w:b w:val="false"/>
+          <w:bCs w:val="false"/>
+        </w:rPr>
+        <w:t xml:space="preserve">of the </w:t>
+      </w:r>
+      <w:r>
+        <w:rPr>
+          <w:rFonts w:ascii="Liberation Sans" w:hAnsi="Liberation Sans"/>
+          <w:b/>
+          <w:bCs/>
+        </w:rPr>
+        <w:t xml:space="preserve">default </w:t>
+      </w:r>
+      <w:r>
+        <w:rPr>
+          <w:rFonts w:ascii="Liberation Sans" w:hAnsi="Liberation Sans"/>
+          <w:b w:val="false"/>
+          <w:bCs w:val="false"/>
+        </w:rPr>
+        <w:t xml:space="preserve">branch, click </w:t>
+      </w:r>
+      <w:r>
+        <w:rPr>
+          <w:rFonts w:ascii="Liberation Sans" w:hAnsi="Liberation Sans"/>
+          <w:b/>
+          <w:bCs/>
+        </w:rPr>
+        <w:t>Branch: default:</w:t>
+      </w:r>
+    </w:p>
+    <w:p>
+      <w:pPr>
+        <w:pStyle w:val="Normal"/>
+        <w:rPr>
+          <w:rFonts w:ascii="Liberation Sans" w:hAnsi="Liberation Sans"/>
+        </w:rPr>
+      </w:pPr>
+      <w:r>
+        <w:rPr/>
+      </w:r>
+    </w:p>
+    <w:p>
+      <w:pPr>
+        <w:pStyle w:val="Normal"/>
+        <w:rPr>
+          <w:rFonts w:ascii="Liberation Sans" w:hAnsi="Liberation Sans"/>
+        </w:rPr>
+      </w:pPr>
+      <w:r>
+        <w:rPr>
+          <w:rFonts w:ascii="Liberation Sans" w:hAnsi="Liberation Sans"/>
+        </w:rPr>
+        <w:drawing>
+          <wp:anchor behindDoc="0" distT="0" distB="0" distL="0" distR="0" simplePos="0" locked="0" layoutInCell="0" allowOverlap="1" relativeHeight="2">
+            <wp:simplePos x="0" y="0"/>
+            <wp:positionH relativeFrom="column">
+              <wp:posOffset>32385</wp:posOffset>
+            </wp:positionH>
+            <wp:positionV relativeFrom="paragraph">
+              <wp:posOffset>635</wp:posOffset>
+            </wp:positionV>
+            <wp:extent cx="3181350" cy="1304925"/>
+            <wp:effectExtent l="0" t="0" r="0" b="0"/>
+            <wp:wrapSquare wrapText="largest"/>
+            <wp:docPr id="1" name="Image1" descr=""/>
+            <wp:cNvGraphicFramePr>
+              <a:graphicFrameLocks xmlns:a="http://schemas.openxmlformats.org/drawingml/2006/main" noChangeAspect="1"/>
+            </wp:cNvGraphicFramePr>
+            <a:graphic xmlns:a="http://schemas.openxmlformats.org/drawingml/2006/main">
+              <a:graphicData uri="http://schemas.openxmlformats.org/drawingml/2006/picture">
+                <pic:pic xmlns:pic="http://schemas.openxmlformats.org/drawingml/2006/picture">
+                  <pic:nvPicPr>
+                    <pic:cNvPr id="1" name="Image1" descr=""/>
+                    <pic:cNvPicPr>
+                      <a:picLocks noChangeAspect="1" noChangeArrowheads="1"/>
+                    </pic:cNvPicPr>
+                  </pic:nvPicPr>
+                  <pic:blipFill>
+                    <a:blip r:embed="rId3"/>
+                    <a:stretch>
+                      <a:fillRect/>
+                    </a:stretch>
+                  </pic:blipFill>
+                  <pic:spPr bwMode="auto">
+                    <a:xfrm>
+                      <a:off x="0" y="0"/>
+                      <a:ext cx="3181350" cy="1304925"/>
+                    </a:xfrm>
+                    <a:prstGeom prst="rect">
+                      <a:avLst/>
+                    </a:prstGeom>
+                  </pic:spPr>
+                </pic:pic>
+              </a:graphicData>
+            </a:graphic>
+          </wp:anchor>
+        </w:drawing>
       </w:r>
     </w:p>
     <w:p>
@@ -942,6 +1023,382 @@
         </w:numPr>
         <w:rPr/>
       </w:pPr>
+      <w:r>
+        <w:rPr/>
+      </w:r>
+    </w:p>
+    <w:p>
+      <w:pPr>
+        <w:pStyle w:val="Heading2"/>
+        <w:numPr>
+          <w:ilvl w:val="1"/>
+          <w:numId w:val="2"/>
+        </w:numPr>
+        <w:rPr/>
+      </w:pPr>
+      <w:r>
+        <w:rPr/>
+      </w:r>
+    </w:p>
+    <w:p>
+      <w:pPr>
+        <w:pStyle w:val="Heading2"/>
+        <w:numPr>
+          <w:ilvl w:val="1"/>
+          <w:numId w:val="2"/>
+        </w:numPr>
+        <w:rPr/>
+      </w:pPr>
+      <w:r>
+        <w:rPr/>
+      </w:r>
+    </w:p>
+    <w:p>
+      <w:pPr>
+        <w:pStyle w:val="Normal"/>
+        <w:numPr>
+          <w:ilvl w:val="0"/>
+          <w:numId w:val="0"/>
+        </w:numPr>
+        <w:rPr>
+          <w:rFonts w:ascii="Liberation Sans" w:hAnsi="Liberation Sans"/>
+        </w:rPr>
+      </w:pPr>
+      <w:r>
+        <w:rPr/>
+      </w:r>
+    </w:p>
+    <w:p>
+      <w:pPr>
+        <w:pStyle w:val="Normal"/>
+        <w:numPr>
+          <w:ilvl w:val="0"/>
+          <w:numId w:val="0"/>
+        </w:numPr>
+        <w:rPr>
+          <w:rFonts w:ascii="Liberation Sans" w:hAnsi="Liberation Sans"/>
+        </w:rPr>
+      </w:pPr>
+      <w:r>
+        <w:rPr>
+          <w:rFonts w:ascii="Liberation Sans" w:hAnsi="Liberation Sans"/>
+          <w:b w:val="false"/>
+          <w:bCs w:val="false"/>
+        </w:rPr>
+        <w:t>Then pick the name of your branch.  If you are fixing a bug, include the bug number.</w:t>
+      </w:r>
+    </w:p>
+    <w:p>
+      <w:pPr>
+        <w:pStyle w:val="Normal"/>
+        <w:numPr>
+          <w:ilvl w:val="0"/>
+          <w:numId w:val="0"/>
+        </w:numPr>
+        <w:rPr>
+          <w:rFonts w:ascii="Liberation Sans" w:hAnsi="Liberation Sans"/>
+        </w:rPr>
+      </w:pPr>
+      <w:r>
+        <w:rPr/>
+        <w:drawing>
+          <wp:anchor behindDoc="0" distT="0" distB="0" distL="0" distR="0" simplePos="0" locked="0" layoutInCell="0" allowOverlap="1" relativeHeight="3">
+            <wp:simplePos x="0" y="0"/>
+            <wp:positionH relativeFrom="column">
+              <wp:posOffset>13335</wp:posOffset>
+            </wp:positionH>
+            <wp:positionV relativeFrom="paragraph">
+              <wp:posOffset>635</wp:posOffset>
+            </wp:positionV>
+            <wp:extent cx="4953000" cy="1885950"/>
+            <wp:effectExtent l="0" t="0" r="0" b="0"/>
+            <wp:wrapSquare wrapText="largest"/>
+            <wp:docPr id="2" name="Image3" descr=""/>
+            <wp:cNvGraphicFramePr>
+              <a:graphicFrameLocks xmlns:a="http://schemas.openxmlformats.org/drawingml/2006/main" noChangeAspect="1"/>
+            </wp:cNvGraphicFramePr>
+            <a:graphic xmlns:a="http://schemas.openxmlformats.org/drawingml/2006/main">
+              <a:graphicData uri="http://schemas.openxmlformats.org/drawingml/2006/picture">
+                <pic:pic xmlns:pic="http://schemas.openxmlformats.org/drawingml/2006/picture">
+                  <pic:nvPicPr>
+                    <pic:cNvPr id="2" name="Image3" descr=""/>
+                    <pic:cNvPicPr>
+                      <a:picLocks noChangeAspect="1" noChangeArrowheads="1"/>
+                    </pic:cNvPicPr>
+                  </pic:nvPicPr>
+                  <pic:blipFill>
+                    <a:blip r:embed="rId4"/>
+                    <a:stretch>
+                      <a:fillRect/>
+                    </a:stretch>
+                  </pic:blipFill>
+                  <pic:spPr bwMode="auto">
+                    <a:xfrm>
+                      <a:off x="0" y="0"/>
+                      <a:ext cx="4953000" cy="1885950"/>
+                    </a:xfrm>
+                    <a:prstGeom prst="rect">
+                      <a:avLst/>
+                    </a:prstGeom>
+                  </pic:spPr>
+                </pic:pic>
+              </a:graphicData>
+            </a:graphic>
+          </wp:anchor>
+        </w:drawing>
+      </w:r>
+    </w:p>
+    <w:p>
+      <w:pPr>
+        <w:pStyle w:val="Normal"/>
+        <w:numPr>
+          <w:ilvl w:val="0"/>
+          <w:numId w:val="0"/>
+        </w:numPr>
+        <w:rPr>
+          <w:rFonts w:ascii="Liberation Sans" w:hAnsi="Liberation Sans"/>
+        </w:rPr>
+      </w:pPr>
+      <w:r>
+        <w:rPr/>
+      </w:r>
+    </w:p>
+    <w:p>
+      <w:pPr>
+        <w:pStyle w:val="Normal"/>
+        <w:numPr>
+          <w:ilvl w:val="0"/>
+          <w:numId w:val="0"/>
+        </w:numPr>
+        <w:rPr>
+          <w:rFonts w:ascii="Liberation Sans" w:hAnsi="Liberation Sans"/>
+        </w:rPr>
+      </w:pPr>
+      <w:r>
+        <w:rPr/>
+      </w:r>
+    </w:p>
+    <w:p>
+      <w:pPr>
+        <w:pStyle w:val="Normal"/>
+        <w:numPr>
+          <w:ilvl w:val="0"/>
+          <w:numId w:val="0"/>
+        </w:numPr>
+        <w:rPr>
+          <w:rFonts w:ascii="Liberation Sans" w:hAnsi="Liberation Sans"/>
+        </w:rPr>
+      </w:pPr>
+      <w:r>
+        <w:rPr/>
+      </w:r>
+    </w:p>
+    <w:p>
+      <w:pPr>
+        <w:pStyle w:val="Heading2"/>
+        <w:numPr>
+          <w:ilvl w:val="1"/>
+          <w:numId w:val="2"/>
+        </w:numPr>
+        <w:rPr/>
+      </w:pPr>
+      <w:r>
+        <w:rPr/>
+      </w:r>
+    </w:p>
+    <w:p>
+      <w:pPr>
+        <w:pStyle w:val="Heading2"/>
+        <w:numPr>
+          <w:ilvl w:val="1"/>
+          <w:numId w:val="2"/>
+        </w:numPr>
+        <w:rPr/>
+      </w:pPr>
+      <w:r>
+        <w:rPr/>
+      </w:r>
+    </w:p>
+    <w:p>
+      <w:pPr>
+        <w:pStyle w:val="Heading2"/>
+        <w:numPr>
+          <w:ilvl w:val="1"/>
+          <w:numId w:val="2"/>
+        </w:numPr>
+        <w:rPr/>
+      </w:pPr>
+      <w:r>
+        <w:rPr/>
+      </w:r>
+    </w:p>
+    <w:p>
+      <w:pPr>
+        <w:pStyle w:val="Normal"/>
+        <w:numPr>
+          <w:ilvl w:val="0"/>
+          <w:numId w:val="1"/>
+        </w:numPr>
+        <w:rPr>
+          <w:rFonts w:ascii="Liberation Sans" w:hAnsi="Liberation Sans"/>
+        </w:rPr>
+      </w:pPr>
+      <w:r>
+        <w:rPr/>
+      </w:r>
+    </w:p>
+    <w:p>
+      <w:pPr>
+        <w:pStyle w:val="Normal"/>
+        <w:numPr>
+          <w:ilvl w:val="0"/>
+          <w:numId w:val="1"/>
+        </w:numPr>
+        <w:rPr>
+          <w:rFonts w:ascii="Liberation Sans" w:hAnsi="Liberation Sans"/>
+        </w:rPr>
+      </w:pPr>
+      <w:r>
+        <w:rPr>
+          <w:rFonts w:ascii="Liberation Sans" w:hAnsi="Liberation Sans"/>
+          <w:b w:val="false"/>
+          <w:bCs w:val="false"/>
+        </w:rPr>
+        <w:t>Make you</w:t>
+      </w:r>
+      <w:r>
+        <w:rPr>
+          <w:rFonts w:ascii="Liberation Sans" w:hAnsi="Liberation Sans"/>
+          <w:b w:val="false"/>
+          <w:bCs w:val="false"/>
+        </w:rPr>
+        <w:t>r</w:t>
+      </w:r>
+      <w:r>
+        <w:rPr>
+          <w:rFonts w:ascii="Liberation Sans" w:hAnsi="Liberation Sans"/>
+          <w:b w:val="false"/>
+          <w:bCs w:val="false"/>
+        </w:rPr>
+        <w:t xml:space="preserve"> changes and </w:t>
+      </w:r>
+      <w:r>
+        <w:rPr>
+          <w:rFonts w:ascii="Liberation Sans" w:hAnsi="Liberation Sans"/>
+          <w:b/>
+          <w:bCs/>
+        </w:rPr>
+        <w:t>Commit</w:t>
+      </w:r>
+      <w:r>
+        <w:rPr>
+          <w:rFonts w:ascii="Liberation Sans" w:hAnsi="Liberation Sans"/>
+          <w:b w:val="false"/>
+          <w:bCs w:val="false"/>
+        </w:rPr>
+        <w:t xml:space="preserve"> them.  This will create the new branch.  </w:t>
+      </w:r>
+      <w:r>
+        <w:rPr>
+          <w:rFonts w:ascii="Liberation Sans" w:hAnsi="Liberation Sans"/>
+          <w:b w:val="false"/>
+          <w:bCs w:val="false"/>
+        </w:rPr>
+        <w:t>Furthjer changes are made in the new branch.</w:t>
+      </w:r>
+    </w:p>
+    <w:p>
+      <w:pPr>
+        <w:pStyle w:val="Normal"/>
+        <w:rPr>
+          <w:rFonts w:ascii="Liberation Sans" w:hAnsi="Liberation Sans"/>
+        </w:rPr>
+      </w:pPr>
+      <w:r>
+        <w:rPr/>
+      </w:r>
+    </w:p>
+    <w:p>
+      <w:pPr>
+        <w:pStyle w:val="Normal"/>
+        <w:rPr>
+          <w:rFonts w:ascii="Liberation Sans" w:hAnsi="Liberation Sans"/>
+        </w:rPr>
+      </w:pPr>
+      <w:r>
+        <w:rPr>
+          <w:rFonts w:ascii="Liberation Sans" w:hAnsi="Liberation Sans"/>
+          <w:b w:val="false"/>
+          <w:bCs w:val="false"/>
+        </w:rPr>
+        <w:t xml:space="preserve">When done,  </w:t>
+      </w:r>
+      <w:r>
+        <w:rPr>
+          <w:rFonts w:ascii="Liberation Sans" w:hAnsi="Liberation Sans"/>
+          <w:b/>
+          <w:bCs/>
+        </w:rPr>
+        <w:t>Close</w:t>
+      </w:r>
+      <w:r>
+        <w:rPr>
+          <w:rFonts w:ascii="Liberation Sans" w:hAnsi="Liberation Sans"/>
+          <w:b w:val="false"/>
+          <w:bCs w:val="false"/>
+        </w:rPr>
+        <w:t xml:space="preserve"> your branch, switch to Defaul</w:t>
+      </w:r>
+      <w:r>
+        <w:rPr>
+          <w:rFonts w:ascii="Liberation Sans" w:hAnsi="Liberation Sans"/>
+          <w:b w:val="false"/>
+          <w:bCs w:val="false"/>
+        </w:rPr>
+        <w:t>t</w:t>
+      </w:r>
+      <w:r>
+        <w:rPr>
+          <w:rFonts w:ascii="Liberation Sans" w:hAnsi="Liberation Sans"/>
+          <w:b w:val="false"/>
+          <w:bCs w:val="false"/>
+        </w:rPr>
+        <w:t xml:space="preserve"> and </w:t>
+      </w:r>
+      <w:r>
+        <w:rPr>
+          <w:rFonts w:ascii="Liberation Sans" w:hAnsi="Liberation Sans"/>
+          <w:b/>
+          <w:bCs/>
+        </w:rPr>
+        <w:t>Merge</w:t>
+      </w:r>
+      <w:r>
+        <w:rPr>
+          <w:rFonts w:ascii="Liberation Sans" w:hAnsi="Liberation Sans"/>
+          <w:b w:val="false"/>
+          <w:bCs w:val="false"/>
+        </w:rPr>
+        <w:t xml:space="preserve"> from the new branch.  </w:t>
+      </w:r>
+      <w:r>
+        <w:rPr>
+          <w:rFonts w:ascii="Liberation Sans" w:hAnsi="Liberation Sans"/>
+          <w:b w:val="false"/>
+          <w:bCs w:val="false"/>
+        </w:rPr>
+        <w:t>Closing first avoids dangling heads.</w:t>
+      </w:r>
+    </w:p>
+    <w:p>
+      <w:pPr>
+        <w:pStyle w:val="Heading2"/>
+        <w:numPr>
+          <w:ilvl w:val="1"/>
+          <w:numId w:val="2"/>
+        </w:numPr>
+        <w:rPr/>
+      </w:pPr>
       <w:bookmarkStart w:id="3" w:name="__RefHeading___Toc783_2817623836"/>
       <w:bookmarkEnd w:id="3"/>
       <w:r>
@@ -1044,7 +1501,7 @@
         </w:rPr>
         <w:t xml:space="preserve">All platforms build and upload their beta install packages as described in </w:t>
       </w:r>
-      <w:hyperlink r:id="rId3">
+      <w:hyperlink r:id="rId5">
         <w:r>
           <w:rPr>
             <w:rStyle w:val="InternetLink"/>
@@ -2274,8 +2731,8 @@
         </w:numPr>
         <w:suppressAutoHyphens w:val="true"/>
         <w:bidi w:val="0"/>
+        <w:ind w:left="0" w:hanging="0"/>
         <w:jc w:val="left"/>
-        <w:outlineLvl w:val="0"/>
         <w:rPr/>
       </w:pPr>
       <w:r>
@@ -2784,7 +3241,7 @@
         </w:rPr>
         <w:t xml:space="preserve">Code may be formatted (pretty-printed) using the </w:t>
       </w:r>
-      <w:hyperlink r:id="rId4">
+      <w:hyperlink r:id="rId6">
         <w:r>
           <w:rPr>
             <w:rStyle w:val="InternetLink"/>
@@ -2867,8 +3324,8 @@
           <w:numId w:val="0"/>
         </w:numPr>
         <w:suppressAutoHyphens w:val="true"/>
+        <w:ind w:left="0" w:hanging="0"/>
         <w:jc w:val="left"/>
-        <w:outlineLvl w:val="0"/>
         <w:rPr/>
       </w:pPr>
       <w:r>
@@ -3625,8 +4082,8 @@
           <w:numId w:val="0"/>
         </w:numPr>
         <w:suppressAutoHyphens w:val="true"/>
+        <w:ind w:left="0" w:hanging="0"/>
         <w:jc w:val="left"/>
-        <w:outlineLvl w:val="1"/>
         <w:rPr/>
       </w:pPr>
       <w:r>
@@ -3662,8 +4119,8 @@
           <w:numId w:val="0"/>
         </w:numPr>
         <w:suppressAutoHyphens w:val="true"/>
+        <w:ind w:left="0" w:hanging="0"/>
         <w:jc w:val="left"/>
-        <w:outlineLvl w:val="1"/>
         <w:rPr/>
       </w:pPr>
       <w:r>
@@ -3727,15 +4184,7 @@
           <w:b/>
           <w:bCs/>
         </w:rPr>
-        <w:t xml:space="preserve">Source </w:t>
-      </w:r>
-      <w:r>
-        <w:rPr>
-          <w:rFonts w:ascii="Liberation Sans" w:hAnsi="Liberation Sans"/>
-          <w:b/>
-          <w:bCs/>
-        </w:rPr>
-        <w:t>Control / Releases</w:t>
+        <w:t>Source Control / Releases</w:t>
       </w:r>
     </w:p>
     <w:p>
@@ -3766,19 +4215,7 @@
         <w:rPr>
           <w:rFonts w:ascii="Liberation Sans" w:hAnsi="Liberation Sans"/>
         </w:rPr>
-        <w:t>The format for .xtc, .xtr, .</w:t>
-      </w:r>
-      <w:r>
-        <w:rPr>
-          <w:rFonts w:ascii="Liberation Sans" w:hAnsi="Liberation Sans"/>
-        </w:rPr>
-        <w:t>xtp</w:t>
-      </w:r>
-      <w:r>
-        <w:rPr>
-          <w:rFonts w:ascii="Liberation Sans" w:hAnsi="Liberation Sans"/>
-        </w:rPr>
-        <w:t xml:space="preserve"> and xtrkcad.cus files is described on the </w:t>
+        <w:t xml:space="preserve">The format for .xtc, .xtr, .xtp and xtrkcad.cus files is described on the </w:t>
       </w:r>
       <w:r>
         <w:rPr>
@@ -3794,7 +4231,7 @@
         </w:rPr>
         <w:t xml:space="preserve">page of the XtrkCad wikka page </w:t>
       </w:r>
-      <w:hyperlink r:id="rId5">
+      <w:hyperlink r:id="rId7">
         <w:r>
           <w:rPr>
             <w:rStyle w:val="VisitedInternetLink"/>
@@ -3895,6 +4332,10 @@
       <w:r>
         <w:rPr>
           <w:rFonts w:ascii="Liberation Sans" w:hAnsi="Liberation Sans"/>
+          <w:b w:val="false"/>
+          <w:bCs w:val="false"/>
+          <w:i w:val="false"/>
+          <w:iCs w:val="false"/>
         </w:rPr>
       </w:r>
     </w:p>
@@ -3914,27 +4355,7 @@
           <w:i w:val="false"/>
           <w:iCs w:val="false"/>
         </w:rPr>
-        <w:t>XTRKCAD_PARAMVERSION is the current version of the File Formats.  If the VERSION line in the .xtc or .xtr is greater then this value then file can only be opened by an updated version of X</w:t>
-      </w:r>
-      <w:r>
-        <w:rPr>
-          <w:rFonts w:ascii="Liberation Sans" w:hAnsi="Liberation Sans"/>
-          <w:b w:val="false"/>
-          <w:bCs w:val="false"/>
-          <w:i w:val="false"/>
-          <w:iCs w:val="false"/>
-        </w:rPr>
-        <w:t>T</w:t>
-      </w:r>
-      <w:r>
-        <w:rPr>
-          <w:rFonts w:ascii="Liberation Sans" w:hAnsi="Liberation Sans"/>
-          <w:b w:val="false"/>
-          <w:bCs w:val="false"/>
-          <w:i w:val="false"/>
-          <w:iCs w:val="false"/>
-        </w:rPr>
-        <w:t>rkCad.</w:t>
+        <w:t>XTRKCAD_PARAMVERSION is the current version of the File Formats.  If the VERSION line in the .xtc or .xtr is greater then this value then file can only be opened by an updated version of XTrkCad.</w:t>
       </w:r>
     </w:p>
     <w:p>
@@ -3953,47 +4374,7 @@
           <w:i w:val="false"/>
           <w:iCs w:val="false"/>
         </w:rPr>
-        <w:t>XTRKCAD_PARAMVERSION</w:t>
-      </w:r>
-      <w:r>
-        <w:rPr>
-          <w:rFonts w:ascii="Liberation Sans" w:hAnsi="Liberation Sans"/>
-          <w:b w:val="false"/>
-          <w:bCs w:val="false"/>
-          <w:i w:val="false"/>
-          <w:iCs w:val="false"/>
-        </w:rPr>
-        <w:t xml:space="preserve">VERSION is the </w:t>
-      </w:r>
-      <w:r>
-        <w:rPr>
-          <w:rFonts w:ascii="Liberation Sans" w:hAnsi="Liberation Sans"/>
-          <w:b w:val="false"/>
-          <w:bCs w:val="false"/>
-          <w:i w:val="false"/>
-          <w:iCs w:val="false"/>
-        </w:rPr>
-        <w:t xml:space="preserve">first </w:t>
-      </w:r>
-      <w:r>
-        <w:rPr>
-          <w:rFonts w:ascii="Liberation Sans" w:hAnsi="Liberation Sans"/>
-          <w:b w:val="false"/>
-          <w:bCs w:val="false"/>
-          <w:i w:val="false"/>
-          <w:iCs w:val="false"/>
-        </w:rPr>
-        <w:t xml:space="preserve">version </w:t>
-      </w:r>
-      <w:r>
-        <w:rPr>
-          <w:rFonts w:ascii="Liberation Sans" w:hAnsi="Liberation Sans"/>
-          <w:b w:val="false"/>
-          <w:bCs w:val="false"/>
-          <w:i w:val="false"/>
-          <w:iCs w:val="false"/>
-        </w:rPr>
-        <w:t>of XTrkCad that supports the specified File Format.  This allows us to tell the user the minimum version they need to upgrade to.</w:t>
+        <w:t>XTRKCAD_PARAMVERSIONVERSION is the first version of XTrkCad that supports the specified File Format.  This allows us to tell the user the minimum version they need to upgrade to.</w:t>
       </w:r>
     </w:p>
     <w:p>
@@ -4012,37 +4393,7 @@
           <w:i w:val="false"/>
           <w:iCs w:val="false"/>
         </w:rPr>
-        <w:t>XTRKCAD_</w:t>
-      </w:r>
-      <w:r>
-        <w:rPr>
-          <w:rFonts w:ascii="Liberation Sans" w:hAnsi="Liberation Sans"/>
-          <w:b w:val="false"/>
-          <w:bCs w:val="false"/>
-          <w:i w:val="false"/>
-          <w:iCs w:val="false"/>
-        </w:rPr>
-        <w:t>MIN_</w:t>
-      </w:r>
-      <w:r>
-        <w:rPr>
-          <w:rFonts w:ascii="Liberation Sans" w:hAnsi="Liberation Sans"/>
-          <w:b w:val="false"/>
-          <w:bCs w:val="false"/>
-          <w:i w:val="false"/>
-          <w:iCs w:val="false"/>
-        </w:rPr>
-        <w:t xml:space="preserve">PARAMVERSION </w:t>
-      </w:r>
-      <w:r>
-        <w:rPr>
-          <w:rFonts w:ascii="Liberation Sans" w:hAnsi="Liberation Sans"/>
-          <w:b w:val="false"/>
-          <w:bCs w:val="false"/>
-          <w:i w:val="false"/>
-          <w:iCs w:val="false"/>
-        </w:rPr>
-        <w:t>is the first File Format version that that we support.  Its value (1) inidicates that we support all versions.</w:t>
+        <w:t>XTRKCAD_MIN_PARAMVERSION is the first File Format version that that we support.  Its value (1) inidicates that we support all versions.</w:t>
       </w:r>
     </w:p>
     <w:p>
@@ -4061,47 +4412,7 @@
           <w:i w:val="false"/>
           <w:iCs w:val="false"/>
         </w:rPr>
-        <w:t xml:space="preserve">Incrementing </w:t>
-      </w:r>
-      <w:r>
-        <w:rPr>
-          <w:rFonts w:ascii="Liberation Sans" w:hAnsi="Liberation Sans"/>
-          <w:b w:val="false"/>
-          <w:bCs w:val="false"/>
-          <w:i w:val="false"/>
-          <w:iCs w:val="false"/>
-        </w:rPr>
-        <w:t xml:space="preserve">XTRKCAD_PARAMVERSION </w:t>
-      </w:r>
-      <w:r>
-        <w:rPr>
-          <w:rFonts w:ascii="Liberation Sans" w:hAnsi="Liberation Sans"/>
-          <w:b w:val="false"/>
-          <w:bCs w:val="false"/>
-          <w:i w:val="false"/>
-          <w:iCs w:val="false"/>
-        </w:rPr>
-        <w:t xml:space="preserve">is a major change as it requires users to upgrade  when they load a new .xtc file.  It would be required if we add an new object or make major changes to existing objects.  We have mechanisms </w:t>
-      </w:r>
-      <w:r>
-        <w:rPr>
-          <w:rFonts w:ascii="Liberation Sans" w:hAnsi="Liberation Sans"/>
-          <w:b w:val="false"/>
-          <w:bCs w:val="false"/>
-          <w:i w:val="false"/>
-          <w:iCs w:val="false"/>
-        </w:rPr>
-        <w:t xml:space="preserve">(below) </w:t>
-      </w:r>
-      <w:r>
-        <w:rPr>
-          <w:rFonts w:ascii="Liberation Sans" w:hAnsi="Liberation Sans"/>
-          <w:b w:val="false"/>
-          <w:bCs w:val="false"/>
-          <w:i w:val="false"/>
-          <w:iCs w:val="false"/>
-        </w:rPr>
-        <w:t>to avoid this.</w:t>
+        <w:t>Incrementing XTRKCAD_PARAMVERSION is a major change as it requires users to upgrade  when they load a new .xtc file.  It would be required if we add an new object or make major changes to existing objects.  We have mechanisms (below) to avoid this.</w:t>
       </w:r>
     </w:p>
     <w:p>
@@ -4169,19 +4480,7 @@
           <w:rFonts w:ascii="Liberation Mono" w:hAnsi="Liberation Mono"/>
         </w:rPr>
         <w:tab/>
-        <w:t>M</w:t>
-      </w:r>
-      <w:r>
-        <w:rPr>
-          <w:rFonts w:ascii="Liberation Mono" w:hAnsi="Liberation Mono"/>
-        </w:rPr>
-        <w:t>1</w:t>
-      </w:r>
-      <w:r>
-        <w:rPr>
-          <w:rFonts w:ascii="Liberation Mono" w:hAnsi="Liberation Mono"/>
-        </w:rPr>
-        <w:t xml:space="preserve"> 0 0.500000 20.375000 15.500000 46.625000 20.250000</w:t>
+        <w:t>M1 0 0.500000 20.375000 15.500000 46.625000 20.250000</w:t>
       </w:r>
     </w:p>
     <w:p>
@@ -4214,107 +4513,7 @@
           <w:i w:val="false"/>
           <w:iCs w:val="false"/>
         </w:rPr>
-        <w:t xml:space="preserve">This defines 2 segments (type </w:t>
-      </w:r>
-      <w:r>
-        <w:rPr>
-          <w:rFonts w:ascii="Liberation Sans" w:hAnsi="Liberation Sans"/>
-          <w:b w:val="false"/>
-          <w:bCs w:val="false"/>
-          <w:i w:val="false"/>
-          <w:iCs w:val="false"/>
-        </w:rPr>
-        <w:t>M</w:t>
-      </w:r>
-      <w:r>
-        <w:rPr>
-          <w:rFonts w:ascii="Liberation Sans" w:hAnsi="Liberation Sans"/>
-          <w:b w:val="false"/>
-          <w:bCs w:val="false"/>
-          <w:i w:val="false"/>
-          <w:iCs w:val="false"/>
-        </w:rPr>
-        <w:t xml:space="preserve"> – </w:t>
-      </w:r>
-      <w:r>
-        <w:rPr>
-          <w:rFonts w:ascii="Liberation Sans" w:hAnsi="Liberation Sans"/>
-          <w:b w:val="false"/>
-          <w:bCs w:val="false"/>
-          <w:i w:val="false"/>
-          <w:iCs w:val="false"/>
-        </w:rPr>
-        <w:t>Dimension Line</w:t>
-      </w:r>
-      <w:r>
-        <w:rPr>
-          <w:rFonts w:ascii="Liberation Sans" w:hAnsi="Liberation Sans"/>
-          <w:b w:val="false"/>
-          <w:bCs w:val="false"/>
-          <w:i w:val="false"/>
-          <w:iCs w:val="false"/>
-        </w:rPr>
-        <w:t xml:space="preserve">) with two Segment Versions </w:t>
-      </w:r>
-      <w:r>
-        <w:rPr>
-          <w:rFonts w:ascii="Liberation Sans" w:hAnsi="Liberation Sans"/>
-          <w:b w:val="false"/>
-          <w:bCs w:val="false"/>
-          <w:i w:val="false"/>
-          <w:iCs w:val="false"/>
-        </w:rPr>
-        <w:t>(1</w:t>
-      </w:r>
-      <w:r>
-        <w:rPr>
-          <w:rFonts w:ascii="Liberation Sans" w:hAnsi="Liberation Sans"/>
-          <w:b w:val="false"/>
-          <w:bCs w:val="false"/>
-          <w:i w:val="false"/>
-          <w:iCs w:val="false"/>
-        </w:rPr>
-        <w:t xml:space="preserve"> and </w:t>
-      </w:r>
-      <w:r>
-        <w:rPr>
-          <w:rFonts w:ascii="Liberation Sans" w:hAnsi="Liberation Sans"/>
-          <w:b w:val="false"/>
-          <w:bCs w:val="false"/>
-          <w:i w:val="false"/>
-          <w:iCs w:val="false"/>
-        </w:rPr>
-        <w:t>3</w:t>
-      </w:r>
-      <w:r>
-        <w:rPr>
-          <w:rFonts w:ascii="Liberation Sans" w:hAnsi="Liberation Sans"/>
-          <w:b w:val="false"/>
-          <w:bCs w:val="false"/>
-          <w:i w:val="false"/>
-          <w:iCs w:val="false"/>
-        </w:rPr>
-        <w:t xml:space="preserve">). </w:t>
-      </w:r>
-      <w:r>
-        <w:rPr>
-          <w:rFonts w:ascii="Liberation Sans" w:hAnsi="Liberation Sans"/>
-          <w:b w:val="false"/>
-          <w:bCs w:val="false"/>
-          <w:i w:val="false"/>
-          <w:iCs w:val="false"/>
-        </w:rPr>
-        <w:t xml:space="preserve">The difference is the first segment is missing elevation values (0) following the </w:t>
-      </w:r>
-      <w:r>
-        <w:rPr>
-          <w:rFonts w:ascii="Liberation Sans" w:hAnsi="Liberation Sans"/>
-          <w:b w:val="false"/>
-          <w:bCs w:val="false"/>
-          <w:i w:val="false"/>
-          <w:iCs w:val="false"/>
-        </w:rPr>
-        <w:t>Co-ordinates and the flag in the last position.</w:t>
+        <w:t>This defines 2 segments (type M – Dimension Line) with two Segment Versions (1 and 3). The difference is the first segment is missing elevation values (0) following the Co-ordinates and the flag in the last position.</w:t>
       </w:r>
     </w:p>
     <w:p>
@@ -4333,97 +4532,7 @@
           <w:i w:val="false"/>
           <w:iCs w:val="false"/>
         </w:rPr>
-        <w:t>ReadSeg</w:t>
-      </w:r>
-      <w:r>
-        <w:rPr>
-          <w:rFonts w:ascii="Liberation Sans" w:hAnsi="Liberation Sans"/>
-          <w:b w:val="false"/>
-          <w:bCs w:val="false"/>
-          <w:i w:val="false"/>
-          <w:iCs w:val="false"/>
-        </w:rPr>
-        <w:t>s</w:t>
-      </w:r>
-      <w:r>
-        <w:rPr>
-          <w:rFonts w:ascii="Liberation Sans" w:hAnsi="Liberation Sans"/>
-          <w:b w:val="false"/>
-          <w:bCs w:val="false"/>
-          <w:i w:val="false"/>
-          <w:iCs w:val="false"/>
-        </w:rPr>
-        <w:t xml:space="preserve">() will read </w:t>
-      </w:r>
-      <w:r>
-        <w:rPr>
-          <w:rFonts w:ascii="Liberation Sans" w:hAnsi="Liberation Sans"/>
-          <w:b w:val="false"/>
-          <w:bCs w:val="false"/>
-          <w:i w:val="false"/>
-          <w:iCs w:val="false"/>
-        </w:rPr>
-        <w:t>6</w:t>
-      </w:r>
-      <w:r>
-        <w:rPr>
-          <w:rFonts w:ascii="Liberation Sans" w:hAnsi="Liberation Sans"/>
-          <w:b w:val="false"/>
-          <w:bCs w:val="false"/>
-          <w:i w:val="false"/>
-          <w:iCs w:val="false"/>
-        </w:rPr>
-        <w:t xml:space="preserve"> or 9 </w:t>
-      </w:r>
-      <w:r>
-        <w:rPr>
-          <w:rFonts w:ascii="Liberation Sans" w:hAnsi="Liberation Sans"/>
-          <w:b w:val="false"/>
-          <w:bCs w:val="false"/>
-          <w:i w:val="false"/>
-          <w:iCs w:val="false"/>
-        </w:rPr>
-        <w:t xml:space="preserve">values based on the Segment Version.  For version </w:t>
-      </w:r>
-      <w:r>
-        <w:rPr>
-          <w:rFonts w:ascii="Liberation Sans" w:hAnsi="Liberation Sans"/>
-          <w:b w:val="false"/>
-          <w:bCs w:val="false"/>
-          <w:i w:val="false"/>
-          <w:iCs w:val="false"/>
-        </w:rPr>
-        <w:t>1</w:t>
-      </w:r>
-      <w:r>
-        <w:rPr>
-          <w:rFonts w:ascii="Liberation Sans" w:hAnsi="Liberation Sans"/>
-          <w:b w:val="false"/>
-          <w:bCs w:val="false"/>
-          <w:i w:val="false"/>
-          <w:iCs w:val="false"/>
-        </w:rPr>
-        <w:t xml:space="preserve">, default values will be used for the </w:t>
-      </w:r>
-      <w:r>
-        <w:rPr>
-          <w:rFonts w:ascii="Liberation Sans" w:hAnsi="Liberation Sans"/>
-          <w:b w:val="false"/>
-          <w:bCs w:val="false"/>
-          <w:i w:val="false"/>
-          <w:iCs w:val="false"/>
-        </w:rPr>
-        <w:t xml:space="preserve">elevations </w:t>
-      </w:r>
-      <w:r>
-        <w:rPr>
-          <w:rFonts w:ascii="Liberation Sans" w:hAnsi="Liberation Sans"/>
-          <w:b w:val="false"/>
-          <w:bCs w:val="false"/>
-          <w:i w:val="false"/>
-          <w:iCs w:val="false"/>
-        </w:rPr>
-        <w:t>and flag.</w:t>
+        <w:t>ReadSegs() will read 6 or 9 values based on the Segment Version.  For version 1, default values will be used for the elevations and flag.</w:t>
       </w:r>
     </w:p>
     <w:p>
@@ -4442,17 +4551,7 @@
           <w:i w:val="false"/>
           <w:iCs w:val="false"/>
         </w:rPr>
-        <w:t xml:space="preserve">The code to process this looks like </w:t>
-      </w:r>
-      <w:r>
-        <w:rPr>
-          <w:rFonts w:ascii="Liberation Sans" w:hAnsi="Liberation Sans"/>
-          <w:b w:val="false"/>
-          <w:bCs w:val="false"/>
-          <w:i w:val="false"/>
-          <w:iCs w:val="false"/>
-        </w:rPr>
-        <w:t>(hasElev is a flag which is true if the Segment Version is &gt;= 3)</w:t>
+        <w:t>The code to process this looks like (hasElev is a flag which is true if the Segment Version is &gt;= 3)</w:t>
       </w:r>
     </w:p>
     <w:p>
@@ -4466,11 +4565,6 @@
           <w:rFonts w:ascii="Liberation Mono" w:hAnsi="Liberation Mono"/>
         </w:rPr>
         <w:tab/>
-      </w:r>
-      <w:r>
-        <w:rPr>
-          <w:rFonts w:ascii="Liberation Mono" w:hAnsi="Liberation Mono"/>
-        </w:rPr>
         <w:t>if ( !GetArgs( cp, hasElev?"lwpfpfl":"lwpYpYZ",</w:t>
       </w:r>
     </w:p>
@@ -4604,67 +4698,7 @@
           <w:i w:val="false"/>
           <w:iCs w:val="false"/>
         </w:rPr>
-        <w:t xml:space="preserve">’) </w:t>
-      </w:r>
-      <w:r>
-        <w:rPr>
-          <w:rFonts w:ascii="Liberation Sans" w:hAnsi="Liberation Sans"/>
-          <w:b w:val="false"/>
-          <w:bCs w:val="false"/>
-          <w:i w:val="false"/>
-          <w:iCs w:val="false"/>
-        </w:rPr>
-        <w:t xml:space="preserve">format codes </w:t>
-      </w:r>
-      <w:r>
-        <w:rPr>
-          <w:rFonts w:ascii="Liberation Sans" w:hAnsi="Liberation Sans"/>
-          <w:b w:val="false"/>
-          <w:bCs w:val="false"/>
-          <w:i w:val="false"/>
-          <w:iCs w:val="false"/>
-        </w:rPr>
-        <w:t xml:space="preserve">specify that no value is read from the </w:t>
-      </w:r>
-      <w:r>
-        <w:rPr>
-          <w:rFonts w:ascii="Liberation Sans" w:hAnsi="Liberation Sans"/>
-          <w:b w:val="false"/>
-          <w:bCs w:val="false"/>
-          <w:i w:val="false"/>
-          <w:iCs w:val="false"/>
-        </w:rPr>
-        <w:t xml:space="preserve">input </w:t>
-      </w:r>
-      <w:r>
-        <w:rPr>
-          <w:rFonts w:ascii="Liberation Sans" w:hAnsi="Liberation Sans"/>
-          <w:b w:val="false"/>
-          <w:bCs w:val="false"/>
-          <w:i w:val="false"/>
-          <w:iCs w:val="false"/>
-        </w:rPr>
-        <w:t>string, but the corresponding arguments are set to 0.  (See GetArgs() definition in fileio.</w:t>
-      </w:r>
-      <w:r>
-        <w:rPr>
-          <w:rFonts w:ascii="Liberation Sans" w:hAnsi="Liberation Sans"/>
-          <w:b w:val="false"/>
-          <w:bCs w:val="false"/>
-          <w:i w:val="false"/>
-          <w:iCs w:val="false"/>
-        </w:rPr>
-        <w:t>c</w:t>
-      </w:r>
-      <w:r>
-        <w:rPr>
-          <w:rFonts w:ascii="Liberation Sans" w:hAnsi="Liberation Sans"/>
-          <w:b w:val="false"/>
-          <w:bCs w:val="false"/>
-          <w:i w:val="false"/>
-          <w:iCs w:val="false"/>
-        </w:rPr>
-        <w:t>)</w:t>
+        <w:t>’) format codes specify that no value is read from the input string, but the corresponding arguments are set to 0.  (See GetArgs() definition in fileio.c)</w:t>
       </w:r>
     </w:p>
     <w:p>
@@ -4683,77 +4717,7 @@
           <w:i w:val="false"/>
           <w:iCs w:val="false"/>
         </w:rPr>
-        <w:t>If an old version of X</w:t>
-      </w:r>
-      <w:r>
-        <w:rPr>
-          <w:rFonts w:ascii="Liberation Sans" w:hAnsi="Liberation Sans"/>
-          <w:b w:val="false"/>
-          <w:bCs w:val="false"/>
-          <w:i w:val="false"/>
-          <w:iCs w:val="false"/>
-        </w:rPr>
-        <w:t>T</w:t>
-      </w:r>
-      <w:r>
-        <w:rPr>
-          <w:rFonts w:ascii="Liberation Sans" w:hAnsi="Liberation Sans"/>
-          <w:b w:val="false"/>
-          <w:bCs w:val="false"/>
-          <w:i w:val="false"/>
-          <w:iCs w:val="false"/>
-        </w:rPr>
-        <w:t>rkCad reads a new file with segment version it doesn’t understand an Input</w:t>
-      </w:r>
-      <w:r>
-        <w:rPr>
-          <w:rFonts w:ascii="Liberation Sans" w:hAnsi="Liberation Sans"/>
-          <w:b w:val="false"/>
-          <w:bCs w:val="false"/>
-          <w:i w:val="false"/>
-          <w:iCs w:val="false"/>
-        </w:rPr>
-        <w:t>Error</w:t>
-      </w:r>
-      <w:r>
-        <w:rPr>
-          <w:rFonts w:ascii="Liberation Sans" w:hAnsi="Liberation Sans"/>
-          <w:b w:val="false"/>
-          <w:bCs w:val="false"/>
-          <w:i w:val="false"/>
-          <w:iCs w:val="false"/>
-        </w:rPr>
-        <w:t xml:space="preserve"> will be ra</w:t>
-      </w:r>
-      <w:r>
-        <w:rPr>
-          <w:rFonts w:ascii="Liberation Sans" w:hAnsi="Liberation Sans"/>
-          <w:b w:val="false"/>
-          <w:bCs w:val="false"/>
-          <w:i w:val="false"/>
-          <w:iCs w:val="false"/>
-        </w:rPr>
-        <w:t>is</w:t>
-      </w:r>
-      <w:r>
-        <w:rPr>
-          <w:rFonts w:ascii="Liberation Sans" w:hAnsi="Liberation Sans"/>
-          <w:b w:val="false"/>
-          <w:bCs w:val="false"/>
-          <w:i w:val="false"/>
-          <w:iCs w:val="false"/>
-        </w:rPr>
-        <w:t xml:space="preserve">ed </w:t>
-      </w:r>
-      <w:r>
-        <w:rPr>
-          <w:rFonts w:ascii="Liberation Sans" w:hAnsi="Liberation Sans"/>
-          <w:b w:val="false"/>
-          <w:bCs w:val="false"/>
-          <w:i w:val="false"/>
-          <w:iCs w:val="false"/>
-        </w:rPr>
-        <w:t>and the segment is ignored.  If the segment is part of a TURNOUT definition and is followed by any track segments then Path processing will fail.</w:t>
+        <w:t>If an old version of XTrkCad reads a new file with segment version it doesn’t understand an InputError will be raised and the segment is ignored.  If the segment is part of a TURNOUT definition and is followed by any track segments then Path processing will fail.</w:t>
       </w:r>
     </w:p>
     <w:p>
@@ -4772,27 +4736,7 @@
           <w:i w:val="false"/>
           <w:iCs w:val="false"/>
         </w:rPr>
-        <w:t>Note: ReadSegs() checks that the Segment Version is not greate</w:t>
-      </w:r>
-      <w:r>
-        <w:rPr>
-          <w:rFonts w:ascii="Liberation Sans" w:hAnsi="Liberation Sans"/>
-          <w:b w:val="false"/>
-          <w:bCs w:val="false"/>
-          <w:i w:val="false"/>
-          <w:iCs w:val="false"/>
-        </w:rPr>
-        <w:t>r</w:t>
-      </w:r>
-      <w:r>
-        <w:rPr>
-          <w:rFonts w:ascii="Liberation Sans" w:hAnsi="Liberation Sans"/>
-          <w:b w:val="false"/>
-          <w:bCs w:val="false"/>
-          <w:i w:val="false"/>
-          <w:iCs w:val="false"/>
-        </w:rPr>
-        <w:t xml:space="preserve"> than the known versions.</w:t>
+        <w:t>Note: ReadSegs() checks that the Segment Version is not greater than the known versions.</w:t>
       </w:r>
     </w:p>
     <w:p>
@@ -4866,27 +4810,7 @@
           <w:i w:val="false"/>
           <w:iCs w:val="false"/>
         </w:rPr>
-        <w:t>C</w:t>
-      </w:r>
-      <w:r>
-        <w:rPr>
-          <w:rFonts w:ascii="Liberation Sans" w:hAnsi="Liberation Sans"/>
-          <w:b w:val="false"/>
-          <w:bCs w:val="false"/>
-          <w:i w:val="false"/>
-          <w:iCs w:val="false"/>
-        </w:rPr>
-        <w:t xml:space="preserve">onsider </w:t>
-      </w:r>
-      <w:r>
-        <w:rPr>
-          <w:rFonts w:ascii="Liberation Sans" w:hAnsi="Liberation Sans"/>
-          <w:b w:val="false"/>
-          <w:bCs w:val="false"/>
-          <w:i w:val="false"/>
-          <w:iCs w:val="false"/>
-        </w:rPr>
-        <w:t>ReadSegs() for SEG_FILCRCL;</w:t>
+        <w:t>Consider ReadSegs() for SEG_FILCRCL;</w:t>
       </w:r>
     </w:p>
     <w:p>
@@ -4958,19 +4882,7 @@
         <w:tab/>
         <w:tab/>
         <w:tab/>
-        <w:t xml:space="preserve">&amp;cp)) { rc = FALSE; </w:t>
-      </w:r>
-      <w:r>
-        <w:rPr>
-          <w:rFonts w:ascii="Liberation Mono" w:hAnsi="Liberation Mono"/>
-        </w:rPr>
-        <w:t>break;</w:t>
-      </w:r>
-      <w:r>
-        <w:rPr>
-          <w:rFonts w:ascii="Liberation Mono" w:hAnsi="Liberation Mono"/>
-        </w:rPr>
-        <w:t>}</w:t>
+        <w:t>&amp;cp)) { rc = FALSE; break;}</w:t>
       </w:r>
     </w:p>
     <w:p>
@@ -5018,25 +4930,7 @@
         <w:tab/>
         <w:tab/>
         <w:tab/>
-        <w:t xml:space="preserve">... </w:t>
-      </w:r>
-      <w:r>
-        <w:rPr>
-          <w:rFonts w:ascii="Liberation Mono" w:hAnsi="Liberation Mono"/>
-        </w:rPr>
-        <w:t xml:space="preserve">) { </w:t>
-      </w:r>
-      <w:r>
-        <w:rPr>
-          <w:rFonts w:ascii="Liberation Mono" w:hAnsi="Liberation Mono"/>
-        </w:rPr>
-        <w:t xml:space="preserve">rc = FALSE;break; </w:t>
-      </w:r>
-      <w:r>
-        <w:rPr>
-          <w:rFonts w:ascii="Liberation Mono" w:hAnsi="Liberation Mono"/>
-        </w:rPr>
-        <w:t>}</w:t>
+        <w:t>... ) { rc = FALSE;break; }</w:t>
       </w:r>
     </w:p>
     <w:p>
@@ -5128,17 +5022,7 @@
           <w:i w:val="false"/>
           <w:iCs w:val="false"/>
         </w:rPr>
-        <w:t xml:space="preserve">is not NULL then there is more to read, otherwise  </w:t>
-      </w:r>
-      <w:r>
-        <w:rPr>
-          <w:rFonts w:ascii="Liberation Sans" w:hAnsi="Liberation Sans"/>
-          <w:b w:val="false"/>
-          <w:bCs w:val="false"/>
-          <w:i w:val="false"/>
-          <w:iCs w:val="false"/>
-        </w:rPr>
-        <w:t xml:space="preserve">we’re reading an old file. </w:t>
+        <w:t xml:space="preserve">is not NULL then there is more to read, otherwise  we’re reading an old file. </w:t>
       </w:r>
     </w:p>
     <w:p>
@@ -5157,17 +5041,7 @@
           <w:i w:val="false"/>
           <w:iCs w:val="false"/>
         </w:rPr>
-        <w:t xml:space="preserve">This may require the definition argurments to be specified in an unnatural order.  </w:t>
-      </w:r>
-      <w:r>
-        <w:rPr>
-          <w:rFonts w:ascii="Liberation Sans" w:hAnsi="Liberation Sans"/>
-          <w:b w:val="false"/>
-          <w:bCs w:val="false"/>
-          <w:i w:val="false"/>
-          <w:iCs w:val="false"/>
-        </w:rPr>
-        <w:t>In this example radius1 is in position 3 and radius2 is in position 6.  This is localized to ReadSegs/WriteSegs.</w:t>
+        <w:t>This may require the definition argurments to be specified in an unnatural order.  In this example radius1 is in position 3 and radius2 is in position 6.  This is localized to ReadSegs/WriteSegs.</w:t>
       </w:r>
     </w:p>
     <w:p>
@@ -5187,23 +5061,13 @@
           <w:i w:val="false"/>
           <w:iCs w:val="false"/>
         </w:rPr>
-        <w:t xml:space="preserve">The old code will ignore the extra parameters in the new file </w:t>
-      </w:r>
-      <w:r>
-        <w:rPr>
-          <w:rFonts w:ascii="Liberation Sans" w:hAnsi="Liberation Sans"/>
-          <w:b w:val="false"/>
-          <w:bCs w:val="false"/>
-          <w:i w:val="false"/>
-          <w:iCs w:val="false"/>
-        </w:rPr>
-        <w:t>allowing for backwards and forwards compatibility.</w:t>
+        <w:t>The old code will ignore the extra parameters in the new file allowing for backwards and forwards compatibility.</w:t>
       </w:r>
     </w:p>
     <w:sectPr>
       <w:type w:val="nextPage"/>
       <w:pgSz w:w="12240" w:h="15840"/>
-      <w:pgMar w:left="1134" w:right="1134" w:header="0" w:top="1134" w:footer="0" w:bottom="1134" w:gutter="0"/>
+      <w:pgMar w:left="1134" w:right="1134" w:gutter="0" w:header="0" w:top="1134" w:footer="0" w:bottom="1134"/>
       <w:pgNumType w:fmt="decimal"/>
       <w:formProt w:val="false"/>
       <w:textDirection w:val="lrTb"/>
@@ -5214,29 +5078,35 @@
 </file>
 
 <file path=word/numbering.xml><?xml version="1.0" encoding="utf-8"?>
-<w:numbering xmlns:w="http://schemas.openxmlformats.org/wordprocessingml/2006/main" xmlns:o="urn:schemas-microsoft-com:office:office" xmlns:r="http://schemas.openxmlformats.org/officeDocument/2006/relationships" xmlns:v="urn:schemas-microsoft-com:vml">
+<w:numbering xmlns:w="http://schemas.openxmlformats.org/wordprocessingml/2006/main" xmlns:o="urn:schemas-microsoft-com:office:office" xmlns:r="http://schemas.openxmlformats.org/officeDocument/2006/relationships" xmlns:v="urn:schemas-microsoft-com:vml" xmlns:mc="http://schemas.openxmlformats.org/markup-compatibility/2006" xmlns:w14="http://schemas.microsoft.com/office/word/2010/wordml" mc:Ignorable="w14">
   <w:abstractNum w:abstractNumId="1">
     <w:lvl w:ilvl="0">
       <w:start w:val="1"/>
-      <w:pStyle w:val="Heading1"/>
       <w:numFmt w:val="none"/>
       <w:suff w:val="nothing"/>
       <w:lvlText w:val=""/>
       <w:lvlJc w:val="left"/>
       <w:pPr>
-        <w:ind w:left="0" w:hanging="0"/>
-      </w:pPr>
+        <w:tabs>
+          <w:tab w:val="num" w:pos="0"/>
+        </w:tabs>
+        <w:ind w:left="0" w:hanging="0"/>
+      </w:pPr>
+      <w:rPr/>
     </w:lvl>
     <w:lvl w:ilvl="1">
       <w:start w:val="1"/>
-      <w:pStyle w:val="Heading2"/>
       <w:numFmt w:val="none"/>
       <w:suff w:val="nothing"/>
       <w:lvlText w:val=""/>
       <w:lvlJc w:val="left"/>
       <w:pPr>
-        <w:ind w:left="0" w:hanging="0"/>
-      </w:pPr>
+        <w:tabs>
+          <w:tab w:val="num" w:pos="0"/>
+        </w:tabs>
+        <w:ind w:left="0" w:hanging="0"/>
+      </w:pPr>
+      <w:rPr/>
     </w:lvl>
     <w:lvl w:ilvl="2">
       <w:start w:val="1"/>
@@ -5245,8 +5115,12 @@
       <w:lvlText w:val=""/>
       <w:lvlJc w:val="left"/>
       <w:pPr>
-        <w:ind w:left="0" w:hanging="0"/>
-      </w:pPr>
+        <w:tabs>
+          <w:tab w:val="num" w:pos="0"/>
+        </w:tabs>
+        <w:ind w:left="0" w:hanging="0"/>
+      </w:pPr>
+      <w:rPr/>
     </w:lvl>
     <w:lvl w:ilvl="3">
       <w:start w:val="1"/>
@@ -5255,8 +5129,12 @@
       <w:lvlText w:val=""/>
       <w:lvlJc w:val="left"/>
       <w:pPr>
-        <w:ind w:left="0" w:hanging="0"/>
-      </w:pPr>
+        <w:tabs>
+          <w:tab w:val="num" w:pos="0"/>
+        </w:tabs>
+        <w:ind w:left="0" w:hanging="0"/>
+      </w:pPr>
+      <w:rPr/>
     </w:lvl>
     <w:lvl w:ilvl="4">
       <w:start w:val="1"/>
@@ -5265,8 +5143,12 @@
       <w:lvlText w:val=""/>
       <w:lvlJc w:val="left"/>
       <w:pPr>
-        <w:ind w:left="0" w:hanging="0"/>
-      </w:pPr>
+        <w:tabs>
+          <w:tab w:val="num" w:pos="0"/>
+        </w:tabs>
+        <w:ind w:left="0" w:hanging="0"/>
+      </w:pPr>
+      <w:rPr/>
     </w:lvl>
     <w:lvl w:ilvl="5">
       <w:start w:val="1"/>
@@ -5275,8 +5157,12 @@
       <w:lvlText w:val=""/>
       <w:lvlJc w:val="left"/>
       <w:pPr>
-        <w:ind w:left="0" w:hanging="0"/>
-      </w:pPr>
+        <w:tabs>
+          <w:tab w:val="num" w:pos="0"/>
+        </w:tabs>
+        <w:ind w:left="0" w:hanging="0"/>
+      </w:pPr>
+      <w:rPr/>
     </w:lvl>
     <w:lvl w:ilvl="6">
       <w:start w:val="1"/>
@@ -5285,8 +5171,12 @@
       <w:lvlText w:val=""/>
       <w:lvlJc w:val="left"/>
       <w:pPr>
-        <w:ind w:left="0" w:hanging="0"/>
-      </w:pPr>
+        <w:tabs>
+          <w:tab w:val="num" w:pos="0"/>
+        </w:tabs>
+        <w:ind w:left="0" w:hanging="0"/>
+      </w:pPr>
+      <w:rPr/>
     </w:lvl>
     <w:lvl w:ilvl="7">
       <w:start w:val="1"/>
@@ -5295,8 +5185,12 @@
       <w:lvlText w:val=""/>
       <w:lvlJc w:val="left"/>
       <w:pPr>
-        <w:ind w:left="0" w:hanging="0"/>
-      </w:pPr>
+        <w:tabs>
+          <w:tab w:val="num" w:pos="0"/>
+        </w:tabs>
+        <w:ind w:left="0" w:hanging="0"/>
+      </w:pPr>
+      <w:rPr/>
     </w:lvl>
     <w:lvl w:ilvl="8">
       <w:start w:val="1"/>
@@ -5305,8 +5199,12 @@
       <w:lvlText w:val=""/>
       <w:lvlJc w:val="left"/>
       <w:pPr>
-        <w:ind w:left="0" w:hanging="0"/>
-      </w:pPr>
+        <w:tabs>
+          <w:tab w:val="num" w:pos="0"/>
+        </w:tabs>
+        <w:ind w:left="0" w:hanging="0"/>
+      </w:pPr>
+      <w:rPr/>
     </w:lvl>
   </w:abstractNum>
   <w:abstractNum w:abstractNumId="2">
@@ -5317,8 +5215,12 @@
       <w:lvlText w:val=""/>
       <w:lvlJc w:val="left"/>
       <w:pPr>
-        <w:ind w:left="0" w:hanging="0"/>
-      </w:pPr>
+        <w:tabs>
+          <w:tab w:val="num" w:pos="0"/>
+        </w:tabs>
+        <w:ind w:left="0" w:hanging="0"/>
+      </w:pPr>
+      <w:rPr/>
     </w:lvl>
     <w:lvl w:ilvl="1">
       <w:start w:val="1"/>
@@ -5327,8 +5229,12 @@
       <w:lvlText w:val=""/>
       <w:lvlJc w:val="left"/>
       <w:pPr>
-        <w:ind w:left="0" w:hanging="0"/>
-      </w:pPr>
+        <w:tabs>
+          <w:tab w:val="num" w:pos="0"/>
+        </w:tabs>
+        <w:ind w:left="0" w:hanging="0"/>
+      </w:pPr>
+      <w:rPr/>
     </w:lvl>
     <w:lvl w:ilvl="2">
       <w:start w:val="1"/>
@@ -5337,8 +5243,12 @@
       <w:lvlText w:val=""/>
       <w:lvlJc w:val="left"/>
       <w:pPr>
-        <w:ind w:left="0" w:hanging="0"/>
-      </w:pPr>
+        <w:tabs>
+          <w:tab w:val="num" w:pos="0"/>
+        </w:tabs>
+        <w:ind w:left="0" w:hanging="0"/>
+      </w:pPr>
+      <w:rPr/>
     </w:lvl>
     <w:lvl w:ilvl="3">
       <w:start w:val="1"/>
@@ -5347,8 +5257,12 @@
       <w:lvlText w:val=""/>
       <w:lvlJc w:val="left"/>
       <w:pPr>
-        <w:ind w:left="0" w:hanging="0"/>
-      </w:pPr>
+        <w:tabs>
+          <w:tab w:val="num" w:pos="0"/>
+        </w:tabs>
+        <w:ind w:left="0" w:hanging="0"/>
+      </w:pPr>
+      <w:rPr/>
     </w:lvl>
     <w:lvl w:ilvl="4">
       <w:start w:val="1"/>
@@ -5357,8 +5271,12 @@
       <w:lvlText w:val=""/>
       <w:lvlJc w:val="left"/>
       <w:pPr>
-        <w:ind w:left="0" w:hanging="0"/>
-      </w:pPr>
+        <w:tabs>
+          <w:tab w:val="num" w:pos="0"/>
+        </w:tabs>
+        <w:ind w:left="0" w:hanging="0"/>
+      </w:pPr>
+      <w:rPr/>
     </w:lvl>
     <w:lvl w:ilvl="5">
       <w:start w:val="1"/>
@@ -5367,8 +5285,12 @@
       <w:lvlText w:val=""/>
       <w:lvlJc w:val="left"/>
       <w:pPr>
-        <w:ind w:left="0" w:hanging="0"/>
-      </w:pPr>
+        <w:tabs>
+          <w:tab w:val="num" w:pos="0"/>
+        </w:tabs>
+        <w:ind w:left="0" w:hanging="0"/>
+      </w:pPr>
+      <w:rPr/>
     </w:lvl>
     <w:lvl w:ilvl="6">
       <w:start w:val="1"/>
@@ -5377,8 +5299,12 @@
       <w:lvlText w:val=""/>
       <w:lvlJc w:val="left"/>
       <w:pPr>
-        <w:ind w:left="0" w:hanging="0"/>
-      </w:pPr>
+        <w:tabs>
+          <w:tab w:val="num" w:pos="0"/>
+        </w:tabs>
+        <w:ind w:left="0" w:hanging="0"/>
+      </w:pPr>
+      <w:rPr/>
     </w:lvl>
     <w:lvl w:ilvl="7">
       <w:start w:val="1"/>
@@ -5387,8 +5313,12 @@
       <w:lvlText w:val=""/>
       <w:lvlJc w:val="left"/>
       <w:pPr>
-        <w:ind w:left="0" w:hanging="0"/>
-      </w:pPr>
+        <w:tabs>
+          <w:tab w:val="num" w:pos="0"/>
+        </w:tabs>
+        <w:ind w:left="0" w:hanging="0"/>
+      </w:pPr>
+      <w:rPr/>
     </w:lvl>
     <w:lvl w:ilvl="8">
       <w:start w:val="1"/>
@@ -5397,8 +5327,12 @@
       <w:lvlText w:val=""/>
       <w:lvlJc w:val="left"/>
       <w:pPr>
-        <w:ind w:left="0" w:hanging="0"/>
-      </w:pPr>
+        <w:tabs>
+          <w:tab w:val="num" w:pos="0"/>
+        </w:tabs>
+        <w:ind w:left="0" w:hanging="0"/>
+      </w:pPr>
+      <w:rPr/>
     </w:lvl>
   </w:abstractNum>
   <w:abstractNum w:abstractNumId="3">
@@ -5408,8 +5342,12 @@
       <w:lvlText w:val="%1"/>
       <w:lvlJc w:val="left"/>
       <w:pPr>
-        <w:ind w:left="0" w:hanging="0"/>
-      </w:pPr>
+        <w:tabs>
+          <w:tab w:val="num" w:pos="0"/>
+        </w:tabs>
+        <w:ind w:left="0" w:hanging="0"/>
+      </w:pPr>
+      <w:rPr/>
     </w:lvl>
     <w:lvl w:ilvl="1">
       <w:start w:val="1"/>
@@ -5418,8 +5356,12 @@
       <w:lvlText w:val=""/>
       <w:lvlJc w:val="left"/>
       <w:pPr>
-        <w:ind w:left="0" w:hanging="0"/>
-      </w:pPr>
+        <w:tabs>
+          <w:tab w:val="num" w:pos="0"/>
+        </w:tabs>
+        <w:ind w:left="0" w:hanging="0"/>
+      </w:pPr>
+      <w:rPr/>
     </w:lvl>
     <w:lvl w:ilvl="2">
       <w:start w:val="1"/>
@@ -5428,8 +5370,12 @@
       <w:lvlText w:val=""/>
       <w:lvlJc w:val="left"/>
       <w:pPr>
-        <w:ind w:left="0" w:hanging="0"/>
-      </w:pPr>
+        <w:tabs>
+          <w:tab w:val="num" w:pos="0"/>
+        </w:tabs>
+        <w:ind w:left="0" w:hanging="0"/>
+      </w:pPr>
+      <w:rPr/>
     </w:lvl>
     <w:lvl w:ilvl="3">
       <w:start w:val="1"/>
@@ -5438,8 +5384,12 @@
       <w:lvlText w:val=""/>
       <w:lvlJc w:val="left"/>
       <w:pPr>
-        <w:ind w:left="0" w:hanging="0"/>
-      </w:pPr>
+        <w:tabs>
+          <w:tab w:val="num" w:pos="0"/>
+        </w:tabs>
+        <w:ind w:left="0" w:hanging="0"/>
+      </w:pPr>
+      <w:rPr/>
     </w:lvl>
     <w:lvl w:ilvl="4">
       <w:start w:val="1"/>
@@ -5448,8 +5398,12 @@
       <w:lvlText w:val=""/>
       <w:lvlJc w:val="left"/>
       <w:pPr>
-        <w:ind w:left="0" w:hanging="0"/>
-      </w:pPr>
+        <w:tabs>
+          <w:tab w:val="num" w:pos="0"/>
+        </w:tabs>
+        <w:ind w:left="0" w:hanging="0"/>
+      </w:pPr>
+      <w:rPr/>
     </w:lvl>
     <w:lvl w:ilvl="5">
       <w:start w:val="1"/>
@@ -5458,8 +5412,12 @@
       <w:lvlText w:val=""/>
       <w:lvlJc w:val="left"/>
       <w:pPr>
-        <w:ind w:left="0" w:hanging="0"/>
-      </w:pPr>
+        <w:tabs>
+          <w:tab w:val="num" w:pos="0"/>
+        </w:tabs>
+        <w:ind w:left="0" w:hanging="0"/>
+      </w:pPr>
+      <w:rPr/>
     </w:lvl>
     <w:lvl w:ilvl="6">
       <w:start w:val="1"/>
@@ -5468,8 +5426,12 @@
       <w:lvlText w:val=""/>
       <w:lvlJc w:val="left"/>
       <w:pPr>
-        <w:ind w:left="0" w:hanging="0"/>
-      </w:pPr>
+        <w:tabs>
+          <w:tab w:val="num" w:pos="0"/>
+        </w:tabs>
+        <w:ind w:left="0" w:hanging="0"/>
+      </w:pPr>
+      <w:rPr/>
     </w:lvl>
     <w:lvl w:ilvl="7">
       <w:start w:val="1"/>
@@ -5478,8 +5440,12 @@
       <w:lvlText w:val=""/>
       <w:lvlJc w:val="left"/>
       <w:pPr>
-        <w:ind w:left="0" w:hanging="0"/>
-      </w:pPr>
+        <w:tabs>
+          <w:tab w:val="num" w:pos="0"/>
+        </w:tabs>
+        <w:ind w:left="0" w:hanging="0"/>
+      </w:pPr>
+      <w:rPr/>
     </w:lvl>
     <w:lvl w:ilvl="8">
       <w:start w:val="1"/>
@@ -5488,8 +5454,12 @@
       <w:lvlText w:val=""/>
       <w:lvlJc w:val="left"/>
       <w:pPr>
-        <w:ind w:left="0" w:hanging="0"/>
-      </w:pPr>
+        <w:tabs>
+          <w:tab w:val="num" w:pos="0"/>
+        </w:tabs>
+        <w:ind w:left="0" w:hanging="0"/>
+      </w:pPr>
+      <w:rPr/>
     </w:lvl>
   </w:abstractNum>
   <w:abstractNum w:abstractNumId="4">
@@ -5499,8 +5469,12 @@
       <w:lvlText w:val="%1"/>
       <w:lvlJc w:val="left"/>
       <w:pPr>
-        <w:ind w:left="0" w:hanging="0"/>
-      </w:pPr>
+        <w:tabs>
+          <w:tab w:val="num" w:pos="0"/>
+        </w:tabs>
+        <w:ind w:left="0" w:hanging="0"/>
+      </w:pPr>
+      <w:rPr/>
     </w:lvl>
     <w:lvl w:ilvl="1">
       <w:start w:val="1"/>
@@ -5509,8 +5483,12 @@
       <w:lvlText w:val=""/>
       <w:lvlJc w:val="left"/>
       <w:pPr>
-        <w:ind w:left="0" w:hanging="0"/>
-      </w:pPr>
+        <w:tabs>
+          <w:tab w:val="num" w:pos="0"/>
+        </w:tabs>
+        <w:ind w:left="0" w:hanging="0"/>
+      </w:pPr>
+      <w:rPr/>
     </w:lvl>
     <w:lvl w:ilvl="2">
       <w:start w:val="1"/>
@@ -5519,8 +5497,12 @@
       <w:lvlText w:val=""/>
       <w:lvlJc w:val="left"/>
       <w:pPr>
-        <w:ind w:left="0" w:hanging="0"/>
-      </w:pPr>
+        <w:tabs>
+          <w:tab w:val="num" w:pos="0"/>
+        </w:tabs>
+        <w:ind w:left="0" w:hanging="0"/>
+      </w:pPr>
+      <w:rPr/>
     </w:lvl>
     <w:lvl w:ilvl="3">
       <w:start w:val="1"/>
@@ -5529,8 +5511,12 @@
       <w:lvlText w:val=""/>
       <w:lvlJc w:val="left"/>
       <w:pPr>
-        <w:ind w:left="0" w:hanging="0"/>
-      </w:pPr>
+        <w:tabs>
+          <w:tab w:val="num" w:pos="0"/>
+        </w:tabs>
+        <w:ind w:left="0" w:hanging="0"/>
+      </w:pPr>
+      <w:rPr/>
     </w:lvl>
     <w:lvl w:ilvl="4">
       <w:start w:val="1"/>
@@ -5539,8 +5525,12 @@
       <w:lvlText w:val=""/>
       <w:lvlJc w:val="left"/>
       <w:pPr>
-        <w:ind w:left="0" w:hanging="0"/>
-      </w:pPr>
+        <w:tabs>
+          <w:tab w:val="num" w:pos="0"/>
+        </w:tabs>
+        <w:ind w:left="0" w:hanging="0"/>
+      </w:pPr>
+      <w:rPr/>
     </w:lvl>
     <w:lvl w:ilvl="5">
       <w:start w:val="1"/>
@@ -5549,8 +5539,12 @@
       <w:lvlText w:val=""/>
       <w:lvlJc w:val="left"/>
       <w:pPr>
-        <w:ind w:left="0" w:hanging="0"/>
-      </w:pPr>
+        <w:tabs>
+          <w:tab w:val="num" w:pos="0"/>
+        </w:tabs>
+        <w:ind w:left="0" w:hanging="0"/>
+      </w:pPr>
+      <w:rPr/>
     </w:lvl>
     <w:lvl w:ilvl="6">
       <w:start w:val="1"/>
@@ -5559,8 +5553,12 @@
       <w:lvlText w:val=""/>
       <w:lvlJc w:val="left"/>
       <w:pPr>
-        <w:ind w:left="0" w:hanging="0"/>
-      </w:pPr>
+        <w:tabs>
+          <w:tab w:val="num" w:pos="0"/>
+        </w:tabs>
+        <w:ind w:left="0" w:hanging="0"/>
+      </w:pPr>
+      <w:rPr/>
     </w:lvl>
     <w:lvl w:ilvl="7">
       <w:start w:val="1"/>
@@ -5569,8 +5567,12 @@
       <w:lvlText w:val=""/>
       <w:lvlJc w:val="left"/>
       <w:pPr>
-        <w:ind w:left="0" w:hanging="0"/>
-      </w:pPr>
+        <w:tabs>
+          <w:tab w:val="num" w:pos="0"/>
+        </w:tabs>
+        <w:ind w:left="0" w:hanging="0"/>
+      </w:pPr>
+      <w:rPr/>
     </w:lvl>
     <w:lvl w:ilvl="8">
       <w:start w:val="1"/>
@@ -5579,8 +5581,12 @@
       <w:lvlText w:val=""/>
       <w:lvlJc w:val="left"/>
       <w:pPr>
-        <w:ind w:left="0" w:hanging="0"/>
-      </w:pPr>
+        <w:tabs>
+          <w:tab w:val="num" w:pos="0"/>
+        </w:tabs>
+        <w:ind w:left="0" w:hanging="0"/>
+      </w:pPr>
+      <w:rPr/>
     </w:lvl>
   </w:abstractNum>
   <w:abstractNum w:abstractNumId="5">
@@ -5597,7 +5603,6 @@
       </w:pPr>
       <w:rPr>
         <w:rFonts w:ascii="Symbol" w:hAnsi="Symbol" w:cs="Symbol" w:hint="default"/>
-        <w:rFonts w:cs="OpenSymbol"/>
       </w:rPr>
     </w:lvl>
     <w:lvl w:ilvl="1">
@@ -5613,7 +5618,6 @@
       </w:pPr>
       <w:rPr>
         <w:rFonts w:ascii="OpenSymbol" w:hAnsi="OpenSymbol" w:cs="OpenSymbol" w:hint="default"/>
-        <w:rFonts w:cs="OpenSymbol"/>
       </w:rPr>
     </w:lvl>
     <w:lvl w:ilvl="2">
@@ -5629,7 +5633,6 @@
       </w:pPr>
       <w:rPr>
         <w:rFonts w:ascii="OpenSymbol" w:hAnsi="OpenSymbol" w:cs="OpenSymbol" w:hint="default"/>
-        <w:rFonts w:cs="OpenSymbol"/>
       </w:rPr>
     </w:lvl>
     <w:lvl w:ilvl="3">
@@ -5645,7 +5648,6 @@
       </w:pPr>
       <w:rPr>
         <w:rFonts w:ascii="Symbol" w:hAnsi="Symbol" w:cs="Symbol" w:hint="default"/>
-        <w:rFonts w:cs="OpenSymbol"/>
       </w:rPr>
     </w:lvl>
     <w:lvl w:ilvl="4">
@@ -5661,7 +5663,6 @@
       </w:pPr>
       <w:rPr>
         <w:rFonts w:ascii="OpenSymbol" w:hAnsi="OpenSymbol" w:cs="OpenSymbol" w:hint="default"/>
-        <w:rFonts w:cs="OpenSymbol"/>
       </w:rPr>
     </w:lvl>
     <w:lvl w:ilvl="5">
@@ -5677,7 +5678,6 @@
       </w:pPr>
       <w:rPr>
         <w:rFonts w:ascii="OpenSymbol" w:hAnsi="OpenSymbol" w:cs="OpenSymbol" w:hint="default"/>
-        <w:rFonts w:cs="OpenSymbol"/>
       </w:rPr>
     </w:lvl>
     <w:lvl w:ilvl="6">
@@ -5693,7 +5693,6 @@
       </w:pPr>
       <w:rPr>
         <w:rFonts w:ascii="Symbol" w:hAnsi="Symbol" w:cs="Symbol" w:hint="default"/>
-        <w:rFonts w:cs="OpenSymbol"/>
       </w:rPr>
     </w:lvl>
     <w:lvl w:ilvl="7">
@@ -5709,7 +5708,6 @@
       </w:pPr>
       <w:rPr>
         <w:rFonts w:ascii="OpenSymbol" w:hAnsi="OpenSymbol" w:cs="OpenSymbol" w:hint="default"/>
-        <w:rFonts w:cs="OpenSymbol"/>
       </w:rPr>
     </w:lvl>
     <w:lvl w:ilvl="8">
@@ -5725,8 +5723,126 @@
       </w:pPr>
       <w:rPr>
         <w:rFonts w:ascii="OpenSymbol" w:hAnsi="OpenSymbol" w:cs="OpenSymbol" w:hint="default"/>
-        <w:rFonts w:cs="OpenSymbol"/>
       </w:rPr>
+    </w:lvl>
+  </w:abstractNum>
+  <w:abstractNum w:abstractNumId="6">
+    <w:lvl w:ilvl="0">
+      <w:start w:val="1"/>
+      <w:numFmt w:val="none"/>
+      <w:suff w:val="nothing"/>
+      <w:lvlText w:val=""/>
+      <w:lvlJc w:val="left"/>
+      <w:pPr>
+        <w:tabs>
+          <w:tab w:val="num" w:pos="0"/>
+        </w:tabs>
+        <w:ind w:left="0" w:hanging="0"/>
+      </w:pPr>
+    </w:lvl>
+    <w:lvl w:ilvl="1">
+      <w:start w:val="1"/>
+      <w:numFmt w:val="none"/>
+      <w:suff w:val="nothing"/>
+      <w:lvlText w:val=""/>
+      <w:lvlJc w:val="left"/>
+      <w:pPr>
+        <w:tabs>
+          <w:tab w:val="num" w:pos="0"/>
+        </w:tabs>
+        <w:ind w:left="0" w:hanging="0"/>
+      </w:pPr>
+    </w:lvl>
+    <w:lvl w:ilvl="2">
+      <w:start w:val="1"/>
+      <w:numFmt w:val="none"/>
+      <w:suff w:val="nothing"/>
+      <w:lvlText w:val=""/>
+      <w:lvlJc w:val="left"/>
+      <w:pPr>
+        <w:tabs>
+          <w:tab w:val="num" w:pos="0"/>
+        </w:tabs>
+        <w:ind w:left="0" w:hanging="0"/>
+      </w:pPr>
+    </w:lvl>
+    <w:lvl w:ilvl="3">
+      <w:start w:val="1"/>
+      <w:numFmt w:val="none"/>
+      <w:suff w:val="nothing"/>
+      <w:lvlText w:val=""/>
+      <w:lvlJc w:val="left"/>
+      <w:pPr>
+        <w:tabs>
+          <w:tab w:val="num" w:pos="0"/>
+        </w:tabs>
+        <w:ind w:left="0" w:hanging="0"/>
+      </w:pPr>
+    </w:lvl>
+    <w:lvl w:ilvl="4">
+      <w:start w:val="1"/>
+      <w:numFmt w:val="none"/>
+      <w:suff w:val="nothing"/>
+      <w:lvlText w:val=""/>
+      <w:lvlJc w:val="left"/>
+      <w:pPr>
+        <w:tabs>
+          <w:tab w:val="num" w:pos="0"/>
+        </w:tabs>
+        <w:ind w:left="0" w:hanging="0"/>
+      </w:pPr>
+    </w:lvl>
+    <w:lvl w:ilvl="5">
+      <w:start w:val="1"/>
+      <w:numFmt w:val="none"/>
+      <w:suff w:val="nothing"/>
+      <w:lvlText w:val=""/>
+      <w:lvlJc w:val="left"/>
+      <w:pPr>
+        <w:tabs>
+          <w:tab w:val="num" w:pos="0"/>
+        </w:tabs>
+        <w:ind w:left="0" w:hanging="0"/>
+      </w:pPr>
+    </w:lvl>
+    <w:lvl w:ilvl="6">
+      <w:start w:val="1"/>
+      <w:numFmt w:val="none"/>
+      <w:suff w:val="nothing"/>
+      <w:lvlText w:val=""/>
+      <w:lvlJc w:val="left"/>
+      <w:pPr>
+        <w:tabs>
+          <w:tab w:val="num" w:pos="0"/>
+        </w:tabs>
+        <w:ind w:left="0" w:hanging="0"/>
+      </w:pPr>
+    </w:lvl>
+    <w:lvl w:ilvl="7">
+      <w:start w:val="1"/>
+      <w:numFmt w:val="none"/>
+      <w:suff w:val="nothing"/>
+      <w:lvlText w:val=""/>
+      <w:lvlJc w:val="left"/>
+      <w:pPr>
+        <w:tabs>
+          <w:tab w:val="num" w:pos="0"/>
+        </w:tabs>
+        <w:ind w:left="0" w:hanging="0"/>
+      </w:pPr>
+    </w:lvl>
+    <w:lvl w:ilvl="8">
+      <w:start w:val="1"/>
+      <w:numFmt w:val="none"/>
+      <w:suff w:val="nothing"/>
+      <w:lvlText w:val=""/>
+      <w:lvlJc w:val="left"/>
+      <w:pPr>
+        <w:tabs>
+          <w:tab w:val="num" w:pos="0"/>
+        </w:tabs>
+        <w:ind w:left="0" w:hanging="0"/>
+      </w:pPr>
     </w:lvl>
   </w:abstractNum>
   <w:num w:numId="1">
@@ -5744,6 +5860,9 @@
   <w:num w:numId="5">
     <w:abstractNumId w:val="5"/>
   </w:num>
+  <w:num w:numId="6">
+    <w:abstractNumId w:val="6"/>
+  </w:num>
 </w:numbering>
 </file>
 
@@ -5754,13 +5873,14 @@
       <w:rPr>
         <w:rFonts w:ascii="Liberation Serif" w:hAnsi="Liberation Serif" w:eastAsia="Noto Serif CJK SC" w:cs="Lohit Devanagari"/>
         <w:kern w:val="2"/>
-        <w:sz w:val="20"/>
         <w:szCs w:val="24"/>
         <w:lang w:val="en-CA" w:eastAsia="zh-CN" w:bidi="hi-IN"/>
       </w:rPr>
     </w:rPrDefault>
     <w:pPrDefault>
-      <w:pPr/>
+      <w:pPr>
+        <w:suppressAutoHyphens w:val="true"/>
+      </w:pPr>
     </w:pPrDefault>
   </w:docDefaults>
   <w:style w:type="paragraph" w:styleId="Normal">
@@ -5769,8 +5889,9 @@
     <w:pPr>
       <w:widowControl/>
       <w:suppressAutoHyphens w:val="true"/>
-      <w:overflowPunct w:val="false"/>
+      <w:overflowPunct w:val="true"/>
       <w:bidi w:val="0"/>
+      <w:spacing w:before="0" w:after="0"/>
       <w:jc w:val="left"/>
     </w:pPr>
     <w:rPr>
@@ -5821,7 +5942,7 @@
     </w:rPr>
   </w:style>
   <w:style w:type="character" w:styleId="InternetLink">
-    <w:name w:val="Internet Link"/>
+    <w:name w:val="Hyperlink"/>
     <w:rPr>
       <w:color w:val="000080"/>
       <w:u w:val="single"/>
@@ -5835,11 +5956,6 @@
   </w:style>
   <w:style w:type="character" w:styleId="NumberingSymbols">
     <w:name w:val="Numbering Symbols"/>
-    <w:qFormat/>
-    <w:rPr/>
-  </w:style>
-  <w:style w:type="character" w:styleId="ListLabel1">
-    <w:name w:val="ListLabel 1"/>
     <w:qFormat/>
     <w:rPr/>
   </w:style>
@@ -5859,20 +5975,6 @@
       <w:bCs/>
     </w:rPr>
   </w:style>
-  <w:style w:type="character" w:styleId="ListLabel2">
-    <w:name w:val="ListLabel 2"/>
-    <w:qFormat/>
-    <w:rPr>
-      <w:rFonts w:ascii="Liberation Sans" w:hAnsi="Liberation Sans"/>
-    </w:rPr>
-  </w:style>
-  <w:style w:type="character" w:styleId="ListLabel3">
-    <w:name w:val="ListLabel 3"/>
-    <w:qFormat/>
-    <w:rPr>
-      <w:rFonts w:ascii="Liberation Sans" w:hAnsi="Liberation Sans"/>
-    </w:rPr>
-  </w:style>
   <w:style w:type="character" w:styleId="Bullets">
     <w:name w:val="Bullets"/>
     <w:qFormat/>
@@ -5880,78 +5982,8 @@
       <w:rFonts w:ascii="OpenSymbol" w:hAnsi="OpenSymbol" w:eastAsia="OpenSymbol" w:cs="OpenSymbol"/>
     </w:rPr>
   </w:style>
-  <w:style w:type="character" w:styleId="ListLabel4">
-    <w:name w:val="ListLabel 4"/>
-    <w:qFormat/>
-    <w:rPr>
-      <w:rFonts w:ascii="Liberation Sans" w:hAnsi="Liberation Sans" w:cs="OpenSymbol"/>
-    </w:rPr>
-  </w:style>
-  <w:style w:type="character" w:styleId="ListLabel5">
-    <w:name w:val="ListLabel 5"/>
-    <w:qFormat/>
-    <w:rPr>
-      <w:rFonts w:cs="OpenSymbol"/>
-    </w:rPr>
-  </w:style>
-  <w:style w:type="character" w:styleId="ListLabel6">
-    <w:name w:val="ListLabel 6"/>
-    <w:qFormat/>
-    <w:rPr>
-      <w:rFonts w:cs="OpenSymbol"/>
-    </w:rPr>
-  </w:style>
-  <w:style w:type="character" w:styleId="ListLabel7">
-    <w:name w:val="ListLabel 7"/>
-    <w:qFormat/>
-    <w:rPr>
-      <w:rFonts w:cs="OpenSymbol"/>
-    </w:rPr>
-  </w:style>
-  <w:style w:type="character" w:styleId="ListLabel8">
-    <w:name w:val="ListLabel 8"/>
-    <w:qFormat/>
-    <w:rPr>
-      <w:rFonts w:cs="OpenSymbol"/>
-    </w:rPr>
-  </w:style>
-  <w:style w:type="character" w:styleId="ListLabel9">
-    <w:name w:val="ListLabel 9"/>
-    <w:qFormat/>
-    <w:rPr>
-      <w:rFonts w:cs="OpenSymbol"/>
-    </w:rPr>
-  </w:style>
-  <w:style w:type="character" w:styleId="ListLabel10">
-    <w:name w:val="ListLabel 10"/>
-    <w:qFormat/>
-    <w:rPr>
-      <w:rFonts w:cs="OpenSymbol"/>
-    </w:rPr>
-  </w:style>
-  <w:style w:type="character" w:styleId="ListLabel11">
-    <w:name w:val="ListLabel 11"/>
-    <w:qFormat/>
-    <w:rPr>
-      <w:rFonts w:cs="OpenSymbol"/>
-    </w:rPr>
-  </w:style>
-  <w:style w:type="character" w:styleId="ListLabel12">
-    <w:name w:val="ListLabel 12"/>
-    <w:qFormat/>
-    <w:rPr>
-      <w:rFonts w:cs="OpenSymbol"/>
-    </w:rPr>
-  </w:style>
-  <w:style w:type="character" w:styleId="ListLabel13">
-    <w:name w:val="ListLabel 13"/>
-    <w:qFormat/>
-    <w:rPr>
-      <w:rFonts w:ascii="Liberation Sans" w:hAnsi="Liberation Sans"/>
-    </w:rPr>
-  </w:style>
   <w:style w:type="character" w:styleId="VisitedInternetLink">
-    <w:name w:val="Visited Internet Link"/>
+    <w:name w:val="FollowedHyperlink"/>
     <w:rPr>
       <w:color w:val="800000"/>
       <w:u w:val="single"/>
@@ -6064,6 +6096,7 @@
     <w:basedOn w:val="Index"/>
     <w:pPr>
       <w:tabs>
+        <w:tab w:val="clear" w:pos="709"/>
         <w:tab w:val="right" w:pos="9972" w:leader="dot"/>
       </w:tabs>
       <w:ind w:left="0" w:right="0" w:hanging="0"/>
@@ -6075,6 +6108,7 @@
     <w:basedOn w:val="Index"/>
     <w:pPr>
       <w:tabs>
+        <w:tab w:val="clear" w:pos="709"/>
         <w:tab w:val="right" w:pos="9972" w:leader="dot"/>
       </w:tabs>
       <w:ind w:left="283" w:right="0" w:hanging="0"/>

</xml_diff>

<commit_message>
Default version is 5.3.1Dev Update DevGuide Source Control/Releases
</commit_message>
<xml_diff>
--- a/docs/DevGuide.docx
+++ b/docs/DevGuide.docx
@@ -828,24 +828,20 @@
         <w:rPr>
           <w:rFonts w:ascii="Liberation Sans" w:hAnsi="Liberation Sans"/>
         </w:rPr>
-        <w:t>It is recommended that any non-trivial work occur in a sub-branch from ‘default’.   Once the new work is complete and stable, the sub-branch is merged back into ‘default’.  Merging from the ‘default’ branch should be done frequencely to keep the new code in sync, especially just before merging back to ‘default’</w:t>
-      </w:r>
-      <w:r>
-        <w:rPr>
-          <w:rFonts w:ascii="Liberation Sans" w:hAnsi="Liberation Sans"/>
-        </w:rPr>
-        <w:t>r</w:t>
-      </w:r>
-    </w:p>
-    <w:p>
-      <w:pPr>
-        <w:pStyle w:val="Normal"/>
-        <w:rPr>
-          <w:rFonts w:ascii="Liberation Sans" w:hAnsi="Liberation Sans"/>
-        </w:rPr>
-      </w:pPr>
-      <w:r>
-        <w:rPr/>
+        <w:t>It is recommended that any non-trivial work occur in a sub-branch from ‘default’.   Once the new work is complete and stable, the sub-branch is merged back into ‘default’.  Merging from the ‘default’ branch should be done frequencely to keep the new code in sync, especially just before merging back to ‘default’r</w:t>
+      </w:r>
+    </w:p>
+    <w:p>
+      <w:pPr>
+        <w:pStyle w:val="Normal"/>
+        <w:rPr>
+          <w:rFonts w:ascii="Liberation Sans" w:hAnsi="Liberation Sans"/>
+        </w:rPr>
+      </w:pPr>
+      <w:r>
+        <w:rPr>
+          <w:rFonts w:ascii="Liberation Sans" w:hAnsi="Liberation Sans"/>
+        </w:rPr>
       </w:r>
     </w:p>
     <w:p>
@@ -886,7 +882,9 @@
         </w:rPr>
       </w:pPr>
       <w:r>
-        <w:rPr/>
+        <w:rPr>
+          <w:rFonts w:ascii="Liberation Sans" w:hAnsi="Liberation Sans"/>
+        </w:rPr>
       </w:r>
     </w:p>
     <w:p>
@@ -953,7 +951,9 @@
         </w:rPr>
       </w:pPr>
       <w:r>
-        <w:rPr/>
+        <w:rPr>
+          <w:rFonts w:ascii="Liberation Sans" w:hAnsi="Liberation Sans"/>
+        </w:rPr>
       </w:r>
     </w:p>
     <w:p>
@@ -1060,12 +1060,15 @@
           <w:ilvl w:val="0"/>
           <w:numId w:val="0"/>
         </w:numPr>
-        <w:rPr>
-          <w:rFonts w:ascii="Liberation Sans" w:hAnsi="Liberation Sans"/>
-        </w:rPr>
-      </w:pPr>
-      <w:r>
-        <w:rPr/>
+        <w:ind w:left="0" w:hanging="0"/>
+        <w:rPr>
+          <w:rFonts w:ascii="Liberation Sans" w:hAnsi="Liberation Sans"/>
+        </w:rPr>
+      </w:pPr>
+      <w:r>
+        <w:rPr>
+          <w:rFonts w:ascii="Liberation Sans" w:hAnsi="Liberation Sans"/>
+        </w:rPr>
       </w:r>
     </w:p>
     <w:p>
@@ -1075,6 +1078,7 @@
           <w:ilvl w:val="0"/>
           <w:numId w:val="0"/>
         </w:numPr>
+        <w:ind w:left="0" w:hanging="0"/>
         <w:rPr>
           <w:rFonts w:ascii="Liberation Sans" w:hAnsi="Liberation Sans"/>
         </w:rPr>
@@ -1095,12 +1099,15 @@
           <w:ilvl w:val="0"/>
           <w:numId w:val="0"/>
         </w:numPr>
-        <w:rPr>
-          <w:rFonts w:ascii="Liberation Sans" w:hAnsi="Liberation Sans"/>
-        </w:rPr>
-      </w:pPr>
-      <w:r>
-        <w:rPr/>
+        <w:ind w:left="0" w:hanging="0"/>
+        <w:rPr>
+          <w:rFonts w:ascii="Liberation Sans" w:hAnsi="Liberation Sans"/>
+        </w:rPr>
+      </w:pPr>
+      <w:r>
+        <w:rPr>
+          <w:rFonts w:ascii="Liberation Sans" w:hAnsi="Liberation Sans"/>
+        </w:rPr>
         <w:drawing>
           <wp:anchor behindDoc="0" distT="0" distB="0" distL="0" distR="0" simplePos="0" locked="0" layoutInCell="0" allowOverlap="1" relativeHeight="3">
             <wp:simplePos x="0" y="0"/>
@@ -1155,12 +1162,15 @@
           <w:ilvl w:val="0"/>
           <w:numId w:val="0"/>
         </w:numPr>
-        <w:rPr>
-          <w:rFonts w:ascii="Liberation Sans" w:hAnsi="Liberation Sans"/>
-        </w:rPr>
-      </w:pPr>
-      <w:r>
-        <w:rPr/>
+        <w:ind w:left="0" w:hanging="0"/>
+        <w:rPr>
+          <w:rFonts w:ascii="Liberation Sans" w:hAnsi="Liberation Sans"/>
+        </w:rPr>
+      </w:pPr>
+      <w:r>
+        <w:rPr>
+          <w:rFonts w:ascii="Liberation Sans" w:hAnsi="Liberation Sans"/>
+        </w:rPr>
       </w:r>
     </w:p>
     <w:p>
@@ -1170,12 +1180,15 @@
           <w:ilvl w:val="0"/>
           <w:numId w:val="0"/>
         </w:numPr>
-        <w:rPr>
-          <w:rFonts w:ascii="Liberation Sans" w:hAnsi="Liberation Sans"/>
-        </w:rPr>
-      </w:pPr>
-      <w:r>
-        <w:rPr/>
+        <w:ind w:left="0" w:hanging="0"/>
+        <w:rPr>
+          <w:rFonts w:ascii="Liberation Sans" w:hAnsi="Liberation Sans"/>
+        </w:rPr>
+      </w:pPr>
+      <w:r>
+        <w:rPr>
+          <w:rFonts w:ascii="Liberation Sans" w:hAnsi="Liberation Sans"/>
+        </w:rPr>
       </w:r>
     </w:p>
     <w:p>
@@ -1185,12 +1198,15 @@
           <w:ilvl w:val="0"/>
           <w:numId w:val="0"/>
         </w:numPr>
-        <w:rPr>
-          <w:rFonts w:ascii="Liberation Sans" w:hAnsi="Liberation Sans"/>
-        </w:rPr>
-      </w:pPr>
-      <w:r>
-        <w:rPr/>
+        <w:ind w:left="0" w:hanging="0"/>
+        <w:rPr>
+          <w:rFonts w:ascii="Liberation Sans" w:hAnsi="Liberation Sans"/>
+        </w:rPr>
+      </w:pPr>
+      <w:r>
+        <w:rPr>
+          <w:rFonts w:ascii="Liberation Sans" w:hAnsi="Liberation Sans"/>
+        </w:rPr>
       </w:r>
     </w:p>
     <w:p>
@@ -1244,7 +1260,9 @@
         </w:rPr>
       </w:pPr>
       <w:r>
-        <w:rPr/>
+        <w:rPr>
+          <w:rFonts w:ascii="Liberation Sans" w:hAnsi="Liberation Sans"/>
+        </w:rPr>
       </w:r>
     </w:p>
     <w:p>
@@ -1264,23 +1282,7 @@
           <w:b w:val="false"/>
           <w:bCs w:val="false"/>
         </w:rPr>
-        <w:t>Make you</w:t>
-      </w:r>
-      <w:r>
-        <w:rPr>
-          <w:rFonts w:ascii="Liberation Sans" w:hAnsi="Liberation Sans"/>
-          <w:b w:val="false"/>
-          <w:bCs w:val="false"/>
-        </w:rPr>
-        <w:t>r</w:t>
-      </w:r>
-      <w:r>
-        <w:rPr>
-          <w:rFonts w:ascii="Liberation Sans" w:hAnsi="Liberation Sans"/>
-          <w:b w:val="false"/>
-          <w:bCs w:val="false"/>
-        </w:rPr>
-        <w:t xml:space="preserve"> changes and </w:t>
+        <w:t xml:space="preserve">Make your changes and </w:t>
       </w:r>
       <w:r>
         <w:rPr>
@@ -1296,26 +1298,20 @@
           <w:b w:val="false"/>
           <w:bCs w:val="false"/>
         </w:rPr>
-        <w:t xml:space="preserve"> them.  This will create the new branch.  </w:t>
-      </w:r>
-      <w:r>
-        <w:rPr>
-          <w:rFonts w:ascii="Liberation Sans" w:hAnsi="Liberation Sans"/>
-          <w:b w:val="false"/>
-          <w:bCs w:val="false"/>
-        </w:rPr>
-        <w:t>Furthjer changes are made in the new branch.</w:t>
-      </w:r>
-    </w:p>
-    <w:p>
-      <w:pPr>
-        <w:pStyle w:val="Normal"/>
-        <w:rPr>
-          <w:rFonts w:ascii="Liberation Sans" w:hAnsi="Liberation Sans"/>
-        </w:rPr>
-      </w:pPr>
-      <w:r>
-        <w:rPr/>
+        <w:t xml:space="preserve"> them.  This will create the new branch.  Furthjer changes are made in the new branch.</w:t>
+      </w:r>
+    </w:p>
+    <w:p>
+      <w:pPr>
+        <w:pStyle w:val="Normal"/>
+        <w:rPr>
+          <w:rFonts w:ascii="Liberation Sans" w:hAnsi="Liberation Sans"/>
+        </w:rPr>
+      </w:pPr>
+      <w:r>
+        <w:rPr>
+          <w:rFonts w:ascii="Liberation Sans" w:hAnsi="Liberation Sans"/>
+        </w:rPr>
       </w:r>
     </w:p>
     <w:p>
@@ -1347,23 +1343,7 @@
           <w:b w:val="false"/>
           <w:bCs w:val="false"/>
         </w:rPr>
-        <w:t xml:space="preserve"> your branch, switch to Defaul</w:t>
-      </w:r>
-      <w:r>
-        <w:rPr>
-          <w:rFonts w:ascii="Liberation Sans" w:hAnsi="Liberation Sans"/>
-          <w:b w:val="false"/>
-          <w:bCs w:val="false"/>
-        </w:rPr>
-        <w:t>t</w:t>
-      </w:r>
-      <w:r>
-        <w:rPr>
-          <w:rFonts w:ascii="Liberation Sans" w:hAnsi="Liberation Sans"/>
-          <w:b w:val="false"/>
-          <w:bCs w:val="false"/>
-        </w:rPr>
-        <w:t xml:space="preserve"> and </w:t>
+        <w:t xml:space="preserve"> your branch, switch to Default and </w:t>
       </w:r>
       <w:r>
         <w:rPr>
@@ -1379,15 +1359,7 @@
           <w:b w:val="false"/>
           <w:bCs w:val="false"/>
         </w:rPr>
-        <w:t xml:space="preserve"> from the new branch.  </w:t>
-      </w:r>
-      <w:r>
-        <w:rPr>
-          <w:rFonts w:ascii="Liberation Sans" w:hAnsi="Liberation Sans"/>
-          <w:b w:val="false"/>
-          <w:bCs w:val="false"/>
-        </w:rPr>
-        <w:t>Closing first avoids dangling heads.</w:t>
+        <w:t xml:space="preserve"> from the new branch.  Closing first avoids dangling heads.</w:t>
       </w:r>
     </w:p>
     <w:p>
@@ -1417,7 +1389,31 @@
         <w:rPr>
           <w:rFonts w:ascii="Liberation Sans" w:hAnsi="Liberation Sans"/>
         </w:rPr>
-        <w:t>Releasing a new version of XtrkCad, once the code is stable, feature complete and free of serious bugs:</w:t>
+        <w:t>Releasing a new version of X</w:t>
+      </w:r>
+      <w:r>
+        <w:rPr>
+          <w:rFonts w:ascii="Liberation Sans" w:hAnsi="Liberation Sans"/>
+        </w:rPr>
+        <w:t>T</w:t>
+      </w:r>
+      <w:r>
+        <w:rPr>
+          <w:rFonts w:ascii="Liberation Sans" w:hAnsi="Liberation Sans"/>
+        </w:rPr>
+        <w:t>r</w:t>
+      </w:r>
+      <w:r>
+        <w:rPr>
+          <w:rFonts w:ascii="Liberation Sans" w:hAnsi="Liberation Sans"/>
+        </w:rPr>
+        <w:t>ac</w:t>
+      </w:r>
+      <w:r>
+        <w:rPr>
+          <w:rFonts w:ascii="Liberation Sans" w:hAnsi="Liberation Sans"/>
+        </w:rPr>
+        <w:t>kCad, once the code is stable, feature complete and free of serious bugs:</w:t>
       </w:r>
     </w:p>
     <w:p>
@@ -1427,13 +1423,21 @@
           <w:ilvl w:val="0"/>
           <w:numId w:val="5"/>
         </w:numPr>
-        <w:rPr/>
-      </w:pPr>
-      <w:r>
-        <w:rPr>
-          <w:rFonts w:ascii="Liberation Sans" w:hAnsi="Liberation Sans"/>
-        </w:rPr>
-        <w:t xml:space="preserve">Update </w:t>
+        <w:rPr>
+          <w:rFonts w:ascii="Liberation Sans" w:hAnsi="Liberation Sans"/>
+        </w:rPr>
+      </w:pPr>
+      <w:r>
+        <w:rPr>
+          <w:rFonts w:ascii="Liberation Sans" w:hAnsi="Liberation Sans"/>
+        </w:rPr>
+        <w:t xml:space="preserve">Create </w:t>
+      </w:r>
+      <w:r>
+        <w:rPr>
+          <w:rFonts w:ascii="Liberation Sans" w:hAnsi="Liberation Sans"/>
+        </w:rPr>
+        <w:t xml:space="preserve">in a new branch (vX.Y.Z) which is branched from </w:t>
       </w:r>
       <w:r>
         <w:rPr>
@@ -1441,13 +1445,7 @@
           <w:b/>
           <w:bCs/>
         </w:rPr>
-        <w:t>$SRCDIR/</w:t>
-      </w:r>
-      <w:r>
-        <w:rPr>
-          <w:rFonts w:ascii="Liberation Sans" w:hAnsi="Liberation Sans"/>
-        </w:rPr>
-        <w:t>ProgramVersion.cmake with the new version number. XTRKCAD_VERSION_MODIFIER will be “Beta1”</w:t>
+        <w:t>default</w:t>
       </w:r>
     </w:p>
     <w:p>
@@ -1457,15 +1455,118 @@
           <w:ilvl w:val="0"/>
           <w:numId w:val="5"/>
         </w:numPr>
-        <w:rPr>
-          <w:rFonts w:ascii="Liberation Sans" w:hAnsi="Liberation Sans"/>
-        </w:rPr>
-      </w:pPr>
-      <w:r>
-        <w:rPr>
-          <w:rFonts w:ascii="Liberation Sans" w:hAnsi="Liberation Sans"/>
-        </w:rPr>
-        <w:t>Other stuff - TBD</w:t>
+        <w:rPr/>
+      </w:pPr>
+      <w:r>
+        <w:rPr>
+          <w:rStyle w:val="InternetLink"/>
+          <w:rFonts w:ascii="Liberation Sans" w:hAnsi="Liberation Sans"/>
+          <w:color w:val="000000"/>
+          <w:u w:val="none"/>
+        </w:rPr>
+        <w:t xml:space="preserve">Update </w:t>
+      </w:r>
+      <w:r>
+        <w:rPr>
+          <w:rStyle w:val="InternetLink"/>
+          <w:rFonts w:ascii="Liberation Sans" w:hAnsi="Liberation Sans"/>
+          <w:b w:val="false"/>
+          <w:bCs w:val="false"/>
+          <w:i/>
+          <w:iCs/>
+          <w:color w:val="000000"/>
+          <w:u w:val="none"/>
+        </w:rPr>
+        <w:t>$SRCDIR</w:t>
+      </w:r>
+      <w:r>
+        <w:rPr>
+          <w:rStyle w:val="InternetLink"/>
+          <w:rFonts w:ascii="Liberation Sans" w:hAnsi="Liberation Sans"/>
+          <w:b/>
+          <w:bCs/>
+          <w:i/>
+          <w:iCs/>
+          <w:color w:val="000000"/>
+          <w:u w:val="none"/>
+        </w:rPr>
+        <w:t>/</w:t>
+      </w:r>
+      <w:r>
+        <w:rPr>
+          <w:rStyle w:val="InternetLink"/>
+          <w:rFonts w:ascii="Liberation Sans" w:hAnsi="Liberation Sans"/>
+          <w:i/>
+          <w:iCs/>
+          <w:color w:val="000000"/>
+          <w:u w:val="none"/>
+        </w:rPr>
+        <w:t>ProgramVersion.cmake</w:t>
+      </w:r>
+      <w:r>
+        <w:rPr>
+          <w:rStyle w:val="InternetLink"/>
+          <w:rFonts w:ascii="Liberation Sans" w:hAnsi="Liberation Sans"/>
+          <w:color w:val="000000"/>
+          <w:u w:val="none"/>
+        </w:rPr>
+        <w:t xml:space="preserve">, in the </w:t>
+      </w:r>
+      <w:r>
+        <w:rPr>
+          <w:rStyle w:val="InternetLink"/>
+          <w:rFonts w:ascii="Liberation Sans" w:hAnsi="Liberation Sans"/>
+          <w:b/>
+          <w:bCs/>
+          <w:color w:val="000000"/>
+          <w:u w:val="none"/>
+        </w:rPr>
+        <w:t>default</w:t>
+      </w:r>
+      <w:r>
+        <w:rPr>
+          <w:rStyle w:val="InternetLink"/>
+          <w:rFonts w:ascii="Liberation Sans" w:hAnsi="Liberation Sans"/>
+          <w:color w:val="000000"/>
+          <w:u w:val="none"/>
+        </w:rPr>
+        <w:t xml:space="preserve"> branch, w</w:t>
+      </w:r>
+      <w:r>
+        <w:rPr>
+          <w:rStyle w:val="InternetLink"/>
+          <w:rFonts w:ascii="Liberation Sans" w:hAnsi="Liberation Sans"/>
+          <w:color w:val="000000"/>
+          <w:u w:val="none"/>
+        </w:rPr>
+        <w:t>it</w:t>
+      </w:r>
+      <w:r>
+        <w:rPr>
+          <w:rStyle w:val="InternetLink"/>
+          <w:rFonts w:ascii="Liberation Sans" w:hAnsi="Liberation Sans"/>
+          <w:color w:val="000000"/>
+          <w:u w:val="none"/>
+        </w:rPr>
+        <w:t xml:space="preserve">h the next </w:t>
+      </w:r>
+      <w:r>
+        <w:rPr>
+          <w:rStyle w:val="InternetLink"/>
+          <w:rFonts w:ascii="Liberation Sans" w:hAnsi="Liberation Sans"/>
+          <w:color w:val="000000"/>
+          <w:u w:val="none"/>
+        </w:rPr>
+        <w:t>3rd level</w:t>
+      </w:r>
+      <w:r>
+        <w:rPr>
+          <w:rStyle w:val="InternetLink"/>
+          <w:rFonts w:ascii="Liberation Sans" w:hAnsi="Liberation Sans"/>
+          <w:color w:val="000000"/>
+          <w:u w:val="none"/>
+        </w:rPr>
+        <w:t xml:space="preserve"> version number, by incrementing XTRKCAD_RELEASE_VERSION. XTRKCAD_VERSION_MODIFIER will be “Dev”.</w:t>
       </w:r>
     </w:p>
     <w:p>
@@ -1475,15 +1576,63 @@
           <w:ilvl w:val="0"/>
           <w:numId w:val="5"/>
         </w:numPr>
-        <w:rPr>
-          <w:rFonts w:ascii="Liberation Sans" w:hAnsi="Liberation Sans"/>
-        </w:rPr>
-      </w:pPr>
-      <w:r>
-        <w:rPr>
-          <w:rFonts w:ascii="Liberation Sans" w:hAnsi="Liberation Sans"/>
-        </w:rPr>
-        <w:t>All release changes are made in a new branch (vX.Y.Z) which is branched from ‘default’</w:t>
+        <w:rPr/>
+      </w:pPr>
+      <w:r>
+        <w:rPr>
+          <w:rFonts w:ascii="Liberation Sans" w:hAnsi="Liberation Sans"/>
+        </w:rPr>
+        <w:t xml:space="preserve">Update </w:t>
+      </w:r>
+      <w:r>
+        <w:rPr>
+          <w:rFonts w:ascii="Liberation Sans" w:hAnsi="Liberation Sans"/>
+          <w:b w:val="false"/>
+          <w:bCs w:val="false"/>
+          <w:i/>
+          <w:iCs/>
+        </w:rPr>
+        <w:t>$SRCDIR/</w:t>
+      </w:r>
+      <w:r>
+        <w:rPr>
+          <w:rFonts w:ascii="Liberation Sans" w:hAnsi="Liberation Sans"/>
+          <w:i/>
+          <w:iCs/>
+        </w:rPr>
+        <w:t>ProgramVersion.cmake</w:t>
+      </w:r>
+      <w:r>
+        <w:rPr>
+          <w:rFonts w:ascii="Liberation Sans" w:hAnsi="Liberation Sans"/>
+        </w:rPr>
+        <w:t xml:space="preserve">, </w:t>
+      </w:r>
+      <w:r>
+        <w:rPr>
+          <w:rFonts w:ascii="Liberation Sans" w:hAnsi="Liberation Sans"/>
+        </w:rPr>
+        <w:t xml:space="preserve">in the </w:t>
+      </w:r>
+      <w:r>
+        <w:rPr>
+          <w:rFonts w:ascii="Liberation Sans" w:hAnsi="Liberation Sans"/>
+          <w:b/>
+          <w:bCs/>
+        </w:rPr>
+        <w:t>new</w:t>
+      </w:r>
+      <w:r>
+        <w:rPr>
+          <w:rFonts w:ascii="Liberation Sans" w:hAnsi="Liberation Sans"/>
+        </w:rPr>
+        <w:t xml:space="preserve"> branch </w:t>
+      </w:r>
+      <w:r>
+        <w:rPr>
+          <w:rFonts w:ascii="Liberation Sans" w:hAnsi="Liberation Sans"/>
+        </w:rPr>
+        <w:t>with the new version number. XTRKCAD_VERSION_MODIFIER will be “Beta1”</w:t>
       </w:r>
     </w:p>
     <w:p>
@@ -1510,32 +1659,355 @@
           <w:t>https://xtrkcad-fork.sourceforge.net/Wikka/BuildNotes</w:t>
         </w:r>
       </w:hyperlink>
-    </w:p>
-    <w:p>
-      <w:pPr>
-        <w:pStyle w:val="Normal"/>
-        <w:rPr>
-          <w:rFonts w:ascii="Liberation Sans" w:hAnsi="Liberation Sans"/>
-        </w:rPr>
-      </w:pPr>
-      <w:r>
-        <w:rPr>
-          <w:rFonts w:ascii="Liberation Sans" w:hAnsi="Liberation Sans"/>
-        </w:rPr>
-      </w:r>
-    </w:p>
-    <w:p>
-      <w:pPr>
-        <w:pStyle w:val="Normal"/>
-        <w:rPr>
-          <w:rFonts w:ascii="Liberation Sans" w:hAnsi="Liberation Sans"/>
-        </w:rPr>
-      </w:pPr>
-      <w:r>
-        <w:rPr>
-          <w:rFonts w:ascii="Liberation Sans" w:hAnsi="Liberation Sans"/>
-        </w:rPr>
-        <w:t xml:space="preserve">This process is repeated for subsequent Betas, until all issues are resolved or defered.  XTRKCAD_VERSION_MODIFIER is incremented: Beta2, Beta3, ... </w:t>
+      <w:r>
+        <w:rPr>
+          <w:rStyle w:val="InternetLink"/>
+          <w:rFonts w:ascii="Liberation Sans" w:hAnsi="Liberation Sans"/>
+          <w:u w:val="none"/>
+        </w:rPr>
+        <w:t xml:space="preserve"> </w:t>
+      </w:r>
+    </w:p>
+    <w:p>
+      <w:pPr>
+        <w:pStyle w:val="Normal"/>
+        <w:numPr>
+          <w:ilvl w:val="0"/>
+          <w:numId w:val="5"/>
+        </w:numPr>
+        <w:rPr/>
+      </w:pPr>
+      <w:r>
+        <w:rPr>
+          <w:rStyle w:val="InternetLink"/>
+          <w:rFonts w:ascii="Liberation Sans" w:hAnsi="Liberation Sans"/>
+          <w:color w:val="000000"/>
+          <w:u w:val="none"/>
+        </w:rPr>
+        <w:t>Source tar balls are created and uploaded.</w:t>
+      </w:r>
+    </w:p>
+    <w:p>
+      <w:pPr>
+        <w:pStyle w:val="Normal"/>
+        <w:numPr>
+          <w:ilvl w:val="0"/>
+          <w:numId w:val="5"/>
+        </w:numPr>
+        <w:rPr/>
+      </w:pPr>
+      <w:r>
+        <w:rPr>
+          <w:rStyle w:val="InternetLink"/>
+          <w:rFonts w:ascii="Liberation Sans" w:hAnsi="Liberation Sans"/>
+          <w:color w:val="000000"/>
+          <w:u w:val="none"/>
+        </w:rPr>
+        <w:t xml:space="preserve">Update </w:t>
+      </w:r>
+      <w:r>
+        <w:rPr>
+          <w:rStyle w:val="InternetLink"/>
+          <w:rFonts w:ascii="Liberation Sans" w:hAnsi="Liberation Sans"/>
+          <w:i/>
+          <w:iCs/>
+          <w:color w:val="000000"/>
+          <w:u w:val="none"/>
+        </w:rPr>
+        <w:t xml:space="preserve">CHANGES.md, </w:t>
+      </w:r>
+      <w:r>
+        <w:rPr>
+          <w:rStyle w:val="InternetLink"/>
+          <w:rFonts w:ascii="Liberation Sans" w:hAnsi="Liberation Sans"/>
+          <w:i/>
+          <w:iCs/>
+          <w:color w:val="000000"/>
+          <w:u w:val="none"/>
+        </w:rPr>
+        <w:t>Readme.md</w:t>
+      </w:r>
+      <w:r>
+        <w:rPr>
+          <w:rStyle w:val="InternetLink"/>
+          <w:rFonts w:ascii="Liberation Sans" w:hAnsi="Liberation Sans"/>
+          <w:color w:val="000000"/>
+          <w:u w:val="none"/>
+        </w:rPr>
+        <w:t xml:space="preserve"> </w:t>
+      </w:r>
+      <w:r>
+        <w:rPr>
+          <w:rStyle w:val="InternetLink"/>
+          <w:rFonts w:ascii="Liberation Sans" w:hAnsi="Liberation Sans"/>
+          <w:color w:val="000000"/>
+          <w:u w:val="none"/>
+        </w:rPr>
+        <w:t xml:space="preserve">in </w:t>
+      </w:r>
+      <w:r>
+        <w:rPr>
+          <w:rStyle w:val="InternetLink"/>
+          <w:rFonts w:ascii="Liberation Sans" w:hAnsi="Liberation Sans"/>
+          <w:b w:val="false"/>
+          <w:bCs w:val="false"/>
+          <w:i/>
+          <w:iCs/>
+          <w:color w:val="000000"/>
+          <w:u w:val="none"/>
+        </w:rPr>
+        <w:t>$SRCDIR</w:t>
+      </w:r>
+      <w:r>
+        <w:rPr>
+          <w:rStyle w:val="InternetLink"/>
+          <w:rFonts w:ascii="Liberation Sans" w:hAnsi="Liberation Sans"/>
+          <w:i/>
+          <w:iCs/>
+          <w:color w:val="000000"/>
+          <w:u w:val="none"/>
+        </w:rPr>
+        <w:t>/</w:t>
+      </w:r>
+      <w:r>
+        <w:rPr>
+          <w:rStyle w:val="InternetLink"/>
+          <w:rFonts w:ascii="Liberation Sans" w:hAnsi="Liberation Sans"/>
+          <w:i/>
+          <w:iCs/>
+          <w:color w:val="000000"/>
+          <w:u w:val="none"/>
+        </w:rPr>
+        <w:t>app/lib</w:t>
+      </w:r>
+      <w:r>
+        <w:rPr>
+          <w:rStyle w:val="InternetLink"/>
+          <w:rFonts w:ascii="Liberation Sans" w:hAnsi="Liberation Sans"/>
+          <w:color w:val="000000"/>
+          <w:u w:val="none"/>
+        </w:rPr>
+        <w:t xml:space="preserve"> and upload</w:t>
+      </w:r>
+      <w:r>
+        <w:rPr>
+          <w:rStyle w:val="InternetLink"/>
+          <w:rFonts w:ascii="Liberation Sans" w:hAnsi="Liberation Sans"/>
+          <w:color w:val="000000"/>
+          <w:u w:val="none"/>
+        </w:rPr>
+        <w:t>.</w:t>
+      </w:r>
+    </w:p>
+    <w:p>
+      <w:pPr>
+        <w:pStyle w:val="Normal"/>
+        <w:numPr>
+          <w:ilvl w:val="0"/>
+          <w:numId w:val="5"/>
+        </w:numPr>
+        <w:rPr/>
+      </w:pPr>
+      <w:r>
+        <w:rPr>
+          <w:rStyle w:val="InternetLink"/>
+          <w:rFonts w:ascii="Liberation Sans" w:hAnsi="Liberation Sans"/>
+          <w:color w:val="000000"/>
+          <w:u w:val="none"/>
+        </w:rPr>
+        <w:t xml:space="preserve">Update the XTrackCad Manual (see </w:t>
+      </w:r>
+      <w:r>
+        <w:rPr>
+          <w:rStyle w:val="InternetLink"/>
+          <w:rFonts w:ascii="Liberation Sans" w:hAnsi="Liberation Sans"/>
+          <w:i/>
+          <w:iCs/>
+          <w:color w:val="000000"/>
+          <w:u w:val="none"/>
+        </w:rPr>
+        <w:t>$SRCDIR/app/doc/mk-xtrkcad-manual-htm</w:t>
+      </w:r>
+      <w:r>
+        <w:rPr>
+          <w:rStyle w:val="InternetLink"/>
+          <w:rFonts w:ascii="Liberation Sans" w:hAnsi="Liberation Sans"/>
+          <w:color w:val="000000"/>
+          <w:u w:val="none"/>
+        </w:rPr>
+        <w:t>l) and upload</w:t>
+      </w:r>
+      <w:r>
+        <w:rPr>
+          <w:rStyle w:val="InternetLink"/>
+          <w:rFonts w:ascii="Liberation Sans" w:hAnsi="Liberation Sans"/>
+          <w:color w:val="000000"/>
+          <w:u w:val="none"/>
+        </w:rPr>
+        <w:t>.</w:t>
+      </w:r>
+    </w:p>
+    <w:p>
+      <w:pPr>
+        <w:pStyle w:val="Normal"/>
+        <w:numPr>
+          <w:ilvl w:val="0"/>
+          <w:numId w:val="5"/>
+        </w:numPr>
+        <w:rPr/>
+      </w:pPr>
+      <w:r>
+        <w:rPr>
+          <w:rStyle w:val="InternetLink"/>
+          <w:rFonts w:ascii="Liberation Sans" w:hAnsi="Liberation Sans"/>
+          <w:color w:val="000000"/>
+          <w:u w:val="none"/>
+        </w:rPr>
+        <w:t xml:space="preserve">Update the 'XTrackCAD Version' </w:t>
+      </w:r>
+      <w:r>
+        <w:rPr>
+          <w:rStyle w:val="InternetLink"/>
+          <w:rFonts w:ascii="Liberation Sans" w:hAnsi="Liberation Sans"/>
+          <w:color w:val="000000"/>
+          <w:u w:val="none"/>
+        </w:rPr>
+        <w:t xml:space="preserve">field </w:t>
+      </w:r>
+      <w:r>
+        <w:rPr>
+          <w:rStyle w:val="InternetLink"/>
+          <w:rFonts w:ascii="Liberation Sans" w:hAnsi="Liberation Sans"/>
+          <w:color w:val="000000"/>
+          <w:u w:val="none"/>
+        </w:rPr>
+        <w:t xml:space="preserve">with the new version at </w:t>
+      </w:r>
+      <w:r>
+        <w:rPr>
+          <w:rStyle w:val="InternetLink"/>
+          <w:rFonts w:ascii="Liberation Sans" w:hAnsi="Liberation Sans"/>
+          <w:color w:val="000000"/>
+          <w:u w:val="none"/>
+        </w:rPr>
+        <w:t xml:space="preserve">the </w:t>
+      </w:r>
+      <w:hyperlink r:id="rId6">
+        <w:r>
+          <w:rPr>
+            <w:rStyle w:val="InternetLink"/>
+            <w:rFonts w:ascii="Liberation Sans" w:hAnsi="Liberation Sans"/>
+            <w:color w:val="000000"/>
+            <w:u w:val="none"/>
+          </w:rPr>
+          <w:t xml:space="preserve">SourceForge Bug Field Managment </w:t>
+        </w:r>
+      </w:hyperlink>
+      <w:r>
+        <w:rPr>
+          <w:rStyle w:val="InternetLink"/>
+          <w:rFonts w:ascii="Liberation Sans" w:hAnsi="Liberation Sans"/>
+          <w:color w:val="000000"/>
+          <w:u w:val="none"/>
+        </w:rPr>
+        <w:t xml:space="preserve"> </w:t>
+      </w:r>
+      <w:r>
+        <w:rPr>
+          <w:rStyle w:val="InternetLink"/>
+          <w:rFonts w:ascii="Liberation Sans" w:hAnsi="Liberation Sans"/>
+          <w:color w:val="000000"/>
+          <w:u w:val="none"/>
+        </w:rPr>
+        <w:t>page</w:t>
+      </w:r>
+    </w:p>
+    <w:p>
+      <w:pPr>
+        <w:pStyle w:val="Normal"/>
+        <w:numPr>
+          <w:ilvl w:val="0"/>
+          <w:numId w:val="5"/>
+        </w:numPr>
+        <w:rPr/>
+      </w:pPr>
+      <w:r>
+        <w:rPr>
+          <w:rStyle w:val="InternetLink"/>
+          <w:rFonts w:ascii="Liberation Sans" w:hAnsi="Liberation Sans"/>
+          <w:color w:val="000000"/>
+          <w:u w:val="none"/>
+        </w:rPr>
+        <w:t xml:space="preserve">Announce </w:t>
+      </w:r>
+      <w:r>
+        <w:rPr>
+          <w:rStyle w:val="InternetLink"/>
+          <w:rFonts w:ascii="Liberation Sans" w:hAnsi="Liberation Sans"/>
+          <w:color w:val="000000"/>
+          <w:u w:val="none"/>
+        </w:rPr>
+        <w:t xml:space="preserve">the </w:t>
+      </w:r>
+      <w:r>
+        <w:rPr>
+          <w:rStyle w:val="InternetLink"/>
+          <w:rFonts w:ascii="Liberation Sans" w:hAnsi="Liberation Sans"/>
+          <w:color w:val="000000"/>
+          <w:u w:val="none"/>
+        </w:rPr>
+        <w:t>new release on the XTrackCad mailing litst.</w:t>
+      </w:r>
+    </w:p>
+    <w:p>
+      <w:pPr>
+        <w:pStyle w:val="Normal"/>
+        <w:rPr>
+          <w:rFonts w:ascii="Liberation Sans" w:hAnsi="Liberation Sans"/>
+        </w:rPr>
+      </w:pPr>
+      <w:r>
+        <w:rPr>
+          <w:rFonts w:ascii="Liberation Sans" w:hAnsi="Liberation Sans"/>
+        </w:rPr>
+      </w:r>
+    </w:p>
+    <w:p>
+      <w:pPr>
+        <w:pStyle w:val="Normal"/>
+        <w:rPr>
+          <w:rFonts w:ascii="Liberation Sans" w:hAnsi="Liberation Sans"/>
+        </w:rPr>
+      </w:pPr>
+      <w:r>
+        <w:rPr>
+          <w:rFonts w:ascii="Liberation Sans" w:hAnsi="Liberation Sans"/>
+        </w:rPr>
+        <w:t xml:space="preserve">This process </w:t>
+      </w:r>
+      <w:r>
+        <w:rPr>
+          <w:rFonts w:ascii="Liberation Sans" w:hAnsi="Liberation Sans"/>
+        </w:rPr>
+        <w:t xml:space="preserve">(except for the first </w:t>
+      </w:r>
+      <w:r>
+        <w:rPr>
+          <w:rFonts w:ascii="Liberation Sans" w:hAnsi="Liberation Sans"/>
+        </w:rPr>
+        <w:t>two</w:t>
+      </w:r>
+      <w:r>
+        <w:rPr>
+          <w:rFonts w:ascii="Liberation Sans" w:hAnsi="Liberation Sans"/>
+        </w:rPr>
+        <w:t xml:space="preserve"> actions) </w:t>
+      </w:r>
+      <w:r>
+        <w:rPr>
+          <w:rFonts w:ascii="Liberation Sans" w:hAnsi="Liberation Sans"/>
+        </w:rPr>
+        <w:t xml:space="preserve">is repeated for subsequent Betas, until all issues are resolved or defered.  XTRKCAD_VERSION_MODIFIER is incremented: Beta2, Beta3, ... </w:t>
       </w:r>
     </w:p>
     <w:p>
@@ -1616,9 +2088,1649 @@
         <w:rPr>
           <w:rFonts w:ascii="Liberation Sans" w:hAnsi="Liberation Sans"/>
         </w:rPr>
-        <w:t>The same branch is used fo all builds.  A tag is created for each build: vX.Y.Z-B1..., vX.Y.Z-GA, vX.Y.Z-HS1...</w:t>
-      </w:r>
-    </w:p>
+        <w:t>The same branch is used fo</w:t>
+      </w:r>
+      <w:r>
+        <w:rPr>
+          <w:rFonts w:ascii="Liberation Sans" w:hAnsi="Liberation Sans"/>
+        </w:rPr>
+        <w:t>r</w:t>
+      </w:r>
+      <w:r>
+        <w:rPr>
+          <w:rFonts w:ascii="Liberation Sans" w:hAnsi="Liberation Sans"/>
+        </w:rPr>
+        <w:t xml:space="preserve"> all </w:t>
+      </w:r>
+      <w:r>
+        <w:rPr>
+          <w:rFonts w:ascii="Liberation Sans" w:hAnsi="Liberation Sans"/>
+        </w:rPr>
+        <w:t>releases</w:t>
+      </w:r>
+      <w:r>
+        <w:rPr>
+          <w:rFonts w:ascii="Liberation Sans" w:hAnsi="Liberation Sans"/>
+        </w:rPr>
+        <w:t>.  A tag is created for each build: vX.Y.Z-B1..., vX.Y.Z-GA, vX.Y.Z-HS1...</w:t>
+      </w:r>
+    </w:p>
+    <w:p>
+      <w:pPr>
+        <w:pStyle w:val="Normal"/>
+        <w:rPr>
+          <w:rFonts w:ascii="Liberation Sans" w:hAnsi="Liberation Sans"/>
+        </w:rPr>
+      </w:pPr>
+      <w:r>
+        <w:rPr/>
+      </w:r>
+    </w:p>
+    <w:p>
+      <w:pPr>
+        <w:pStyle w:val="Normal"/>
+        <w:rPr>
+          <w:b/>
+          <w:b/>
+          <w:bCs/>
+        </w:rPr>
+      </w:pPr>
+      <w:r>
+        <w:rPr>
+          <w:rFonts w:ascii="Liberation Sans" w:hAnsi="Liberation Sans"/>
+          <w:b/>
+          <w:bCs/>
+        </w:rPr>
+        <w:t xml:space="preserve">Version string </w:t>
+      </w:r>
+      <w:r>
+        <w:rPr>
+          <w:rFonts w:ascii="Liberation Sans" w:hAnsi="Liberation Sans"/>
+          <w:b/>
+          <w:bCs/>
+        </w:rPr>
+        <w:t>sequence</w:t>
+      </w:r>
+    </w:p>
+    <w:p>
+      <w:pPr>
+        <w:pStyle w:val="Normal"/>
+        <w:rPr>
+          <w:b w:val="false"/>
+          <w:b w:val="false"/>
+          <w:bCs w:val="false"/>
+        </w:rPr>
+      </w:pPr>
+      <w:r>
+        <w:rPr>
+          <w:rFonts w:ascii="Liberation Sans" w:hAnsi="Liberation Sans"/>
+          <w:b w:val="false"/>
+          <w:bCs w:val="false"/>
+        </w:rPr>
+        <w:t>V</w:t>
+      </w:r>
+      <w:r>
+        <w:rPr>
+          <w:rFonts w:ascii="Liberation Sans" w:hAnsi="Liberation Sans"/>
+          <w:b w:val="false"/>
+          <w:bCs w:val="false"/>
+        </w:rPr>
+        <w:t>ersion numbers are for illustration.</w:t>
+      </w:r>
+    </w:p>
+    <w:p>
+      <w:pPr>
+        <w:pStyle w:val="Normal"/>
+        <w:rPr>
+          <w:rFonts w:ascii="Liberation Sans" w:hAnsi="Liberation Sans"/>
+          <w:b w:val="false"/>
+          <w:b w:val="false"/>
+          <w:bCs w:val="false"/>
+        </w:rPr>
+      </w:pPr>
+      <w:r>
+        <w:rPr>
+          <w:rFonts w:ascii="Liberation Sans" w:hAnsi="Liberation Sans"/>
+          <w:b w:val="false"/>
+          <w:bCs w:val="false"/>
+        </w:rPr>
+        <w:t xml:space="preserve">The choice </w:t>
+      </w:r>
+      <w:r>
+        <w:rPr>
+          <w:rFonts w:ascii="Liberation Sans" w:hAnsi="Liberation Sans"/>
+          <w:b w:val="false"/>
+          <w:bCs w:val="false"/>
+        </w:rPr>
+        <w:t>of</w:t>
+      </w:r>
+      <w:r>
+        <w:rPr>
+          <w:rFonts w:ascii="Liberation Sans" w:hAnsi="Liberation Sans"/>
+          <w:b w:val="false"/>
+          <w:bCs w:val="false"/>
+        </w:rPr>
+        <w:t xml:space="preserve"> release level is made when </w:t>
+      </w:r>
+      <w:r>
+        <w:rPr>
+          <w:rFonts w:ascii="Liberation Sans" w:hAnsi="Liberation Sans"/>
+          <w:b w:val="false"/>
+          <w:bCs w:val="false"/>
+        </w:rPr>
+        <w:t>the first Beta is released</w:t>
+      </w:r>
+    </w:p>
+    <w:p>
+      <w:pPr>
+        <w:pStyle w:val="Normal"/>
+        <w:numPr>
+          <w:ilvl w:val="0"/>
+          <w:numId w:val="6"/>
+        </w:numPr>
+        <w:rPr>
+          <w:rFonts w:ascii="Liberation Sans" w:hAnsi="Liberation Sans"/>
+          <w:b w:val="false"/>
+          <w:b w:val="false"/>
+          <w:bCs w:val="false"/>
+        </w:rPr>
+      </w:pPr>
+      <w:r>
+        <w:rPr>
+          <w:rFonts w:ascii="Liberation Sans" w:hAnsi="Liberation Sans"/>
+          <w:b w:val="false"/>
+          <w:bCs w:val="false"/>
+        </w:rPr>
+        <w:t>1</w:t>
+      </w:r>
+      <w:r>
+        <w:rPr>
+          <w:rFonts w:ascii="Liberation Sans" w:hAnsi="Liberation Sans"/>
+          <w:b w:val="false"/>
+          <w:bCs w:val="false"/>
+          <w:vertAlign w:val="superscript"/>
+        </w:rPr>
+        <w:t>st</w:t>
+      </w:r>
+      <w:r>
+        <w:rPr>
+          <w:rFonts w:ascii="Liberation Sans" w:hAnsi="Liberation Sans"/>
+          <w:b w:val="false"/>
+          <w:bCs w:val="false"/>
+        </w:rPr>
+        <w:t xml:space="preserve"> level: major UI, technological or organizational changes</w:t>
+      </w:r>
+    </w:p>
+    <w:p>
+      <w:pPr>
+        <w:pStyle w:val="Normal"/>
+        <w:numPr>
+          <w:ilvl w:val="0"/>
+          <w:numId w:val="6"/>
+        </w:numPr>
+        <w:rPr>
+          <w:rFonts w:ascii="Liberation Sans" w:hAnsi="Liberation Sans"/>
+          <w:b w:val="false"/>
+          <w:b w:val="false"/>
+          <w:bCs w:val="false"/>
+        </w:rPr>
+      </w:pPr>
+      <w:r>
+        <w:rPr>
+          <w:rFonts w:ascii="Liberation Sans" w:hAnsi="Liberation Sans"/>
+          <w:b w:val="false"/>
+          <w:bCs w:val="false"/>
+        </w:rPr>
+        <w:t>2</w:t>
+      </w:r>
+      <w:r>
+        <w:rPr>
+          <w:rFonts w:ascii="Liberation Sans" w:hAnsi="Liberation Sans"/>
+          <w:b w:val="false"/>
+          <w:bCs w:val="false"/>
+          <w:vertAlign w:val="superscript"/>
+        </w:rPr>
+        <w:t>nd</w:t>
+      </w:r>
+      <w:r>
+        <w:rPr>
+          <w:rFonts w:ascii="Liberation Sans" w:hAnsi="Liberation Sans"/>
+          <w:b w:val="false"/>
+          <w:bCs w:val="false"/>
+        </w:rPr>
+        <w:t xml:space="preserve"> level: significant new functionality, </w:t>
+      </w:r>
+      <w:r>
+        <w:rPr>
+          <w:rFonts w:ascii="Liberation Sans" w:hAnsi="Liberation Sans"/>
+          <w:b w:val="false"/>
+          <w:bCs w:val="false"/>
+        </w:rPr>
+        <w:t>major redesign</w:t>
+      </w:r>
+    </w:p>
+    <w:p>
+      <w:pPr>
+        <w:pStyle w:val="Normal"/>
+        <w:numPr>
+          <w:ilvl w:val="0"/>
+          <w:numId w:val="6"/>
+        </w:numPr>
+        <w:rPr>
+          <w:rFonts w:ascii="Liberation Sans" w:hAnsi="Liberation Sans"/>
+          <w:b w:val="false"/>
+          <w:b w:val="false"/>
+          <w:bCs w:val="false"/>
+        </w:rPr>
+      </w:pPr>
+      <w:r>
+        <w:rPr>
+          <w:rFonts w:ascii="Liberation Sans" w:hAnsi="Liberation Sans"/>
+          <w:b w:val="false"/>
+          <w:bCs w:val="false"/>
+        </w:rPr>
+        <w:t>3</w:t>
+      </w:r>
+      <w:r>
+        <w:rPr>
+          <w:rFonts w:ascii="Liberation Sans" w:hAnsi="Liberation Sans"/>
+          <w:b w:val="false"/>
+          <w:bCs w:val="false"/>
+          <w:vertAlign w:val="superscript"/>
+        </w:rPr>
+        <w:t>rd</w:t>
+      </w:r>
+      <w:r>
+        <w:rPr>
+          <w:rFonts w:ascii="Liberation Sans" w:hAnsi="Liberation Sans"/>
+          <w:b w:val="false"/>
+          <w:bCs w:val="false"/>
+        </w:rPr>
+        <w:t xml:space="preserve"> level: bug fixes, minor functionality</w:t>
+      </w:r>
+    </w:p>
+    <w:p>
+      <w:pPr>
+        <w:pStyle w:val="Normal"/>
+        <w:rPr>
+          <w:rFonts w:ascii="Liberation Sans" w:hAnsi="Liberation Sans"/>
+          <w:b w:val="false"/>
+          <w:b w:val="false"/>
+          <w:bCs w:val="false"/>
+        </w:rPr>
+      </w:pPr>
+      <w:r>
+        <w:rPr>
+          <w:rFonts w:ascii="Liberation Sans" w:hAnsi="Liberation Sans"/>
+          <w:b w:val="false"/>
+          <w:bCs w:val="false"/>
+        </w:rPr>
+        <w:t>This shows the sequence for a minor (3</w:t>
+      </w:r>
+      <w:r>
+        <w:rPr>
+          <w:rFonts w:ascii="Liberation Sans" w:hAnsi="Liberation Sans"/>
+          <w:b w:val="false"/>
+          <w:bCs w:val="false"/>
+          <w:vertAlign w:val="superscript"/>
+        </w:rPr>
+        <w:t>rd</w:t>
+      </w:r>
+      <w:r>
+        <w:rPr>
+          <w:rFonts w:ascii="Liberation Sans" w:hAnsi="Liberation Sans"/>
+          <w:b w:val="false"/>
+          <w:bCs w:val="false"/>
+        </w:rPr>
+        <w:t xml:space="preserve"> level) release.</w:t>
+      </w:r>
+    </w:p>
+    <w:tbl>
+      <w:tblPr>
+        <w:tblW w:w="7140" w:type="dxa"/>
+        <w:jc w:val="left"/>
+        <w:tblInd w:w="55" w:type="dxa"/>
+        <w:tblLayout w:type="fixed"/>
+        <w:tblCellMar>
+          <w:top w:w="55" w:type="dxa"/>
+          <w:left w:w="55" w:type="dxa"/>
+          <w:bottom w:w="55" w:type="dxa"/>
+          <w:right w:w="55" w:type="dxa"/>
+        </w:tblCellMar>
+      </w:tblPr>
+      <w:tblGrid>
+        <w:gridCol w:w="3000"/>
+        <w:gridCol w:w="1365"/>
+        <w:gridCol w:w="1365"/>
+        <w:gridCol w:w="1410"/>
+      </w:tblGrid>
+      <w:tr>
+        <w:trPr/>
+        <w:tc>
+          <w:tcPr>
+            <w:tcW w:w="3000" w:type="dxa"/>
+            <w:tcBorders>
+              <w:top w:val="single" w:sz="4" w:space="0" w:color="000000"/>
+              <w:left w:val="single" w:sz="4" w:space="0" w:color="000000"/>
+              <w:bottom w:val="single" w:sz="4" w:space="0" w:color="000000"/>
+            </w:tcBorders>
+          </w:tcPr>
+          <w:p>
+            <w:pPr>
+              <w:pStyle w:val="TableContents"/>
+              <w:rPr/>
+            </w:pPr>
+            <w:r>
+              <w:rPr/>
+              <w:t>E</w:t>
+            </w:r>
+            <w:r>
+              <w:rPr/>
+              <w:t>vent</w:t>
+            </w:r>
+          </w:p>
+        </w:tc>
+        <w:tc>
+          <w:tcPr>
+            <w:tcW w:w="1365" w:type="dxa"/>
+            <w:tcBorders>
+              <w:top w:val="single" w:sz="4" w:space="0" w:color="000000"/>
+              <w:left w:val="single" w:sz="4" w:space="0" w:color="000000"/>
+              <w:bottom w:val="single" w:sz="4" w:space="0" w:color="000000"/>
+            </w:tcBorders>
+          </w:tcPr>
+          <w:p>
+            <w:pPr>
+              <w:pStyle w:val="TableContents"/>
+              <w:rPr/>
+            </w:pPr>
+            <w:r>
+              <w:rPr/>
+              <w:t>Rlse Version</w:t>
+            </w:r>
+          </w:p>
+        </w:tc>
+        <w:tc>
+          <w:tcPr>
+            <w:tcW w:w="1365" w:type="dxa"/>
+            <w:tcBorders>
+              <w:top w:val="single" w:sz="4" w:space="0" w:color="000000"/>
+              <w:left w:val="single" w:sz="4" w:space="0" w:color="000000"/>
+              <w:bottom w:val="single" w:sz="4" w:space="0" w:color="000000"/>
+            </w:tcBorders>
+          </w:tcPr>
+          <w:p>
+            <w:pPr>
+              <w:pStyle w:val="TableContents"/>
+              <w:rPr/>
+            </w:pPr>
+            <w:r>
+              <w:rPr/>
+              <w:t>Beta Version</w:t>
+            </w:r>
+          </w:p>
+        </w:tc>
+        <w:tc>
+          <w:tcPr>
+            <w:tcW w:w="1410" w:type="dxa"/>
+            <w:tcBorders>
+              <w:top w:val="single" w:sz="4" w:space="0" w:color="000000"/>
+              <w:left w:val="single" w:sz="4" w:space="0" w:color="000000"/>
+              <w:bottom w:val="single" w:sz="4" w:space="0" w:color="000000"/>
+              <w:right w:val="single" w:sz="4" w:space="0" w:color="000000"/>
+            </w:tcBorders>
+          </w:tcPr>
+          <w:p>
+            <w:pPr>
+              <w:pStyle w:val="TableContents"/>
+              <w:rPr/>
+            </w:pPr>
+            <w:r>
+              <w:rPr/>
+              <w:t>Dev</w:t>
+            </w:r>
+            <w:r>
+              <w:rPr/>
+              <w:t xml:space="preserve"> Version</w:t>
+            </w:r>
+          </w:p>
+        </w:tc>
+      </w:tr>
+      <w:tr>
+        <w:trPr/>
+        <w:tc>
+          <w:tcPr>
+            <w:tcW w:w="3000" w:type="dxa"/>
+            <w:tcBorders>
+              <w:left w:val="single" w:sz="4" w:space="0" w:color="000000"/>
+              <w:bottom w:val="single" w:sz="4" w:space="0" w:color="000000"/>
+            </w:tcBorders>
+          </w:tcPr>
+          <w:p>
+            <w:pPr>
+              <w:pStyle w:val="TableContents"/>
+              <w:rPr/>
+            </w:pPr>
+            <w:r>
+              <w:rPr/>
+              <w:t>Normal dev, between releases</w:t>
+            </w:r>
+          </w:p>
+        </w:tc>
+        <w:tc>
+          <w:tcPr>
+            <w:tcW w:w="1365" w:type="dxa"/>
+            <w:tcBorders>
+              <w:left w:val="single" w:sz="4" w:space="0" w:color="000000"/>
+              <w:bottom w:val="single" w:sz="4" w:space="0" w:color="000000"/>
+            </w:tcBorders>
+          </w:tcPr>
+          <w:p>
+            <w:pPr>
+              <w:pStyle w:val="TableContents"/>
+              <w:rPr/>
+            </w:pPr>
+            <w:r>
+              <w:rPr/>
+              <w:t>5.6.</w:t>
+            </w:r>
+            <w:r>
+              <w:rPr/>
+              <w:t>2GA</w:t>
+            </w:r>
+          </w:p>
+        </w:tc>
+        <w:tc>
+          <w:tcPr>
+            <w:tcW w:w="1365" w:type="dxa"/>
+            <w:tcBorders>
+              <w:left w:val="single" w:sz="4" w:space="0" w:color="000000"/>
+              <w:bottom w:val="single" w:sz="4" w:space="0" w:color="000000"/>
+            </w:tcBorders>
+          </w:tcPr>
+          <w:p>
+            <w:pPr>
+              <w:pStyle w:val="TableContents"/>
+              <w:rPr/>
+            </w:pPr>
+            <w:r>
+              <w:rPr/>
+              <w:t>N/A</w:t>
+            </w:r>
+          </w:p>
+        </w:tc>
+        <w:tc>
+          <w:tcPr>
+            <w:tcW w:w="1410" w:type="dxa"/>
+            <w:tcBorders>
+              <w:left w:val="single" w:sz="4" w:space="0" w:color="000000"/>
+              <w:bottom w:val="single" w:sz="4" w:space="0" w:color="000000"/>
+              <w:right w:val="single" w:sz="4" w:space="0" w:color="000000"/>
+            </w:tcBorders>
+          </w:tcPr>
+          <w:p>
+            <w:pPr>
+              <w:pStyle w:val="TableContents"/>
+              <w:rPr/>
+            </w:pPr>
+            <w:r>
+              <w:rPr/>
+              <w:t>5.6.</w:t>
+            </w:r>
+            <w:r>
+              <w:rPr/>
+              <w:t>3Dev</w:t>
+            </w:r>
+          </w:p>
+        </w:tc>
+      </w:tr>
+      <w:tr>
+        <w:trPr/>
+        <w:tc>
+          <w:tcPr>
+            <w:tcW w:w="3000" w:type="dxa"/>
+            <w:tcBorders>
+              <w:left w:val="single" w:sz="4" w:space="0" w:color="000000"/>
+              <w:bottom w:val="single" w:sz="4" w:space="0" w:color="000000"/>
+            </w:tcBorders>
+          </w:tcPr>
+          <w:p>
+            <w:pPr>
+              <w:pStyle w:val="TableContents"/>
+              <w:rPr/>
+            </w:pPr>
+            <w:r>
+              <w:rPr/>
+              <w:t>Start Release - Beta1</w:t>
+            </w:r>
+          </w:p>
+        </w:tc>
+        <w:tc>
+          <w:tcPr>
+            <w:tcW w:w="1365" w:type="dxa"/>
+            <w:tcBorders>
+              <w:left w:val="single" w:sz="4" w:space="0" w:color="000000"/>
+              <w:bottom w:val="single" w:sz="4" w:space="0" w:color="000000"/>
+            </w:tcBorders>
+          </w:tcPr>
+          <w:p>
+            <w:pPr>
+              <w:pStyle w:val="TableContents"/>
+              <w:rPr/>
+            </w:pPr>
+            <w:r>
+              <w:rPr/>
+              <w:t>5.6.2GA</w:t>
+            </w:r>
+          </w:p>
+        </w:tc>
+        <w:tc>
+          <w:tcPr>
+            <w:tcW w:w="1365" w:type="dxa"/>
+            <w:tcBorders>
+              <w:left w:val="single" w:sz="4" w:space="0" w:color="000000"/>
+              <w:bottom w:val="single" w:sz="4" w:space="0" w:color="000000"/>
+            </w:tcBorders>
+          </w:tcPr>
+          <w:p>
+            <w:pPr>
+              <w:pStyle w:val="TableContents"/>
+              <w:rPr>
+                <w:b/>
+                <w:b/>
+                <w:bCs/>
+              </w:rPr>
+            </w:pPr>
+            <w:r>
+              <w:rPr>
+                <w:b/>
+                <w:bCs/>
+              </w:rPr>
+              <w:t>5.6.3</w:t>
+            </w:r>
+            <w:r>
+              <w:rPr>
+                <w:b/>
+                <w:bCs/>
+              </w:rPr>
+              <w:t>Beta1</w:t>
+            </w:r>
+          </w:p>
+        </w:tc>
+        <w:tc>
+          <w:tcPr>
+            <w:tcW w:w="1410" w:type="dxa"/>
+            <w:tcBorders>
+              <w:left w:val="single" w:sz="4" w:space="0" w:color="000000"/>
+              <w:bottom w:val="single" w:sz="4" w:space="0" w:color="000000"/>
+              <w:right w:val="single" w:sz="4" w:space="0" w:color="000000"/>
+            </w:tcBorders>
+          </w:tcPr>
+          <w:p>
+            <w:pPr>
+              <w:pStyle w:val="TableContents"/>
+              <w:rPr>
+                <w:b/>
+                <w:b/>
+                <w:bCs/>
+              </w:rPr>
+            </w:pPr>
+            <w:r>
+              <w:rPr>
+                <w:b/>
+                <w:bCs/>
+              </w:rPr>
+              <w:t>5.6.</w:t>
+            </w:r>
+            <w:r>
+              <w:rPr>
+                <w:b/>
+                <w:bCs/>
+              </w:rPr>
+              <w:t>4Dev</w:t>
+            </w:r>
+          </w:p>
+        </w:tc>
+      </w:tr>
+      <w:tr>
+        <w:trPr/>
+        <w:tc>
+          <w:tcPr>
+            <w:tcW w:w="3000" w:type="dxa"/>
+            <w:tcBorders>
+              <w:left w:val="single" w:sz="4" w:space="0" w:color="000000"/>
+              <w:bottom w:val="single" w:sz="4" w:space="0" w:color="000000"/>
+            </w:tcBorders>
+          </w:tcPr>
+          <w:p>
+            <w:pPr>
+              <w:pStyle w:val="TableContents"/>
+              <w:rPr/>
+            </w:pPr>
+            <w:r>
+              <w:rPr/>
+              <w:t>Beta2</w:t>
+            </w:r>
+          </w:p>
+        </w:tc>
+        <w:tc>
+          <w:tcPr>
+            <w:tcW w:w="1365" w:type="dxa"/>
+            <w:tcBorders>
+              <w:left w:val="single" w:sz="4" w:space="0" w:color="000000"/>
+              <w:bottom w:val="single" w:sz="4" w:space="0" w:color="000000"/>
+            </w:tcBorders>
+          </w:tcPr>
+          <w:p>
+            <w:pPr>
+              <w:pStyle w:val="TableContents"/>
+              <w:rPr/>
+            </w:pPr>
+            <w:r>
+              <w:rPr/>
+              <w:t>5.6.2GA</w:t>
+            </w:r>
+          </w:p>
+        </w:tc>
+        <w:tc>
+          <w:tcPr>
+            <w:tcW w:w="1365" w:type="dxa"/>
+            <w:tcBorders>
+              <w:left w:val="single" w:sz="4" w:space="0" w:color="000000"/>
+              <w:bottom w:val="single" w:sz="4" w:space="0" w:color="000000"/>
+            </w:tcBorders>
+          </w:tcPr>
+          <w:p>
+            <w:pPr>
+              <w:pStyle w:val="TableContents"/>
+              <w:rPr>
+                <w:b/>
+                <w:b/>
+                <w:bCs/>
+              </w:rPr>
+            </w:pPr>
+            <w:r>
+              <w:rPr>
+                <w:b/>
+                <w:bCs/>
+              </w:rPr>
+              <w:t>5.6.3Beta2</w:t>
+            </w:r>
+          </w:p>
+        </w:tc>
+        <w:tc>
+          <w:tcPr>
+            <w:tcW w:w="1410" w:type="dxa"/>
+            <w:tcBorders>
+              <w:left w:val="single" w:sz="4" w:space="0" w:color="000000"/>
+              <w:bottom w:val="single" w:sz="4" w:space="0" w:color="000000"/>
+              <w:right w:val="single" w:sz="4" w:space="0" w:color="000000"/>
+            </w:tcBorders>
+          </w:tcPr>
+          <w:p>
+            <w:pPr>
+              <w:pStyle w:val="TableContents"/>
+              <w:rPr/>
+            </w:pPr>
+            <w:r>
+              <w:rPr/>
+              <w:t>5.6.4Dev</w:t>
+            </w:r>
+          </w:p>
+        </w:tc>
+      </w:tr>
+      <w:tr>
+        <w:trPr/>
+        <w:tc>
+          <w:tcPr>
+            <w:tcW w:w="3000" w:type="dxa"/>
+            <w:tcBorders>
+              <w:left w:val="single" w:sz="4" w:space="0" w:color="000000"/>
+              <w:bottom w:val="single" w:sz="4" w:space="0" w:color="000000"/>
+            </w:tcBorders>
+          </w:tcPr>
+          <w:p>
+            <w:pPr>
+              <w:pStyle w:val="TableContents"/>
+              <w:rPr/>
+            </w:pPr>
+            <w:r>
+              <w:rPr/>
+              <w:t>Release – 5.6.3</w:t>
+            </w:r>
+          </w:p>
+        </w:tc>
+        <w:tc>
+          <w:tcPr>
+            <w:tcW w:w="1365" w:type="dxa"/>
+            <w:tcBorders>
+              <w:left w:val="single" w:sz="4" w:space="0" w:color="000000"/>
+              <w:bottom w:val="single" w:sz="4" w:space="0" w:color="000000"/>
+            </w:tcBorders>
+          </w:tcPr>
+          <w:p>
+            <w:pPr>
+              <w:pStyle w:val="TableContents"/>
+              <w:rPr>
+                <w:b/>
+                <w:b/>
+                <w:bCs/>
+              </w:rPr>
+            </w:pPr>
+            <w:r>
+              <w:rPr>
+                <w:b/>
+                <w:bCs/>
+              </w:rPr>
+              <w:t>5.6.3GA</w:t>
+            </w:r>
+          </w:p>
+        </w:tc>
+        <w:tc>
+          <w:tcPr>
+            <w:tcW w:w="1365" w:type="dxa"/>
+            <w:tcBorders>
+              <w:left w:val="single" w:sz="4" w:space="0" w:color="000000"/>
+              <w:bottom w:val="single" w:sz="4" w:space="0" w:color="000000"/>
+            </w:tcBorders>
+          </w:tcPr>
+          <w:p>
+            <w:pPr>
+              <w:pStyle w:val="TableContents"/>
+              <w:rPr/>
+            </w:pPr>
+            <w:r>
+              <w:rPr/>
+              <w:t>N/A</w:t>
+            </w:r>
+          </w:p>
+        </w:tc>
+        <w:tc>
+          <w:tcPr>
+            <w:tcW w:w="1410" w:type="dxa"/>
+            <w:tcBorders>
+              <w:left w:val="single" w:sz="4" w:space="0" w:color="000000"/>
+              <w:bottom w:val="single" w:sz="4" w:space="0" w:color="000000"/>
+              <w:right w:val="single" w:sz="4" w:space="0" w:color="000000"/>
+            </w:tcBorders>
+          </w:tcPr>
+          <w:p>
+            <w:pPr>
+              <w:pStyle w:val="TableContents"/>
+              <w:rPr/>
+            </w:pPr>
+            <w:r>
+              <w:rPr/>
+              <w:t>5.6.4Dev</w:t>
+            </w:r>
+          </w:p>
+        </w:tc>
+      </w:tr>
+      <w:tr>
+        <w:trPr/>
+        <w:tc>
+          <w:tcPr>
+            <w:tcW w:w="3000" w:type="dxa"/>
+            <w:tcBorders>
+              <w:left w:val="single" w:sz="4" w:space="0" w:color="000000"/>
+              <w:bottom w:val="single" w:sz="4" w:space="0" w:color="000000"/>
+            </w:tcBorders>
+          </w:tcPr>
+          <w:p>
+            <w:pPr>
+              <w:pStyle w:val="TableContents"/>
+              <w:rPr/>
+            </w:pPr>
+            <w:r>
+              <w:rPr/>
+              <w:t>Hot Site</w:t>
+            </w:r>
+          </w:p>
+        </w:tc>
+        <w:tc>
+          <w:tcPr>
+            <w:tcW w:w="1365" w:type="dxa"/>
+            <w:tcBorders>
+              <w:left w:val="single" w:sz="4" w:space="0" w:color="000000"/>
+              <w:bottom w:val="single" w:sz="4" w:space="0" w:color="000000"/>
+            </w:tcBorders>
+          </w:tcPr>
+          <w:p>
+            <w:pPr>
+              <w:pStyle w:val="TableContents"/>
+              <w:rPr>
+                <w:b/>
+                <w:b/>
+                <w:bCs/>
+              </w:rPr>
+            </w:pPr>
+            <w:r>
+              <w:rPr>
+                <w:b/>
+                <w:bCs/>
+              </w:rPr>
+              <w:t>5.6.3HS1</w:t>
+            </w:r>
+          </w:p>
+        </w:tc>
+        <w:tc>
+          <w:tcPr>
+            <w:tcW w:w="1365" w:type="dxa"/>
+            <w:tcBorders>
+              <w:left w:val="single" w:sz="4" w:space="0" w:color="000000"/>
+              <w:bottom w:val="single" w:sz="4" w:space="0" w:color="000000"/>
+            </w:tcBorders>
+          </w:tcPr>
+          <w:p>
+            <w:pPr>
+              <w:pStyle w:val="TableContents"/>
+              <w:rPr>
+                <w:b/>
+                <w:b/>
+                <w:bCs/>
+              </w:rPr>
+            </w:pPr>
+            <w:r>
+              <w:rPr>
+                <w:b/>
+                <w:bCs/>
+              </w:rPr>
+            </w:r>
+          </w:p>
+        </w:tc>
+        <w:tc>
+          <w:tcPr>
+            <w:tcW w:w="1410" w:type="dxa"/>
+            <w:tcBorders>
+              <w:left w:val="single" w:sz="4" w:space="0" w:color="000000"/>
+              <w:bottom w:val="single" w:sz="4" w:space="0" w:color="000000"/>
+              <w:right w:val="single" w:sz="4" w:space="0" w:color="000000"/>
+            </w:tcBorders>
+          </w:tcPr>
+          <w:p>
+            <w:pPr>
+              <w:pStyle w:val="TableContents"/>
+              <w:rPr/>
+            </w:pPr>
+            <w:r>
+              <w:rPr/>
+              <w:t>5.6.4Dev</w:t>
+            </w:r>
+          </w:p>
+        </w:tc>
+      </w:tr>
+    </w:tbl>
+    <w:p>
+      <w:pPr>
+        <w:pStyle w:val="Normal"/>
+        <w:rPr>
+          <w:rFonts w:ascii="Liberation Sans" w:hAnsi="Liberation Sans"/>
+        </w:rPr>
+      </w:pPr>
+      <w:r>
+        <w:rPr>
+          <w:rFonts w:ascii="Liberation Sans" w:hAnsi="Liberation Sans"/>
+        </w:rPr>
+      </w:r>
+    </w:p>
+    <w:p>
+      <w:pPr>
+        <w:pStyle w:val="Normal"/>
+        <w:rPr>
+          <w:rFonts w:ascii="Liberation Sans" w:hAnsi="Liberation Sans"/>
+          <w:b w:val="false"/>
+          <w:b w:val="false"/>
+          <w:bCs w:val="false"/>
+        </w:rPr>
+      </w:pPr>
+      <w:r>
+        <w:rPr>
+          <w:rFonts w:ascii="Liberation Sans" w:hAnsi="Liberation Sans"/>
+          <w:b w:val="false"/>
+          <w:bCs w:val="false"/>
+        </w:rPr>
+        <w:t xml:space="preserve">This shows the sequence for a </w:t>
+      </w:r>
+      <w:r>
+        <w:rPr>
+          <w:rFonts w:ascii="Liberation Sans" w:hAnsi="Liberation Sans"/>
+          <w:b w:val="false"/>
+          <w:bCs w:val="false"/>
+        </w:rPr>
+        <w:t>2</w:t>
+      </w:r>
+      <w:r>
+        <w:rPr>
+          <w:rFonts w:ascii="Liberation Sans" w:hAnsi="Liberation Sans"/>
+          <w:b w:val="false"/>
+          <w:bCs w:val="false"/>
+          <w:vertAlign w:val="superscript"/>
+        </w:rPr>
+        <w:t>nd</w:t>
+      </w:r>
+      <w:r>
+        <w:rPr>
+          <w:rFonts w:ascii="Liberation Sans" w:hAnsi="Liberation Sans"/>
+          <w:b w:val="false"/>
+          <w:bCs w:val="false"/>
+        </w:rPr>
+        <w:t xml:space="preserve"> </w:t>
+      </w:r>
+      <w:r>
+        <w:rPr>
+          <w:rFonts w:ascii="Liberation Sans" w:hAnsi="Liberation Sans"/>
+          <w:b w:val="false"/>
+          <w:bCs w:val="false"/>
+        </w:rPr>
+        <w:t xml:space="preserve">level release.  </w:t>
+      </w:r>
+      <w:r>
+        <w:rPr>
+          <w:rFonts w:ascii="Liberation Sans" w:hAnsi="Liberation Sans"/>
+          <w:b w:val="false"/>
+          <w:bCs w:val="false"/>
+        </w:rPr>
+        <w:t>The sequence for a 1</w:t>
+      </w:r>
+      <w:r>
+        <w:rPr>
+          <w:rFonts w:ascii="Liberation Sans" w:hAnsi="Liberation Sans"/>
+          <w:b w:val="false"/>
+          <w:bCs w:val="false"/>
+          <w:vertAlign w:val="superscript"/>
+        </w:rPr>
+        <w:t>st</w:t>
+      </w:r>
+      <w:r>
+        <w:rPr>
+          <w:rFonts w:ascii="Liberation Sans" w:hAnsi="Liberation Sans"/>
+          <w:b w:val="false"/>
+          <w:bCs w:val="false"/>
+        </w:rPr>
+        <w:t xml:space="preserve"> level release is an exer</w:t>
+      </w:r>
+      <w:r>
+        <w:rPr>
+          <w:rFonts w:ascii="Liberation Sans" w:hAnsi="Liberation Sans"/>
+          <w:b w:val="false"/>
+          <w:bCs w:val="false"/>
+        </w:rPr>
+        <w:t>c</w:t>
+      </w:r>
+      <w:r>
+        <w:rPr>
+          <w:rFonts w:ascii="Liberation Sans" w:hAnsi="Liberation Sans"/>
+          <w:b w:val="false"/>
+          <w:bCs w:val="false"/>
+        </w:rPr>
+        <w:t>i</w:t>
+      </w:r>
+      <w:r>
+        <w:rPr>
+          <w:rFonts w:ascii="Liberation Sans" w:hAnsi="Liberation Sans"/>
+          <w:b w:val="false"/>
+          <w:bCs w:val="false"/>
+        </w:rPr>
+        <w:t>s</w:t>
+      </w:r>
+      <w:r>
+        <w:rPr>
+          <w:rFonts w:ascii="Liberation Sans" w:hAnsi="Liberation Sans"/>
+          <w:b w:val="false"/>
+          <w:bCs w:val="false"/>
+        </w:rPr>
+        <w:t>e for the reader</w:t>
+      </w:r>
+    </w:p>
+    <w:tbl>
+      <w:tblPr>
+        <w:tblW w:w="7140" w:type="dxa"/>
+        <w:jc w:val="left"/>
+        <w:tblInd w:w="55" w:type="dxa"/>
+        <w:tblLayout w:type="fixed"/>
+        <w:tblCellMar>
+          <w:top w:w="55" w:type="dxa"/>
+          <w:left w:w="55" w:type="dxa"/>
+          <w:bottom w:w="55" w:type="dxa"/>
+          <w:right w:w="55" w:type="dxa"/>
+        </w:tblCellMar>
+      </w:tblPr>
+      <w:tblGrid>
+        <w:gridCol w:w="3000"/>
+        <w:gridCol w:w="1365"/>
+        <w:gridCol w:w="1365"/>
+        <w:gridCol w:w="1410"/>
+      </w:tblGrid>
+      <w:tr>
+        <w:trPr/>
+        <w:tc>
+          <w:tcPr>
+            <w:tcW w:w="3000" w:type="dxa"/>
+            <w:tcBorders>
+              <w:top w:val="single" w:sz="4" w:space="0" w:color="000000"/>
+              <w:left w:val="single" w:sz="4" w:space="0" w:color="000000"/>
+              <w:bottom w:val="single" w:sz="4" w:space="0" w:color="000000"/>
+            </w:tcBorders>
+          </w:tcPr>
+          <w:p>
+            <w:pPr>
+              <w:pStyle w:val="TableContents"/>
+              <w:rPr/>
+            </w:pPr>
+            <w:r>
+              <w:rPr/>
+              <w:t>E</w:t>
+            </w:r>
+            <w:r>
+              <w:rPr/>
+              <w:t>vent</w:t>
+            </w:r>
+          </w:p>
+        </w:tc>
+        <w:tc>
+          <w:tcPr>
+            <w:tcW w:w="1365" w:type="dxa"/>
+            <w:tcBorders>
+              <w:top w:val="single" w:sz="4" w:space="0" w:color="000000"/>
+              <w:left w:val="single" w:sz="4" w:space="0" w:color="000000"/>
+              <w:bottom w:val="single" w:sz="4" w:space="0" w:color="000000"/>
+            </w:tcBorders>
+          </w:tcPr>
+          <w:p>
+            <w:pPr>
+              <w:pStyle w:val="TableContents"/>
+              <w:rPr/>
+            </w:pPr>
+            <w:r>
+              <w:rPr/>
+              <w:t>Rlse Version</w:t>
+            </w:r>
+          </w:p>
+        </w:tc>
+        <w:tc>
+          <w:tcPr>
+            <w:tcW w:w="1365" w:type="dxa"/>
+            <w:tcBorders>
+              <w:top w:val="single" w:sz="4" w:space="0" w:color="000000"/>
+              <w:left w:val="single" w:sz="4" w:space="0" w:color="000000"/>
+              <w:bottom w:val="single" w:sz="4" w:space="0" w:color="000000"/>
+            </w:tcBorders>
+          </w:tcPr>
+          <w:p>
+            <w:pPr>
+              <w:pStyle w:val="TableContents"/>
+              <w:rPr/>
+            </w:pPr>
+            <w:r>
+              <w:rPr/>
+              <w:t>Beta Version</w:t>
+            </w:r>
+          </w:p>
+        </w:tc>
+        <w:tc>
+          <w:tcPr>
+            <w:tcW w:w="1410" w:type="dxa"/>
+            <w:tcBorders>
+              <w:top w:val="single" w:sz="4" w:space="0" w:color="000000"/>
+              <w:left w:val="single" w:sz="4" w:space="0" w:color="000000"/>
+              <w:bottom w:val="single" w:sz="4" w:space="0" w:color="000000"/>
+              <w:right w:val="single" w:sz="4" w:space="0" w:color="000000"/>
+            </w:tcBorders>
+          </w:tcPr>
+          <w:p>
+            <w:pPr>
+              <w:pStyle w:val="TableContents"/>
+              <w:rPr/>
+            </w:pPr>
+            <w:r>
+              <w:rPr/>
+              <w:t>Dev</w:t>
+            </w:r>
+            <w:r>
+              <w:rPr/>
+              <w:t xml:space="preserve"> Version</w:t>
+            </w:r>
+          </w:p>
+        </w:tc>
+      </w:tr>
+      <w:tr>
+        <w:trPr/>
+        <w:tc>
+          <w:tcPr>
+            <w:tcW w:w="3000" w:type="dxa"/>
+            <w:tcBorders>
+              <w:left w:val="single" w:sz="4" w:space="0" w:color="000000"/>
+              <w:bottom w:val="single" w:sz="4" w:space="0" w:color="000000"/>
+            </w:tcBorders>
+          </w:tcPr>
+          <w:p>
+            <w:pPr>
+              <w:pStyle w:val="TableContents"/>
+              <w:rPr/>
+            </w:pPr>
+            <w:r>
+              <w:rPr/>
+              <w:t>Normal dev, between releases</w:t>
+            </w:r>
+          </w:p>
+        </w:tc>
+        <w:tc>
+          <w:tcPr>
+            <w:tcW w:w="1365" w:type="dxa"/>
+            <w:tcBorders>
+              <w:left w:val="single" w:sz="4" w:space="0" w:color="000000"/>
+              <w:bottom w:val="single" w:sz="4" w:space="0" w:color="000000"/>
+            </w:tcBorders>
+          </w:tcPr>
+          <w:p>
+            <w:pPr>
+              <w:pStyle w:val="TableContents"/>
+              <w:rPr/>
+            </w:pPr>
+            <w:r>
+              <w:rPr/>
+              <w:t>5.6.</w:t>
+            </w:r>
+            <w:r>
+              <w:rPr/>
+              <w:t>2GA</w:t>
+            </w:r>
+          </w:p>
+        </w:tc>
+        <w:tc>
+          <w:tcPr>
+            <w:tcW w:w="1365" w:type="dxa"/>
+            <w:tcBorders>
+              <w:left w:val="single" w:sz="4" w:space="0" w:color="000000"/>
+              <w:bottom w:val="single" w:sz="4" w:space="0" w:color="000000"/>
+            </w:tcBorders>
+          </w:tcPr>
+          <w:p>
+            <w:pPr>
+              <w:pStyle w:val="TableContents"/>
+              <w:rPr/>
+            </w:pPr>
+            <w:r>
+              <w:rPr/>
+              <w:t>N/A</w:t>
+            </w:r>
+          </w:p>
+        </w:tc>
+        <w:tc>
+          <w:tcPr>
+            <w:tcW w:w="1410" w:type="dxa"/>
+            <w:tcBorders>
+              <w:left w:val="single" w:sz="4" w:space="0" w:color="000000"/>
+              <w:bottom w:val="single" w:sz="4" w:space="0" w:color="000000"/>
+              <w:right w:val="single" w:sz="4" w:space="0" w:color="000000"/>
+            </w:tcBorders>
+          </w:tcPr>
+          <w:p>
+            <w:pPr>
+              <w:pStyle w:val="TableContents"/>
+              <w:rPr/>
+            </w:pPr>
+            <w:r>
+              <w:rPr/>
+              <w:t>5.6.</w:t>
+            </w:r>
+            <w:r>
+              <w:rPr/>
+              <w:t>3Dev</w:t>
+            </w:r>
+          </w:p>
+        </w:tc>
+      </w:tr>
+      <w:tr>
+        <w:trPr/>
+        <w:tc>
+          <w:tcPr>
+            <w:tcW w:w="3000" w:type="dxa"/>
+            <w:tcBorders>
+              <w:left w:val="single" w:sz="4" w:space="0" w:color="000000"/>
+              <w:bottom w:val="single" w:sz="4" w:space="0" w:color="000000"/>
+            </w:tcBorders>
+          </w:tcPr>
+          <w:p>
+            <w:pPr>
+              <w:pStyle w:val="TableContents"/>
+              <w:rPr/>
+            </w:pPr>
+            <w:r>
+              <w:rPr/>
+              <w:t>Start Release - Beta1</w:t>
+            </w:r>
+          </w:p>
+        </w:tc>
+        <w:tc>
+          <w:tcPr>
+            <w:tcW w:w="1365" w:type="dxa"/>
+            <w:tcBorders>
+              <w:left w:val="single" w:sz="4" w:space="0" w:color="000000"/>
+              <w:bottom w:val="single" w:sz="4" w:space="0" w:color="000000"/>
+            </w:tcBorders>
+          </w:tcPr>
+          <w:p>
+            <w:pPr>
+              <w:pStyle w:val="TableContents"/>
+              <w:rPr/>
+            </w:pPr>
+            <w:r>
+              <w:rPr/>
+              <w:t>5.6.2GA</w:t>
+            </w:r>
+          </w:p>
+        </w:tc>
+        <w:tc>
+          <w:tcPr>
+            <w:tcW w:w="1365" w:type="dxa"/>
+            <w:tcBorders>
+              <w:left w:val="single" w:sz="4" w:space="0" w:color="000000"/>
+              <w:bottom w:val="single" w:sz="4" w:space="0" w:color="000000"/>
+            </w:tcBorders>
+          </w:tcPr>
+          <w:p>
+            <w:pPr>
+              <w:pStyle w:val="TableContents"/>
+              <w:rPr>
+                <w:b/>
+                <w:b/>
+                <w:bCs/>
+              </w:rPr>
+            </w:pPr>
+            <w:r>
+              <w:rPr>
+                <w:b/>
+                <w:bCs/>
+              </w:rPr>
+              <w:t>5.</w:t>
+            </w:r>
+            <w:r>
+              <w:rPr>
+                <w:b/>
+                <w:bCs/>
+              </w:rPr>
+              <w:t>7.0</w:t>
+            </w:r>
+            <w:r>
+              <w:rPr>
+                <w:b/>
+                <w:bCs/>
+              </w:rPr>
+              <w:t>Beta1</w:t>
+            </w:r>
+          </w:p>
+        </w:tc>
+        <w:tc>
+          <w:tcPr>
+            <w:tcW w:w="1410" w:type="dxa"/>
+            <w:tcBorders>
+              <w:left w:val="single" w:sz="4" w:space="0" w:color="000000"/>
+              <w:bottom w:val="single" w:sz="4" w:space="0" w:color="000000"/>
+              <w:right w:val="single" w:sz="4" w:space="0" w:color="000000"/>
+            </w:tcBorders>
+          </w:tcPr>
+          <w:p>
+            <w:pPr>
+              <w:pStyle w:val="TableContents"/>
+              <w:rPr>
+                <w:b/>
+                <w:b/>
+                <w:bCs/>
+              </w:rPr>
+            </w:pPr>
+            <w:r>
+              <w:rPr>
+                <w:b/>
+                <w:bCs/>
+              </w:rPr>
+              <w:t>5.</w:t>
+            </w:r>
+            <w:r>
+              <w:rPr>
+                <w:b/>
+                <w:bCs/>
+              </w:rPr>
+              <w:t>7.1</w:t>
+            </w:r>
+            <w:r>
+              <w:rPr>
+                <w:b/>
+                <w:bCs/>
+              </w:rPr>
+              <w:t>Dev</w:t>
+            </w:r>
+          </w:p>
+        </w:tc>
+      </w:tr>
+      <w:tr>
+        <w:trPr/>
+        <w:tc>
+          <w:tcPr>
+            <w:tcW w:w="3000" w:type="dxa"/>
+            <w:tcBorders>
+              <w:left w:val="single" w:sz="4" w:space="0" w:color="000000"/>
+              <w:bottom w:val="single" w:sz="4" w:space="0" w:color="000000"/>
+            </w:tcBorders>
+          </w:tcPr>
+          <w:p>
+            <w:pPr>
+              <w:pStyle w:val="TableContents"/>
+              <w:rPr/>
+            </w:pPr>
+            <w:r>
+              <w:rPr/>
+              <w:t>Beta2</w:t>
+            </w:r>
+          </w:p>
+        </w:tc>
+        <w:tc>
+          <w:tcPr>
+            <w:tcW w:w="1365" w:type="dxa"/>
+            <w:tcBorders>
+              <w:left w:val="single" w:sz="4" w:space="0" w:color="000000"/>
+              <w:bottom w:val="single" w:sz="4" w:space="0" w:color="000000"/>
+            </w:tcBorders>
+          </w:tcPr>
+          <w:p>
+            <w:pPr>
+              <w:pStyle w:val="TableContents"/>
+              <w:rPr/>
+            </w:pPr>
+            <w:r>
+              <w:rPr/>
+              <w:t>5.6.2GA</w:t>
+            </w:r>
+          </w:p>
+        </w:tc>
+        <w:tc>
+          <w:tcPr>
+            <w:tcW w:w="1365" w:type="dxa"/>
+            <w:tcBorders>
+              <w:left w:val="single" w:sz="4" w:space="0" w:color="000000"/>
+              <w:bottom w:val="single" w:sz="4" w:space="0" w:color="000000"/>
+            </w:tcBorders>
+          </w:tcPr>
+          <w:p>
+            <w:pPr>
+              <w:pStyle w:val="TableContents"/>
+              <w:rPr>
+                <w:b/>
+                <w:b/>
+                <w:bCs/>
+              </w:rPr>
+            </w:pPr>
+            <w:r>
+              <w:rPr>
+                <w:b/>
+                <w:bCs/>
+              </w:rPr>
+              <w:t>5.</w:t>
+            </w:r>
+            <w:r>
+              <w:rPr>
+                <w:b/>
+                <w:bCs/>
+              </w:rPr>
+              <w:t>7.0</w:t>
+            </w:r>
+            <w:r>
+              <w:rPr>
+                <w:b/>
+                <w:bCs/>
+              </w:rPr>
+              <w:t>Beta2</w:t>
+            </w:r>
+          </w:p>
+        </w:tc>
+        <w:tc>
+          <w:tcPr>
+            <w:tcW w:w="1410" w:type="dxa"/>
+            <w:tcBorders>
+              <w:left w:val="single" w:sz="4" w:space="0" w:color="000000"/>
+              <w:bottom w:val="single" w:sz="4" w:space="0" w:color="000000"/>
+              <w:right w:val="single" w:sz="4" w:space="0" w:color="000000"/>
+            </w:tcBorders>
+          </w:tcPr>
+          <w:p>
+            <w:pPr>
+              <w:pStyle w:val="TableContents"/>
+              <w:rPr/>
+            </w:pPr>
+            <w:r>
+              <w:rPr/>
+              <w:t>5.</w:t>
+            </w:r>
+            <w:r>
+              <w:rPr/>
+              <w:t>7.1</w:t>
+            </w:r>
+            <w:r>
+              <w:rPr/>
+              <w:t>Dev</w:t>
+            </w:r>
+          </w:p>
+        </w:tc>
+      </w:tr>
+      <w:tr>
+        <w:trPr/>
+        <w:tc>
+          <w:tcPr>
+            <w:tcW w:w="3000" w:type="dxa"/>
+            <w:tcBorders>
+              <w:left w:val="single" w:sz="4" w:space="0" w:color="000000"/>
+              <w:bottom w:val="single" w:sz="4" w:space="0" w:color="000000"/>
+            </w:tcBorders>
+          </w:tcPr>
+          <w:p>
+            <w:pPr>
+              <w:pStyle w:val="TableContents"/>
+              <w:rPr/>
+            </w:pPr>
+            <w:r>
+              <w:rPr/>
+              <w:t>Release – 5.6.3</w:t>
+            </w:r>
+          </w:p>
+        </w:tc>
+        <w:tc>
+          <w:tcPr>
+            <w:tcW w:w="1365" w:type="dxa"/>
+            <w:tcBorders>
+              <w:left w:val="single" w:sz="4" w:space="0" w:color="000000"/>
+              <w:bottom w:val="single" w:sz="4" w:space="0" w:color="000000"/>
+            </w:tcBorders>
+          </w:tcPr>
+          <w:p>
+            <w:pPr>
+              <w:pStyle w:val="TableContents"/>
+              <w:rPr>
+                <w:b/>
+                <w:b/>
+                <w:bCs/>
+              </w:rPr>
+            </w:pPr>
+            <w:r>
+              <w:rPr>
+                <w:b/>
+                <w:bCs/>
+              </w:rPr>
+              <w:t>5.</w:t>
+            </w:r>
+            <w:r>
+              <w:rPr>
+                <w:b/>
+                <w:bCs/>
+              </w:rPr>
+              <w:t>7.0</w:t>
+            </w:r>
+            <w:r>
+              <w:rPr>
+                <w:b/>
+                <w:bCs/>
+              </w:rPr>
+              <w:t>GA</w:t>
+            </w:r>
+          </w:p>
+        </w:tc>
+        <w:tc>
+          <w:tcPr>
+            <w:tcW w:w="1365" w:type="dxa"/>
+            <w:tcBorders>
+              <w:left w:val="single" w:sz="4" w:space="0" w:color="000000"/>
+              <w:bottom w:val="single" w:sz="4" w:space="0" w:color="000000"/>
+            </w:tcBorders>
+          </w:tcPr>
+          <w:p>
+            <w:pPr>
+              <w:pStyle w:val="TableContents"/>
+              <w:rPr/>
+            </w:pPr>
+            <w:r>
+              <w:rPr/>
+              <w:t>N/A</w:t>
+            </w:r>
+          </w:p>
+        </w:tc>
+        <w:tc>
+          <w:tcPr>
+            <w:tcW w:w="1410" w:type="dxa"/>
+            <w:tcBorders>
+              <w:left w:val="single" w:sz="4" w:space="0" w:color="000000"/>
+              <w:bottom w:val="single" w:sz="4" w:space="0" w:color="000000"/>
+              <w:right w:val="single" w:sz="4" w:space="0" w:color="000000"/>
+            </w:tcBorders>
+          </w:tcPr>
+          <w:p>
+            <w:pPr>
+              <w:pStyle w:val="TableContents"/>
+              <w:rPr/>
+            </w:pPr>
+            <w:r>
+              <w:rPr/>
+              <w:t>5.</w:t>
+            </w:r>
+            <w:r>
+              <w:rPr/>
+              <w:t>7.1</w:t>
+            </w:r>
+            <w:r>
+              <w:rPr/>
+              <w:t>Dev</w:t>
+            </w:r>
+          </w:p>
+        </w:tc>
+      </w:tr>
+      <w:tr>
+        <w:trPr/>
+        <w:tc>
+          <w:tcPr>
+            <w:tcW w:w="3000" w:type="dxa"/>
+            <w:tcBorders>
+              <w:left w:val="single" w:sz="4" w:space="0" w:color="000000"/>
+              <w:bottom w:val="single" w:sz="4" w:space="0" w:color="000000"/>
+            </w:tcBorders>
+          </w:tcPr>
+          <w:p>
+            <w:pPr>
+              <w:pStyle w:val="TableContents"/>
+              <w:rPr/>
+            </w:pPr>
+            <w:r>
+              <w:rPr/>
+              <w:t>Hot Site</w:t>
+            </w:r>
+          </w:p>
+        </w:tc>
+        <w:tc>
+          <w:tcPr>
+            <w:tcW w:w="1365" w:type="dxa"/>
+            <w:tcBorders>
+              <w:left w:val="single" w:sz="4" w:space="0" w:color="000000"/>
+              <w:bottom w:val="single" w:sz="4" w:space="0" w:color="000000"/>
+            </w:tcBorders>
+          </w:tcPr>
+          <w:p>
+            <w:pPr>
+              <w:pStyle w:val="TableContents"/>
+              <w:rPr>
+                <w:b/>
+                <w:b/>
+                <w:bCs/>
+              </w:rPr>
+            </w:pPr>
+            <w:r>
+              <w:rPr>
+                <w:b/>
+                <w:bCs/>
+              </w:rPr>
+              <w:t>5.</w:t>
+            </w:r>
+            <w:r>
+              <w:rPr>
+                <w:b/>
+                <w:bCs/>
+              </w:rPr>
+              <w:t>7.0</w:t>
+            </w:r>
+            <w:r>
+              <w:rPr>
+                <w:b/>
+                <w:bCs/>
+              </w:rPr>
+              <w:t>HS1</w:t>
+            </w:r>
+          </w:p>
+        </w:tc>
+        <w:tc>
+          <w:tcPr>
+            <w:tcW w:w="1365" w:type="dxa"/>
+            <w:tcBorders>
+              <w:left w:val="single" w:sz="4" w:space="0" w:color="000000"/>
+              <w:bottom w:val="single" w:sz="4" w:space="0" w:color="000000"/>
+            </w:tcBorders>
+          </w:tcPr>
+          <w:p>
+            <w:pPr>
+              <w:pStyle w:val="TableContents"/>
+              <w:rPr/>
+            </w:pPr>
+            <w:r>
+              <w:rPr/>
+              <w:t>N/A</w:t>
+            </w:r>
+          </w:p>
+        </w:tc>
+        <w:tc>
+          <w:tcPr>
+            <w:tcW w:w="1410" w:type="dxa"/>
+            <w:tcBorders>
+              <w:left w:val="single" w:sz="4" w:space="0" w:color="000000"/>
+              <w:bottom w:val="single" w:sz="4" w:space="0" w:color="000000"/>
+              <w:right w:val="single" w:sz="4" w:space="0" w:color="000000"/>
+            </w:tcBorders>
+          </w:tcPr>
+          <w:p>
+            <w:pPr>
+              <w:pStyle w:val="TableContents"/>
+              <w:rPr/>
+            </w:pPr>
+            <w:r>
+              <w:rPr/>
+              <w:t>5.</w:t>
+            </w:r>
+            <w:r>
+              <w:rPr/>
+              <w:t>7.1</w:t>
+            </w:r>
+            <w:r>
+              <w:rPr/>
+              <w:t>Dev</w:t>
+            </w:r>
+          </w:p>
+        </w:tc>
+      </w:tr>
+    </w:tbl>
     <w:p>
       <w:pPr>
         <w:pStyle w:val="Normal"/>
@@ -1699,7 +3811,133 @@
         <w:rPr>
           <w:rFonts w:ascii="Liberation Sans" w:hAnsi="Liberation Sans"/>
         </w:rPr>
-        <w:t>Fixes in Beta and Hot Site releases are duplicated in the ‘default’ branch.  Which branch is fixed first is left to the developer.</w:t>
+        <w:t xml:space="preserve">Fixes in Beta and Hot Site releases are duplicated in the </w:t>
+      </w:r>
+      <w:r>
+        <w:rPr>
+          <w:rFonts w:ascii="Liberation Sans" w:hAnsi="Liberation Sans"/>
+          <w:b/>
+          <w:bCs/>
+        </w:rPr>
+        <w:t>default</w:t>
+      </w:r>
+      <w:r>
+        <w:rPr>
+          <w:rFonts w:ascii="Liberation Sans" w:hAnsi="Liberation Sans"/>
+        </w:rPr>
+        <w:t xml:space="preserve"> branch.  </w:t>
+      </w:r>
+      <w:r>
+        <w:rPr>
+          <w:rFonts w:ascii="Liberation Sans" w:hAnsi="Liberation Sans"/>
+        </w:rPr>
+        <w:t>It is recom</w:t>
+      </w:r>
+      <w:r>
+        <w:rPr>
+          <w:rFonts w:ascii="Liberation Sans" w:hAnsi="Liberation Sans"/>
+        </w:rPr>
+        <w:t>mended</w:t>
+      </w:r>
+      <w:r>
+        <w:rPr>
+          <w:rFonts w:ascii="Liberation Sans" w:hAnsi="Liberation Sans"/>
+        </w:rPr>
+        <w:t xml:space="preserve"> that these fixes b</w:t>
+      </w:r>
+      <w:r>
+        <w:rPr>
+          <w:rFonts w:ascii="Liberation Sans" w:hAnsi="Liberation Sans"/>
+        </w:rPr>
+        <w:t>e</w:t>
+      </w:r>
+      <w:r>
+        <w:rPr>
+          <w:rFonts w:ascii="Liberation Sans" w:hAnsi="Liberation Sans"/>
+        </w:rPr>
+        <w:t xml:space="preserve"> made in the Release branch and merged in</w:t>
+      </w:r>
+      <w:r>
+        <w:rPr>
+          <w:rFonts w:ascii="Liberation Sans" w:hAnsi="Liberation Sans"/>
+        </w:rPr>
+        <w:t>to</w:t>
+      </w:r>
+      <w:r>
+        <w:rPr>
+          <w:rFonts w:ascii="Liberation Sans" w:hAnsi="Liberation Sans"/>
+        </w:rPr>
+        <w:t xml:space="preserve"> the</w:t>
+      </w:r>
+      <w:r>
+        <w:rPr>
+          <w:rFonts w:ascii="Liberation Sans" w:hAnsi="Liberation Sans"/>
+          <w:b/>
+          <w:bCs/>
+        </w:rPr>
+        <w:t xml:space="preserve"> </w:t>
+      </w:r>
+      <w:r>
+        <w:rPr>
+          <w:rFonts w:ascii="Liberation Sans" w:hAnsi="Liberation Sans"/>
+          <w:b/>
+          <w:bCs/>
+        </w:rPr>
+        <w:t>defa</w:t>
+      </w:r>
+      <w:r>
+        <w:rPr>
+          <w:rFonts w:ascii="Liberation Sans" w:hAnsi="Liberation Sans"/>
+          <w:b/>
+          <w:bCs/>
+        </w:rPr>
+        <w:t>ult</w:t>
+      </w:r>
+      <w:r>
+        <w:rPr>
+          <w:rFonts w:ascii="Liberation Sans" w:hAnsi="Liberation Sans"/>
+          <w:b/>
+          <w:bCs/>
+        </w:rPr>
+        <w:t xml:space="preserve"> </w:t>
+      </w:r>
+      <w:r>
+        <w:rPr>
+          <w:rFonts w:ascii="Liberation Sans" w:hAnsi="Liberation Sans"/>
+        </w:rPr>
+        <w:t>branch.</w:t>
+      </w:r>
+    </w:p>
+    <w:p>
+      <w:pPr>
+        <w:pStyle w:val="Normal"/>
+        <w:rPr>
+          <w:rFonts w:ascii="Liberation Sans" w:hAnsi="Liberation Sans"/>
+        </w:rPr>
+      </w:pPr>
+      <w:r>
+        <w:rPr>
+          <w:rFonts w:ascii="Liberation Sans" w:hAnsi="Liberation Sans"/>
+        </w:rPr>
+        <w:t>T</w:t>
+      </w:r>
+      <w:r>
+        <w:rPr>
+          <w:rFonts w:ascii="Liberation Sans" w:hAnsi="Liberation Sans"/>
+        </w:rPr>
+        <w:t>he merge may complain about a conflict in Program</w:t>
+      </w:r>
+      <w:r>
+        <w:rPr>
+          <w:rFonts w:ascii="Liberation Sans" w:hAnsi="Liberation Sans"/>
+        </w:rPr>
+        <w:t xml:space="preserve">Version.cmake.  </w:t>
+      </w:r>
+      <w:r>
+        <w:rPr>
+          <w:rFonts w:ascii="Liberation Sans" w:hAnsi="Liberation Sans"/>
+        </w:rPr>
+        <w:t>The VERSION values should be as described above.</w:t>
       </w:r>
     </w:p>
     <w:p>
@@ -3241,7 +5479,7 @@
         </w:rPr>
         <w:t xml:space="preserve">Code may be formatted (pretty-printed) using the </w:t>
       </w:r>
-      <w:hyperlink r:id="rId6">
+      <w:hyperlink r:id="rId7">
         <w:r>
           <w:rPr>
             <w:rStyle w:val="InternetLink"/>
@@ -4231,7 +6469,7 @@
         </w:rPr>
         <w:t xml:space="preserve">page of the XtrkCad wikka page </w:t>
       </w:r>
-      <w:hyperlink r:id="rId7">
+      <w:hyperlink r:id="rId8">
         <w:r>
           <w:rPr>
             <w:rStyle w:val="VisitedInternetLink"/>
@@ -5729,6 +7967,143 @@
   <w:abstractNum w:abstractNumId="6">
     <w:lvl w:ilvl="0">
       <w:start w:val="1"/>
+      <w:numFmt w:val="bullet"/>
+      <w:lvlText w:val=""/>
+      <w:lvlJc w:val="left"/>
+      <w:pPr>
+        <w:tabs>
+          <w:tab w:val="num" w:pos="720"/>
+        </w:tabs>
+        <w:ind w:left="720" w:hanging="360"/>
+      </w:pPr>
+      <w:rPr>
+        <w:rFonts w:ascii="Symbol" w:hAnsi="Symbol" w:cs="Symbol" w:hint="default"/>
+      </w:rPr>
+    </w:lvl>
+    <w:lvl w:ilvl="1">
+      <w:start w:val="1"/>
+      <w:numFmt w:val="bullet"/>
+      <w:lvlText w:val="◦"/>
+      <w:lvlJc w:val="left"/>
+      <w:pPr>
+        <w:tabs>
+          <w:tab w:val="num" w:pos="1080"/>
+        </w:tabs>
+        <w:ind w:left="1080" w:hanging="360"/>
+      </w:pPr>
+      <w:rPr>
+        <w:rFonts w:ascii="OpenSymbol" w:hAnsi="OpenSymbol" w:cs="OpenSymbol" w:hint="default"/>
+      </w:rPr>
+    </w:lvl>
+    <w:lvl w:ilvl="2">
+      <w:start w:val="1"/>
+      <w:numFmt w:val="bullet"/>
+      <w:lvlText w:val="▪"/>
+      <w:lvlJc w:val="left"/>
+      <w:pPr>
+        <w:tabs>
+          <w:tab w:val="num" w:pos="1440"/>
+        </w:tabs>
+        <w:ind w:left="1440" w:hanging="360"/>
+      </w:pPr>
+      <w:rPr>
+        <w:rFonts w:ascii="OpenSymbol" w:hAnsi="OpenSymbol" w:cs="OpenSymbol" w:hint="default"/>
+      </w:rPr>
+    </w:lvl>
+    <w:lvl w:ilvl="3">
+      <w:start w:val="1"/>
+      <w:numFmt w:val="bullet"/>
+      <w:lvlText w:val=""/>
+      <w:lvlJc w:val="left"/>
+      <w:pPr>
+        <w:tabs>
+          <w:tab w:val="num" w:pos="1800"/>
+        </w:tabs>
+        <w:ind w:left="1800" w:hanging="360"/>
+      </w:pPr>
+      <w:rPr>
+        <w:rFonts w:ascii="Symbol" w:hAnsi="Symbol" w:cs="Symbol" w:hint="default"/>
+      </w:rPr>
+    </w:lvl>
+    <w:lvl w:ilvl="4">
+      <w:start w:val="1"/>
+      <w:numFmt w:val="bullet"/>
+      <w:lvlText w:val="◦"/>
+      <w:lvlJc w:val="left"/>
+      <w:pPr>
+        <w:tabs>
+          <w:tab w:val="num" w:pos="2160"/>
+        </w:tabs>
+        <w:ind w:left="2160" w:hanging="360"/>
+      </w:pPr>
+      <w:rPr>
+        <w:rFonts w:ascii="OpenSymbol" w:hAnsi="OpenSymbol" w:cs="OpenSymbol" w:hint="default"/>
+      </w:rPr>
+    </w:lvl>
+    <w:lvl w:ilvl="5">
+      <w:start w:val="1"/>
+      <w:numFmt w:val="bullet"/>
+      <w:lvlText w:val="▪"/>
+      <w:lvlJc w:val="left"/>
+      <w:pPr>
+        <w:tabs>
+          <w:tab w:val="num" w:pos="2520"/>
+        </w:tabs>
+        <w:ind w:left="2520" w:hanging="360"/>
+      </w:pPr>
+      <w:rPr>
+        <w:rFonts w:ascii="OpenSymbol" w:hAnsi="OpenSymbol" w:cs="OpenSymbol" w:hint="default"/>
+      </w:rPr>
+    </w:lvl>
+    <w:lvl w:ilvl="6">
+      <w:start w:val="1"/>
+      <w:numFmt w:val="bullet"/>
+      <w:lvlText w:val=""/>
+      <w:lvlJc w:val="left"/>
+      <w:pPr>
+        <w:tabs>
+          <w:tab w:val="num" w:pos="2880"/>
+        </w:tabs>
+        <w:ind w:left="2880" w:hanging="360"/>
+      </w:pPr>
+      <w:rPr>
+        <w:rFonts w:ascii="Symbol" w:hAnsi="Symbol" w:cs="Symbol" w:hint="default"/>
+      </w:rPr>
+    </w:lvl>
+    <w:lvl w:ilvl="7">
+      <w:start w:val="1"/>
+      <w:numFmt w:val="bullet"/>
+      <w:lvlText w:val="◦"/>
+      <w:lvlJc w:val="left"/>
+      <w:pPr>
+        <w:tabs>
+          <w:tab w:val="num" w:pos="3240"/>
+        </w:tabs>
+        <w:ind w:left="3240" w:hanging="360"/>
+      </w:pPr>
+      <w:rPr>
+        <w:rFonts w:ascii="OpenSymbol" w:hAnsi="OpenSymbol" w:cs="OpenSymbol" w:hint="default"/>
+      </w:rPr>
+    </w:lvl>
+    <w:lvl w:ilvl="8">
+      <w:start w:val="1"/>
+      <w:numFmt w:val="bullet"/>
+      <w:lvlText w:val="▪"/>
+      <w:lvlJc w:val="left"/>
+      <w:pPr>
+        <w:tabs>
+          <w:tab w:val="num" w:pos="3600"/>
+        </w:tabs>
+        <w:ind w:left="3600" w:hanging="360"/>
+      </w:pPr>
+      <w:rPr>
+        <w:rFonts w:ascii="OpenSymbol" w:hAnsi="OpenSymbol" w:cs="OpenSymbol" w:hint="default"/>
+      </w:rPr>
+    </w:lvl>
+  </w:abstractNum>
+  <w:abstractNum w:abstractNumId="7">
+    <w:lvl w:ilvl="0">
+      <w:start w:val="1"/>
       <w:numFmt w:val="none"/>
       <w:suff w:val="nothing"/>
       <w:lvlText w:val=""/>
@@ -5863,6 +8238,9 @@
   <w:num w:numId="6">
     <w:abstractNumId w:val="6"/>
   </w:num>
+  <w:num w:numId="7">
+    <w:abstractNumId w:val="7"/>
+  </w:num>
 </w:numbering>
 </file>
 
@@ -5889,7 +8267,7 @@
     <w:pPr>
       <w:widowControl/>
       <w:suppressAutoHyphens w:val="true"/>
-      <w:overflowPunct w:val="true"/>
+      <w:overflowPunct w:val="false"/>
       <w:bidi w:val="0"/>
       <w:spacing w:before="0" w:after="0"/>
       <w:jc w:val="left"/>

</xml_diff>

<commit_message>
docs(#636): update CLAUDE.md, DevGuide, changelog, fix release.yml artifact handling
CLAUDE.md:
- Update version to 5.4.0 with note on GTK2/GTK3 branch split
- Add one-liner release tagging instructions

docs/DevGuide.docx:
- Add GTK3 Branch (5.4.x) release runbook under Source Control/Releases
- Covers prerequisites, git tagging, automated package list, post-release
  steps (draft review, SF version field, Flatpak sha256, mailing list)
- Documents known limitations: unsigned macOS/Windows, MSI deferral, Flatpak

distribution/posix/changelog.txt:
- Add 5.4.0 RPM changelog entry (was stuck at 2015)

release.yml:
- Fix download-artifact@v4 → @v7 (must match upload-artifact@v7)
- Fix github-release artifact path: use find+mapfile to flatten
  artifact subdirectories into individual file args for gh release create

Co-Authored-By: Claude Sonnet 4.6 <noreply@anthropic.com>
</commit_message>
<xml_diff>
--- a/docs/DevGuide.docx
+++ b/docs/DevGuide.docx
@@ -3461,6 +3461,316 @@
     </w:p>
     <w:p>
       <w:pPr>
+        <w:pStyle w:val="Normal"/>
+      </w:pPr>
+      <w:r/>
+    </w:p>
+    <w:p>
+      <w:pPr>
+        <w:pStyle w:val="Normal"/>
+      </w:pPr>
+      <w:r>
+        <w:t>The CHANGELOG is then manually edited for clarity before being prepended to CHANGELOG.md.</w:t>
+      </w:r>
+    </w:p>
+    <w:p>
+      <w:pPr>
+        <w:pStyle w:val="Normal"/>
+      </w:pPr>
+      <w:r/>
+    </w:p>
+    <w:p>
+      <w:pPr>
+        <w:pStyle w:val="Heading3"/>
+      </w:pPr>
+      <w:r>
+        <w:t>GTK3 Branch (5.4.x) — GitHub Actions Automated Release</w:t>
+      </w:r>
+    </w:p>
+    <w:p>
+      <w:pPr>
+        <w:pStyle w:val="Normal"/>
+      </w:pPr>
+      <w:r>
+        <w:t>From version 5.4.0 onward, the GTK3V2MAIN branch uses GitHub Actions to automate package building and release creation. The manual platform-by-platform build and upload process described above applies only to the GTK2 default branch.</w:t>
+      </w:r>
+    </w:p>
+    <w:p>
+      <w:pPr>
+        <w:pStyle w:val="Normal"/>
+      </w:pPr>
+      <w:r/>
+    </w:p>
+    <w:p>
+      <w:pPr>
+        <w:pStyle w:val="Heading3"/>
+      </w:pPr>
+      <w:r>
+        <w:t>Prerequisites</w:t>
+      </w:r>
+    </w:p>
+    <w:p>
+      <w:pPr>
+        <w:pStyle w:val="Normal"/>
+      </w:pPr>
+      <w:r>
+        <w:t>Before tagging a release, ensure:</w:t>
+      </w:r>
+    </w:p>
+    <w:p>
+      <w:pPr>
+        <w:pStyle w:val="List"/>
+      </w:pPr>
+      <w:r>
+        <w:t>All bug-branch changes are merged into GTK3V2MAIN in Hg and synced to the git GTK3V2MAIN branch.</w:t>
+      </w:r>
+    </w:p>
+    <w:p>
+      <w:pPr>
+        <w:pStyle w:val="List"/>
+      </w:pPr>
+      <w:r>
+        <w:t>CI (ci-gtk3.yml) is fully green on the GTK3V2MAIN branch.</w:t>
+      </w:r>
+    </w:p>
+    <w:p>
+      <w:pPr>
+        <w:pStyle w:val="List"/>
+      </w:pPr>
+      <w:r>
+        <w:t>CHANGELOG.md is updated with entries for this release.</w:t>
+      </w:r>
+    </w:p>
+    <w:p>
+      <w:pPr>
+        <w:pStyle w:val="List"/>
+      </w:pPr>
+      <w:r>
+        <w:t>ProgramVersion.cmake has the correct version. XTRKCAD_VERSION_MODIFIER is empty for GA, or Beta1/Beta2/etc. for pre-releases.</w:t>
+      </w:r>
+    </w:p>
+    <w:p>
+      <w:pPr>
+        <w:pStyle w:val="Normal"/>
+      </w:pPr>
+      <w:r/>
+    </w:p>
+    <w:p>
+      <w:pPr>
+        <w:pStyle w:val="Heading3"/>
+      </w:pPr>
+      <w:r>
+        <w:t>Tagging and Release Creation</w:t>
+      </w:r>
+    </w:p>
+    <w:p>
+      <w:pPr>
+        <w:pStyle w:val="Normal"/>
+      </w:pPr>
+      <w:r>
+        <w:t>Push a version tag to GitHub to trigger the automated release workflow (release.yml):</w:t>
+      </w:r>
+    </w:p>
+    <w:p>
+      <w:pPr>
+        <w:pStyle w:val="PreformattedText"/>
+      </w:pPr>
+      <w:r>
+        <w:t xml:space="preserve">    git -C xtrkcad-git-gtk3 tag v5.4.0</w:t>
+      </w:r>
+    </w:p>
+    <w:p>
+      <w:pPr>
+        <w:pStyle w:val="PreformattedText"/>
+      </w:pPr>
+      <w:r>
+        <w:t xml:space="preserve">    git -C xtrkcad-git-gtk3 push origin v5.4.0</w:t>
+      </w:r>
+    </w:p>
+    <w:p>
+      <w:pPr>
+        <w:pStyle w:val="Normal"/>
+      </w:pPr>
+      <w:r/>
+    </w:p>
+    <w:p>
+      <w:pPr>
+        <w:pStyle w:val="Normal"/>
+      </w:pPr>
+      <w:r>
+        <w:t>GitHub Actions will automatically:</w:t>
+      </w:r>
+    </w:p>
+    <w:p>
+      <w:pPr>
+        <w:pStyle w:val="List"/>
+      </w:pPr>
+      <w:r>
+        <w:t>Build Release-mode packages on all supported platforms.</w:t>
+      </w:r>
+    </w:p>
+    <w:p>
+      <w:pPr>
+        <w:pStyle w:val="List"/>
+      </w:pPr>
+      <w:r>
+        <w:t>Create a draft GitHub Release at github.com/adbyrne/XTrkCAD/releases.</w:t>
+      </w:r>
+    </w:p>
+    <w:p>
+      <w:pPr>
+        <w:pStyle w:val="List"/>
+      </w:pPr>
+      <w:r>
+        <w:t>Attach all packages and source archives to the draft release with auto-generated notes.</w:t>
+      </w:r>
+    </w:p>
+    <w:p>
+      <w:pPr>
+        <w:pStyle w:val="Normal"/>
+      </w:pPr>
+      <w:r/>
+    </w:p>
+    <w:p>
+      <w:pPr>
+        <w:pStyle w:val="Normal"/>
+      </w:pPr>
+      <w:r>
+        <w:t>Packages produced automatically:</w:t>
+      </w:r>
+    </w:p>
+    <w:p>
+      <w:pPr>
+        <w:pStyle w:val="List"/>
+      </w:pPr>
+      <w:r>
+        <w:t>Linux x86-64: DEB, RPM, STGZ (self-extracting shell), source TGZ and ZIP</w:t>
+      </w:r>
+    </w:p>
+    <w:p>
+      <w:pPr>
+        <w:pStyle w:val="List"/>
+      </w:pPr>
+      <w:r>
+        <w:t>Linux ARM64: DEB</w:t>
+      </w:r>
+    </w:p>
+    <w:p>
+      <w:pPr>
+        <w:pStyle w:val="List"/>
+      </w:pPr>
+      <w:r>
+        <w:t>macOS ARM64: tar.gz (requires brew install gtk+3 libzip librsvg); DMG if gtk-mac-bundler is available</w:t>
+      </w:r>
+    </w:p>
+    <w:p>
+      <w:pPr>
+        <w:pStyle w:val="List"/>
+      </w:pPr>
+      <w:r>
+        <w:t>Windows x64: ZIP with bundled GTK3 DLLs, NSIS installer</w:t>
+      </w:r>
+    </w:p>
+    <w:p>
+      <w:pPr>
+        <w:pStyle w:val="Normal"/>
+      </w:pPr>
+      <w:r/>
+    </w:p>
+    <w:p>
+      <w:pPr>
+        <w:pStyle w:val="Heading3"/>
+      </w:pPr>
+      <w:r>
+        <w:t>Post-Release Steps</w:t>
+      </w:r>
+    </w:p>
+    <w:p>
+      <w:pPr>
+        <w:pStyle w:val="List"/>
+      </w:pPr>
+      <w:r>
+        <w:t>Review and publish the draft GitHub Release — add release notes, verify all packages are attached.</w:t>
+      </w:r>
+    </w:p>
+    <w:p>
+      <w:pPr>
+        <w:pStyle w:val="List"/>
+      </w:pPr>
+      <w:r>
+        <w:t>Update the XTrackCAD Version field at the SourceForge Bug Field Management page.</w:t>
+      </w:r>
+    </w:p>
+    <w:p>
+      <w:pPr>
+        <w:pStyle w:val="List"/>
+      </w:pPr>
+      <w:r>
+        <w:t>Update the Flatpak manifest sha256 in distribution/flatpak/xtrkcad.manifest.yaml with the sha256 of the release archive: curl -sL &lt;release-url&gt; | sha256sum</w:t>
+      </w:r>
+    </w:p>
+    <w:p>
+      <w:pPr>
+        <w:pStyle w:val="List"/>
+      </w:pPr>
+      <w:r>
+        <w:t>Announce the new release on the XTrkCAD mailing list.</w:t>
+      </w:r>
+    </w:p>
+    <w:p>
+      <w:pPr>
+        <w:pStyle w:val="Normal"/>
+      </w:pPr>
+      <w:r/>
+    </w:p>
+    <w:p>
+      <w:pPr>
+        <w:pStyle w:val="Heading3"/>
+      </w:pPr>
+      <w:r>
+        <w:t>Known Limitations</w:t>
+      </w:r>
+    </w:p>
+    <w:p>
+      <w:pPr>
+        <w:pStyle w:val="Normal"/>
+      </w:pPr>
+      <w:r>
+        <w:t>macOS packages are unsigned. Users must right-click &gt; Open to bypass Gatekeeper. Code signing requires an Apple Developer account ($99/year) — volunteer opportunity.</w:t>
+      </w:r>
+    </w:p>
+    <w:p>
+      <w:pPr>
+        <w:pStyle w:val="Normal"/>
+      </w:pPr>
+      <w:r>
+        <w:t>Windows packages are unsigned. Users dismiss the SmartScreen warning via More info &gt; Run anyway.</w:t>
+      </w:r>
+    </w:p>
+    <w:p>
+      <w:pPr>
+        <w:pStyle w:val="Normal"/>
+      </w:pPr>
+      <w:r>
+        <w:t>Windows MSI installer: deferred until CMake gains native WiX v4/v5 support. NSIS is used in the interim.</w:t>
+      </w:r>
+    </w:p>
+    <w:p>
+      <w:pPr>
+        <w:pStyle w:val="Normal"/>
+      </w:pPr>
+      <w:r>
+        <w:t>Flatpak: deferred pending Flathub app ID registration and flatpak-builder CI infrastructure.</w:t>
+      </w:r>
+    </w:p>
+    <w:p>
+      <w:pPr>
+        <w:pStyle w:val="Normal"/>
+      </w:pPr>
+      <w:r/>
+    </w:p>
+    <w:p>
+      <w:pPr>
         <w:pStyle w:val="Heading1"/>
         <w:numPr>
           <w:ilvl w:val="0"/>

</xml_diff>

<commit_message>
docs(#636): restructure GTK3 release section — manual process first
The previous version only documented the GitHub Actions automated path.
Restructured so the manual process (CMake + CPack, per-platform) is the
primary reference usable by any developer with only Mercurial/SourceForge
access. GitHub Actions is now documented as an optional shortcut for
developers with access to the GitHub mirror.

Sections:
- GTK3 Branch (5.4.x) — Release Process (overview)
- Manual Build and Package (all developers) — Linux, macOS, Windows
- GitHub Actions Automated Release (git mirror users)
- Known Limitations

Co-Authored-By: Claude Sonnet 4.6 <noreply@anthropic.com>
</commit_message>
<xml_diff>
--- a/docs/DevGuide.docx
+++ b/docs/DevGuide.docx
@@ -3481,18 +3481,24 @@
     </w:p>
     <w:p>
       <w:pPr>
+        <w:pStyle w:val="Normal"/>
+      </w:pPr>
+      <w:r/>
+    </w:p>
+    <w:p>
+      <w:pPr>
         <w:pStyle w:val="Heading3"/>
       </w:pPr>
       <w:r>
-        <w:t>GTK3 Branch (5.4.x) — GitHub Actions Automated Release</w:t>
-      </w:r>
-    </w:p>
-    <w:p>
-      <w:pPr>
-        <w:pStyle w:val="Normal"/>
-      </w:pPr>
-      <w:r>
-        <w:t>From version 5.4.0 onward, the GTK3V2MAIN branch uses GitHub Actions to automate package building and release creation. The manual platform-by-platform build and upload process described above applies only to the GTK2 default branch.</w:t>
+        <w:t>GTK3 Branch (5.4.x) — Release Process</w:t>
+      </w:r>
+    </w:p>
+    <w:p>
+      <w:pPr>
+        <w:pStyle w:val="Normal"/>
+      </w:pPr>
+      <w:r>
+        <w:t>The GTK3V2MAIN branch (version 5.4.0 onward) uses the same Mercurial branch and versioning conventions as the GTK2 default branch. Any developer can build and package a release using only CMake and CPack. For developers with access to the GitHub mirror, a GitHub Actions workflow (release.yml) automates the steps below.</w:t>
       </w:r>
     </w:p>
     <w:p>
@@ -3506,15 +3512,401 @@
         <w:pStyle w:val="Heading3"/>
       </w:pPr>
       <w:r>
-        <w:t>Prerequisites</w:t>
-      </w:r>
-    </w:p>
-    <w:p>
-      <w:pPr>
-        <w:pStyle w:val="Normal"/>
-      </w:pPr>
-      <w:r>
-        <w:t>Before tagging a release, ensure:</w:t>
+        <w:t>Manual Build and Package (all developers)</w:t>
+      </w:r>
+    </w:p>
+    <w:p>
+      <w:pPr>
+        <w:pStyle w:val="Normal"/>
+      </w:pPr>
+      <w:r>
+        <w:t>These steps apply to all platforms. Run them on each target platform and upload the resulting packages to the SourceForge release page.</w:t>
+      </w:r>
+    </w:p>
+    <w:p>
+      <w:pPr>
+        <w:pStyle w:val="Normal"/>
+      </w:pPr>
+      <w:r/>
+    </w:p>
+    <w:p>
+      <w:pPr>
+        <w:pStyle w:val="Heading3"/>
+      </w:pPr>
+      <w:r>
+        <w:t>Linux</w:t>
+      </w:r>
+    </w:p>
+    <w:p>
+      <w:pPr>
+        <w:pStyle w:val="PreformattedText"/>
+      </w:pPr>
+      <w:r>
+        <w:t>sudo apt-get install -y cmake ninja-build libgtk-3-dev libzip-dev libmxml-dev librsvg2-bin gettext dpkg-dev rpm</w:t>
+      </w:r>
+    </w:p>
+    <w:p>
+      <w:pPr>
+        <w:pStyle w:val="PreformattedText"/>
+      </w:pPr>
+      <w:r>
+        <w:t>cmake -B build -S . -G Ninja -DCMAKE_BUILD_TYPE=Release</w:t>
+      </w:r>
+    </w:p>
+    <w:p>
+      <w:pPr>
+        <w:pStyle w:val="PreformattedText"/>
+      </w:pPr>
+      <w:r>
+        <w:t>cmake --build build</w:t>
+      </w:r>
+    </w:p>
+    <w:p>
+      <w:pPr>
+        <w:pStyle w:val="PreformattedText"/>
+      </w:pPr>
+      <w:r>
+        <w:t>cd build</w:t>
+      </w:r>
+    </w:p>
+    <w:p>
+      <w:pPr>
+        <w:pStyle w:val="PreformattedText"/>
+      </w:pPr>
+      <w:r>
+        <w:t>cpack -G DEB                                  # Debian/Ubuntu package</w:t>
+      </w:r>
+    </w:p>
+    <w:p>
+      <w:pPr>
+        <w:pStyle w:val="PreformattedText"/>
+      </w:pPr>
+      <w:r>
+        <w:t>cpack -G RPM                                  # Fedora/RHEL package</w:t>
+      </w:r>
+    </w:p>
+    <w:p>
+      <w:pPr>
+        <w:pStyle w:val="PreformattedText"/>
+      </w:pPr>
+      <w:r>
+        <w:t>cpack -G STGZ                                 # self-extracting shell script</w:t>
+      </w:r>
+    </w:p>
+    <w:p>
+      <w:pPr>
+        <w:pStyle w:val="PreformattedText"/>
+      </w:pPr>
+      <w:r>
+        <w:t>cpack --config CPackSourceConfig.cmake -G TGZ # source archive</w:t>
+      </w:r>
+    </w:p>
+    <w:p>
+      <w:pPr>
+        <w:pStyle w:val="PreformattedText"/>
+      </w:pPr>
+      <w:r>
+        <w:t>cpack --config CPackSourceConfig.cmake -G ZIP # source archive (zip)</w:t>
+      </w:r>
+    </w:p>
+    <w:p>
+      <w:pPr>
+        <w:pStyle w:val="Normal"/>
+      </w:pPr>
+      <w:r/>
+    </w:p>
+    <w:p>
+      <w:pPr>
+        <w:pStyle w:val="Heading3"/>
+      </w:pPr>
+      <w:r>
+        <w:t>macOS</w:t>
+      </w:r>
+    </w:p>
+    <w:p>
+      <w:pPr>
+        <w:pStyle w:val="PreformattedText"/>
+      </w:pPr>
+      <w:r>
+        <w:t>brew install ninja gtk+3 libzip librsvg cmocka</w:t>
+      </w:r>
+    </w:p>
+    <w:p>
+      <w:pPr>
+        <w:pStyle w:val="PreformattedText"/>
+      </w:pPr>
+      <w:r>
+        <w:t>GTK_PREFIX=$(brew --prefix gtk+3)</w:t>
+      </w:r>
+    </w:p>
+    <w:p>
+      <w:pPr>
+        <w:pStyle w:val="PreformattedText"/>
+      </w:pPr>
+      <w:r>
+        <w:t>cmake -B build -G Ninja -DCMAKE_BUILD_TYPE=Release \</w:t>
+      </w:r>
+    </w:p>
+    <w:p>
+      <w:pPr>
+        <w:pStyle w:val="PreformattedText"/>
+      </w:pPr>
+      <w:r>
+        <w:t xml:space="preserve">  -DCMAKE_PREFIX_PATH="$GTK_PREFIX;$(brew --prefix)" \</w:t>
+      </w:r>
+    </w:p>
+    <w:p>
+      <w:pPr>
+        <w:pStyle w:val="PreformattedText"/>
+      </w:pPr>
+      <w:r>
+        <w:t xml:space="preserve">  -DXTRKCAD_USE_APPLEHELP=OFF -DXTRKCAD_USE_BROWSER=ON</w:t>
+      </w:r>
+    </w:p>
+    <w:p>
+      <w:pPr>
+        <w:pStyle w:val="PreformattedText"/>
+      </w:pPr>
+      <w:r>
+        <w:t>cmake --build build</w:t>
+      </w:r>
+    </w:p>
+    <w:p>
+      <w:pPr>
+        <w:pStyle w:val="PreformattedText"/>
+      </w:pPr>
+      <w:r>
+        <w:t>cmake --install build --prefix staging</w:t>
+      </w:r>
+    </w:p>
+    <w:p>
+      <w:pPr>
+        <w:pStyle w:val="PreformattedText"/>
+      </w:pPr>
+      <w:r>
+        <w:t>tar -czf xtrkcad-5.4.0-macos-arm64.tar.gz -C staging .</w:t>
+      </w:r>
+    </w:p>
+    <w:p>
+      <w:pPr>
+        <w:pStyle w:val="PreformattedText"/>
+      </w:pPr>
+      <w:r>
+        <w:t># Optional self-contained DMG (requires gtk-mac-bundler):</w:t>
+      </w:r>
+    </w:p>
+    <w:p>
+      <w:pPr>
+        <w:pStyle w:val="PreformattedText"/>
+      </w:pPr>
+      <w:r>
+        <w:t># cd distribution/osx/gtk-bundle &amp;&amp; bash xtrkcad-bundler.sh -i &lt;staging&gt; -v 5.4.0</w:t>
+      </w:r>
+    </w:p>
+    <w:p>
+      <w:pPr>
+        <w:pStyle w:val="Normal"/>
+      </w:pPr>
+      <w:r/>
+    </w:p>
+    <w:p>
+      <w:pPr>
+        <w:pStyle w:val="Normal"/>
+      </w:pPr>
+      <w:r>
+        <w:t>macOS packages are unsigned. Distribute with README-INSTALL.txt (already in the install tree) which explains the Gatekeeper bypass procedure.</w:t>
+      </w:r>
+    </w:p>
+    <w:p>
+      <w:pPr>
+        <w:pStyle w:val="Normal"/>
+      </w:pPr>
+      <w:r/>
+    </w:p>
+    <w:p>
+      <w:pPr>
+        <w:pStyle w:val="Heading3"/>
+      </w:pPr>
+      <w:r>
+        <w:t>Windows (MSYS2 / MinGW64)</w:t>
+      </w:r>
+    </w:p>
+    <w:p>
+      <w:pPr>
+        <w:pStyle w:val="PreformattedText"/>
+      </w:pPr>
+      <w:r>
+        <w:t># In the MSYS2 MINGW64 shell:</w:t>
+      </w:r>
+    </w:p>
+    <w:p>
+      <w:pPr>
+        <w:pStyle w:val="PreformattedText"/>
+      </w:pPr>
+      <w:r>
+        <w:t>pacman -S mingw-w64-x86_64-gtk3 mingw-w64-x86_64-cmake mingw-w64-x86_64-ninja \</w:t>
+      </w:r>
+    </w:p>
+    <w:p>
+      <w:pPr>
+        <w:pStyle w:val="PreformattedText"/>
+      </w:pPr>
+      <w:r>
+        <w:t xml:space="preserve">         mingw-w64-x86_64-libzip mingw-w64-x86_64-mxml mingw-w64-x86_64-librsvg \</w:t>
+      </w:r>
+    </w:p>
+    <w:p>
+      <w:pPr>
+        <w:pStyle w:val="PreformattedText"/>
+      </w:pPr>
+      <w:r>
+        <w:t xml:space="preserve">         mingw-w64-x86_64-gettext mingw-w64-x86_64-ntldd-git</w:t>
+      </w:r>
+    </w:p>
+    <w:p>
+      <w:pPr>
+        <w:pStyle w:val="PreformattedText"/>
+      </w:pPr>
+      <w:r>
+        <w:t>cmake -B build -G Ninja -DCMAKE_BUILD_TYPE=Release -DXTRKCAD_USE_GETTEXT=OFF</w:t>
+      </w:r>
+    </w:p>
+    <w:p>
+      <w:pPr>
+        <w:pStyle w:val="PreformattedText"/>
+      </w:pPr>
+      <w:r>
+        <w:t>cmake --build build</w:t>
+      </w:r>
+    </w:p>
+    <w:p>
+      <w:pPr>
+        <w:pStyle w:val="PreformattedText"/>
+      </w:pPr>
+      <w:r>
+        <w:t>cmake --install build --prefix "$(pwd)/staging"</w:t>
+      </w:r>
+    </w:p>
+    <w:p>
+      <w:pPr>
+        <w:pStyle w:val="PreformattedText"/>
+      </w:pPr>
+      <w:r>
+        <w:t># Collect GTK3 runtime DLLs:</w:t>
+      </w:r>
+    </w:p>
+    <w:p>
+      <w:pPr>
+        <w:pStyle w:val="PreformattedText"/>
+      </w:pPr>
+      <w:r>
+        <w:t>ntldd -R staging/bin/xtrkcad.exe | grep -i mingw64 | awk '{print $3}' \</w:t>
+      </w:r>
+    </w:p>
+    <w:p>
+      <w:pPr>
+        <w:pStyle w:val="PreformattedText"/>
+      </w:pPr>
+      <w:r>
+        <w:t xml:space="preserve">  | xargs -I{} cp -n {} staging/bin/</w:t>
+      </w:r>
+    </w:p>
+    <w:p>
+      <w:pPr>
+        <w:pStyle w:val="PreformattedText"/>
+      </w:pPr>
+      <w:r>
+        <w:t># Create ZIP archive:</w:t>
+      </w:r>
+    </w:p>
+    <w:p>
+      <w:pPr>
+        <w:pStyle w:val="PreformattedText"/>
+      </w:pPr>
+      <w:r>
+        <w:t>cmake -E tar cf xtrkcad-5.4.0-windows-x64.zip --format=zip staging/</w:t>
+      </w:r>
+    </w:p>
+    <w:p>
+      <w:pPr>
+        <w:pStyle w:val="PreformattedText"/>
+      </w:pPr>
+      <w:r>
+        <w:t># Create NSIS installer (requires NSIS installed):</w:t>
+      </w:r>
+    </w:p>
+    <w:p>
+      <w:pPr>
+        <w:pStyle w:val="PreformattedText"/>
+      </w:pPr>
+      <w:r>
+        <w:t>cd build &amp;&amp; cpack -G NSIS</w:t>
+      </w:r>
+    </w:p>
+    <w:p>
+      <w:pPr>
+        <w:pStyle w:val="Normal"/>
+      </w:pPr>
+      <w:r/>
+    </w:p>
+    <w:p>
+      <w:pPr>
+        <w:pStyle w:val="Normal"/>
+      </w:pPr>
+      <w:r>
+        <w:t>Windows packages are unsigned. Distribute with README-INSTALL.txt (already in the install tree) which explains the SmartScreen bypass procedure.</w:t>
+      </w:r>
+    </w:p>
+    <w:p>
+      <w:pPr>
+        <w:pStyle w:val="Normal"/>
+      </w:pPr>
+      <w:r/>
+    </w:p>
+    <w:p>
+      <w:pPr>
+        <w:pStyle w:val="Heading3"/>
+      </w:pPr>
+      <w:r>
+        <w:t>GitHub Actions Automated Release (git mirror users)</w:t>
+      </w:r>
+    </w:p>
+    <w:p>
+      <w:pPr>
+        <w:pStyle w:val="Normal"/>
+      </w:pPr>
+      <w:r>
+        <w:t>For developers with access to the GitHub mirror at github.com/adbyrne/XTrkCAD, a workflow automates all of the above steps. Pushing a version tag triggers package builds on all platforms and creates a draft GitHub Release:</w:t>
+      </w:r>
+    </w:p>
+    <w:p>
+      <w:pPr>
+        <w:pStyle w:val="PreformattedText"/>
+      </w:pPr>
+      <w:r>
+        <w:t>git -C xtrkcad-git-gtk3 tag v5.4.0</w:t>
+      </w:r>
+    </w:p>
+    <w:p>
+      <w:pPr>
+        <w:pStyle w:val="PreformattedText"/>
+      </w:pPr>
+      <w:r>
+        <w:t>git -C xtrkcad-git-gtk3 push origin v5.4.0</w:t>
+      </w:r>
+    </w:p>
+    <w:p>
+      <w:pPr>
+        <w:pStyle w:val="Normal"/>
+      </w:pPr>
+      <w:r/>
+    </w:p>
+    <w:p>
+      <w:pPr>
+        <w:pStyle w:val="Normal"/>
+      </w:pPr>
+      <w:r>
+        <w:t>The draft release appears at github.com/adbyrne/XTrkCAD/releases and must be reviewed and published manually. The same post-release steps apply regardless of how packages were built:</w:t>
       </w:r>
     </w:p>
     <w:p>
@@ -3522,7 +3914,7 @@
         <w:pStyle w:val="List"/>
       </w:pPr>
       <w:r>
-        <w:t>All bug-branch changes are merged into GTK3V2MAIN in Hg and synced to the git GTK3V2MAIN branch.</w:t>
+        <w:t>Update the XTrackCAD Version field at the SourceForge Bug Field Management page.</w:t>
       </w:r>
     </w:p>
     <w:p>
@@ -3530,7 +3922,7 @@
         <w:pStyle w:val="List"/>
       </w:pPr>
       <w:r>
-        <w:t>CI (ci-gtk3.yml) is fully green on the GTK3V2MAIN branch.</w:t>
+        <w:t>Update the Flatpak manifest sha256 in distribution/flatpak/xtrkcad.manifest.yaml (run: curl -sL &lt;release-url&gt; | sha256sum).</w:t>
       </w:r>
     </w:p>
     <w:p>
@@ -3538,15 +3930,7 @@
         <w:pStyle w:val="List"/>
       </w:pPr>
       <w:r>
-        <w:t>CHANGELOG.md is updated with entries for this release.</w:t>
-      </w:r>
-    </w:p>
-    <w:p>
-      <w:pPr>
-        <w:pStyle w:val="List"/>
-      </w:pPr>
-      <w:r>
-        <w:t>ProgramVersion.cmake has the correct version. XTRKCAD_VERSION_MODIFIER is empty for GA, or Beta1/Beta2/etc. for pre-releases.</w:t>
+        <w:t>Announce the new release on the XTrkCAD mailing list.</w:t>
       </w:r>
     </w:p>
     <w:p>
@@ -3560,174 +3944,6 @@
         <w:pStyle w:val="Heading3"/>
       </w:pPr>
       <w:r>
-        <w:t>Tagging and Release Creation</w:t>
-      </w:r>
-    </w:p>
-    <w:p>
-      <w:pPr>
-        <w:pStyle w:val="Normal"/>
-      </w:pPr>
-      <w:r>
-        <w:t>Push a version tag to GitHub to trigger the automated release workflow (release.yml):</w:t>
-      </w:r>
-    </w:p>
-    <w:p>
-      <w:pPr>
-        <w:pStyle w:val="PreformattedText"/>
-      </w:pPr>
-      <w:r>
-        <w:t xml:space="preserve">    git -C xtrkcad-git-gtk3 tag v5.4.0</w:t>
-      </w:r>
-    </w:p>
-    <w:p>
-      <w:pPr>
-        <w:pStyle w:val="PreformattedText"/>
-      </w:pPr>
-      <w:r>
-        <w:t xml:space="preserve">    git -C xtrkcad-git-gtk3 push origin v5.4.0</w:t>
-      </w:r>
-    </w:p>
-    <w:p>
-      <w:pPr>
-        <w:pStyle w:val="Normal"/>
-      </w:pPr>
-      <w:r/>
-    </w:p>
-    <w:p>
-      <w:pPr>
-        <w:pStyle w:val="Normal"/>
-      </w:pPr>
-      <w:r>
-        <w:t>GitHub Actions will automatically:</w:t>
-      </w:r>
-    </w:p>
-    <w:p>
-      <w:pPr>
-        <w:pStyle w:val="List"/>
-      </w:pPr>
-      <w:r>
-        <w:t>Build Release-mode packages on all supported platforms.</w:t>
-      </w:r>
-    </w:p>
-    <w:p>
-      <w:pPr>
-        <w:pStyle w:val="List"/>
-      </w:pPr>
-      <w:r>
-        <w:t>Create a draft GitHub Release at github.com/adbyrne/XTrkCAD/releases.</w:t>
-      </w:r>
-    </w:p>
-    <w:p>
-      <w:pPr>
-        <w:pStyle w:val="List"/>
-      </w:pPr>
-      <w:r>
-        <w:t>Attach all packages and source archives to the draft release with auto-generated notes.</w:t>
-      </w:r>
-    </w:p>
-    <w:p>
-      <w:pPr>
-        <w:pStyle w:val="Normal"/>
-      </w:pPr>
-      <w:r/>
-    </w:p>
-    <w:p>
-      <w:pPr>
-        <w:pStyle w:val="Normal"/>
-      </w:pPr>
-      <w:r>
-        <w:t>Packages produced automatically:</w:t>
-      </w:r>
-    </w:p>
-    <w:p>
-      <w:pPr>
-        <w:pStyle w:val="List"/>
-      </w:pPr>
-      <w:r>
-        <w:t>Linux x86-64: DEB, RPM, STGZ (self-extracting shell), source TGZ and ZIP</w:t>
-      </w:r>
-    </w:p>
-    <w:p>
-      <w:pPr>
-        <w:pStyle w:val="List"/>
-      </w:pPr>
-      <w:r>
-        <w:t>Linux ARM64: DEB</w:t>
-      </w:r>
-    </w:p>
-    <w:p>
-      <w:pPr>
-        <w:pStyle w:val="List"/>
-      </w:pPr>
-      <w:r>
-        <w:t>macOS ARM64: tar.gz (requires brew install gtk+3 libzip librsvg); DMG if gtk-mac-bundler is available</w:t>
-      </w:r>
-    </w:p>
-    <w:p>
-      <w:pPr>
-        <w:pStyle w:val="List"/>
-      </w:pPr>
-      <w:r>
-        <w:t>Windows x64: ZIP with bundled GTK3 DLLs, NSIS installer</w:t>
-      </w:r>
-    </w:p>
-    <w:p>
-      <w:pPr>
-        <w:pStyle w:val="Normal"/>
-      </w:pPr>
-      <w:r/>
-    </w:p>
-    <w:p>
-      <w:pPr>
-        <w:pStyle w:val="Heading3"/>
-      </w:pPr>
-      <w:r>
-        <w:t>Post-Release Steps</w:t>
-      </w:r>
-    </w:p>
-    <w:p>
-      <w:pPr>
-        <w:pStyle w:val="List"/>
-      </w:pPr>
-      <w:r>
-        <w:t>Review and publish the draft GitHub Release — add release notes, verify all packages are attached.</w:t>
-      </w:r>
-    </w:p>
-    <w:p>
-      <w:pPr>
-        <w:pStyle w:val="List"/>
-      </w:pPr>
-      <w:r>
-        <w:t>Update the XTrackCAD Version field at the SourceForge Bug Field Management page.</w:t>
-      </w:r>
-    </w:p>
-    <w:p>
-      <w:pPr>
-        <w:pStyle w:val="List"/>
-      </w:pPr>
-      <w:r>
-        <w:t>Update the Flatpak manifest sha256 in distribution/flatpak/xtrkcad.manifest.yaml with the sha256 of the release archive: curl -sL &lt;release-url&gt; | sha256sum</w:t>
-      </w:r>
-    </w:p>
-    <w:p>
-      <w:pPr>
-        <w:pStyle w:val="List"/>
-      </w:pPr>
-      <w:r>
-        <w:t>Announce the new release on the XTrkCAD mailing list.</w:t>
-      </w:r>
-    </w:p>
-    <w:p>
-      <w:pPr>
-        <w:pStyle w:val="Normal"/>
-      </w:pPr>
-      <w:r/>
-    </w:p>
-    <w:p>
-      <w:pPr>
-        <w:pStyle w:val="Heading3"/>
-      </w:pPr>
-      <w:r>
         <w:t>Known Limitations</w:t>
       </w:r>
     </w:p>
@@ -3736,15 +3952,7 @@
         <w:pStyle w:val="Normal"/>
       </w:pPr>
       <w:r>
-        <w:t>macOS packages are unsigned. Users must right-click &gt; Open to bypass Gatekeeper. Code signing requires an Apple Developer account ($99/year) — volunteer opportunity.</w:t>
-      </w:r>
-    </w:p>
-    <w:p>
-      <w:pPr>
-        <w:pStyle w:val="Normal"/>
-      </w:pPr>
-      <w:r>
-        <w:t>Windows packages are unsigned. Users dismiss the SmartScreen warning via More info &gt; Run anyway.</w:t>
+        <w:t>macOS and Windows packages are unsigned — see README-INSTALL.txt in each package for the bypass procedure. Code signing requires an Apple Developer account (macOS) or a commercial certificate (Windows); both are volunteer opportunities.</w:t>
       </w:r>
     </w:p>
     <w:p>
@@ -3760,7 +3968,7 @@
         <w:pStyle w:val="Normal"/>
       </w:pPr>
       <w:r>
-        <w:t>Flatpak: deferred pending Flathub app ID registration and flatpak-builder CI infrastructure.</w:t>
+        <w:t>Flatpak: deferred pending Flathub app ID registration (org.xtrkcad.XTrkCAD) and flatpak-builder infrastructure.</w:t>
       </w:r>
     </w:p>
     <w:p>

</xml_diff>